<commit_message>
Divisão completa de eventos ES/RJ
</commit_message>
<xml_diff>
--- a/template/template_avista_rj.docx
+++ b/template/template_avista_rj.docx
@@ -158,11 +158,19 @@
         </w:rPr>
         <w:t xml:space="preserve">, com endereço na Rua </w:t>
       </w:r>
-      <w:r>
-        <w:rPr>
-          <w:rFonts w:ascii="Arial" w:hAnsi="Arial" w:cs="Arial"/>
-        </w:rPr>
-        <w:t xml:space="preserve">Braulina Baptista Lopes, </w:t>
+      <w:proofErr w:type="spellStart"/>
+      <w:r>
+        <w:rPr>
+          <w:rFonts w:ascii="Arial" w:hAnsi="Arial" w:cs="Arial"/>
+        </w:rPr>
+        <w:t>Braulina</w:t>
+      </w:r>
+      <w:proofErr w:type="spellEnd"/>
+      <w:r>
+        <w:rPr>
+          <w:rFonts w:ascii="Arial" w:hAnsi="Arial" w:cs="Arial"/>
+        </w:rPr>
+        <w:t xml:space="preserve"> Baptista Lopes, </w:t>
       </w:r>
       <w:r>
         <w:rPr>
@@ -2057,7 +2065,23 @@
           <w:rFonts w:ascii="Arial" w:hAnsi="Arial" w:cs="Arial"/>
           <w:b/>
         </w:rPr>
-        <w:t>05 de Agosto de 2026</w:t>
+        <w:t xml:space="preserve">05 de </w:t>
+      </w:r>
+      <w:proofErr w:type="gramStart"/>
+      <w:r>
+        <w:rPr>
+          <w:rFonts w:ascii="Arial" w:hAnsi="Arial" w:cs="Arial"/>
+          <w:b/>
+        </w:rPr>
+        <w:t>Agosto</w:t>
+      </w:r>
+      <w:proofErr w:type="gramEnd"/>
+      <w:r>
+        <w:rPr>
+          <w:rFonts w:ascii="Arial" w:hAnsi="Arial" w:cs="Arial"/>
+          <w:b/>
+        </w:rPr>
+        <w:t xml:space="preserve"> de 2026</w:t>
       </w:r>
       <w:r>
         <w:rPr>
@@ -2178,7 +2202,23 @@
           <w:rFonts w:ascii="Arial" w:hAnsi="Arial" w:cs="Arial"/>
           <w:b/>
         </w:rPr>
-        <w:t xml:space="preserve"> de Agosto de 2026. </w:t>
+        <w:t xml:space="preserve"> de </w:t>
+      </w:r>
+      <w:proofErr w:type="gramStart"/>
+      <w:r>
+        <w:rPr>
+          <w:rFonts w:ascii="Arial" w:hAnsi="Arial" w:cs="Arial"/>
+          <w:b/>
+        </w:rPr>
+        <w:t>Agosto</w:t>
+      </w:r>
+      <w:proofErr w:type="gramEnd"/>
+      <w:r>
+        <w:rPr>
+          <w:rFonts w:ascii="Arial" w:hAnsi="Arial" w:cs="Arial"/>
+          <w:b/>
+        </w:rPr>
+        <w:t xml:space="preserve"> de 2026. </w:t>
       </w:r>
       <w:r>
         <w:rPr>
@@ -3270,12 +3310,14 @@
         </w:rPr>
         <w:t xml:space="preserve"> </w:t>
       </w:r>
+      <w:proofErr w:type="spellStart"/>
       <w:r>
         <w:rPr>
           <w:rFonts w:ascii="Arial" w:hAnsi="Arial" w:cs="Arial"/>
         </w:rPr>
         <w:t>Code</w:t>
       </w:r>
+      <w:proofErr w:type="spellEnd"/>
       <w:r>
         <w:rPr>
           <w:rFonts w:ascii="Arial" w:hAnsi="Arial" w:cs="Arial"/>
@@ -4429,7 +4471,16 @@
           <w:bCs/>
           <w:color w:val="000000" w:themeColor="text1"/>
         </w:rPr>
-        <w:t xml:space="preserve"> O descumprimento do</w:t>
+        <w:t xml:space="preserve"> O descumprimento </w:t>
+      </w:r>
+      <w:proofErr w:type="gramStart"/>
+      <w:r>
+        <w:rPr>
+          <w:rFonts w:ascii="Arial" w:hAnsi="Arial" w:cs="Arial"/>
+          <w:bCs/>
+          <w:color w:val="000000" w:themeColor="text1"/>
+        </w:rPr>
+        <w:t>do</w:t>
       </w:r>
       <w:r>
         <w:rPr>
@@ -4455,6 +4506,7 @@
         </w:rPr>
         <w:t>item</w:t>
       </w:r>
+      <w:proofErr w:type="gramEnd"/>
       <w:r>
         <w:rPr>
           <w:rFonts w:ascii="Arial" w:hAnsi="Arial" w:cs="Arial"/>
@@ -5394,6 +5446,14 @@
           <w:b/>
           <w:bCs/>
         </w:rPr>
+        <w:t>2</w:t>
+      </w:r>
+      <w:r>
+        <w:rPr>
+          <w:rFonts w:ascii="Arial" w:hAnsi="Arial" w:cs="Arial"/>
+          <w:b/>
+          <w:bCs/>
+        </w:rPr>
         <w:t>}}</w:t>
       </w:r>
       <w:r>
@@ -5484,7 +5544,23 @@
           <w:b/>
           <w:bCs/>
         </w:rPr>
+        <w:t>2</w:t>
+      </w:r>
+      <w:r>
+        <w:rPr>
+          <w:rFonts w:ascii="Arial" w:hAnsi="Arial" w:cs="Arial"/>
+          <w:b/>
+          <w:bCs/>
+        </w:rPr>
         <w:t>}}</w:t>
+      </w:r>
+      <w:r>
+        <w:rPr>
+          <w:rFonts w:ascii="Arial" w:hAnsi="Arial" w:cs="Arial"/>
+          <w:b/>
+          <w:bCs/>
+        </w:rPr>
+        <w:t xml:space="preserve"> </w:t>
       </w:r>
       <w:r>
         <w:rPr>
@@ -6109,6 +6185,7 @@
         <w:rPr>
           <w:rFonts w:ascii="Arial" w:hAnsi="Arial" w:cs="Arial"/>
         </w:rPr>
+        <w:lastRenderedPageBreak/>
         <w:t xml:space="preserve">1. O EXPOSITOR declara estar ciente de que, caso o evento seja realizado nas dependências do </w:t>
       </w:r>
       <w:r>
@@ -7689,14 +7766,9 @@
           <w:szCs w:val="24"/>
           <w:lang w:val="pt-BR"/>
         </w:rPr>
-        <w:t>em decorrência do evento e da empresa parceira, qualquer ação judicial intentada, mesmo que pendente de julgamento, todas as obrigações, responsabilidades, contingências, perdas, danos diretos e indiretos, lucros cessantes, prejuízos, responsabilidade pecuniária ou conversível em pecúnia, custos e despesas com ações, processos, arbitragens ou procedimentos (incluindo valores pagos por avaliações, laudos, sentenças ou acordos, juros, multas, correção monetária, despesas de desembolso e honorários de advogados, contadores, peritos e outros especialistas, procedimentos,  honorários de sucumbência, custas judiciais, quaisquer outros custos e despesas direta ou indiretamente relacionados a uma Perda, bem como toda e qualquer multa, juros, indenização e/ou penalidade), depósitos judiciais e outros custos e despesas com garantias e imposição de Ônus (incluindo-se penhora de bens, ativos, direitos ou créditos, e/ou restrição parcial ou total, temporária ou definitiva, ao livre uso ou disposição de quaisquer montantes depositados em contas bancárias), ainda que seus efeitos se materializem apenas no futuro e independentemente do conhecimento das Partes.</w:t>
-      </w:r>
-    </w:p>
-    <w:p>
-      <w:pPr>
-        <w:pStyle w:val="Ttulo1"/>
-        <w:ind w:left="0"/>
-        <w:jc w:val="both"/>
+        <w:t xml:space="preserve">em decorrência do evento e da empresa parceira, qualquer ação judicial intentada, mesmo que pendente de julgamento, todas as obrigações, responsabilidades, contingências, perdas, danos diretos e indiretos, lucros cessantes, prejuízos, </w:t>
+      </w:r>
+      <w:r>
         <w:rPr>
           <w:b w:val="0"/>
           <w:bCs w:val="0"/>
@@ -7705,6 +7777,23 @@
           <w:szCs w:val="24"/>
           <w:lang w:val="pt-BR"/>
         </w:rPr>
+        <w:lastRenderedPageBreak/>
+        <w:t>responsabilidade pecuniária ou conversível em pecúnia, custos e despesas com ações, processos, arbitragens ou procedimentos (incluindo valores pagos por avaliações, laudos, sentenças ou acordos, juros, multas, correção monetária, despesas de desembolso e honorários de advogados, contadores, peritos e outros especialistas, procedimentos,  honorários de sucumbência, custas judiciais, quaisquer outros custos e despesas direta ou indiretamente relacionados a uma Perda, bem como toda e qualquer multa, juros, indenização e/ou penalidade), depósitos judiciais e outros custos e despesas com garantias e imposição de Ônus (incluindo-se penhora de bens, ativos, direitos ou créditos, e/ou restrição parcial ou total, temporária ou definitiva, ao livre uso ou disposição de quaisquer montantes depositados em contas bancárias), ainda que seus efeitos se materializem apenas no futuro e independentemente do conhecimento das Partes.</w:t>
+      </w:r>
+    </w:p>
+    <w:p>
+      <w:pPr>
+        <w:pStyle w:val="Ttulo1"/>
+        <w:ind w:left="0"/>
+        <w:jc w:val="both"/>
+        <w:rPr>
+          <w:b w:val="0"/>
+          <w:bCs w:val="0"/>
+          <w:color w:val="000000" w:themeColor="text1"/>
+          <w:sz w:val="24"/>
+          <w:szCs w:val="24"/>
+          <w:lang w:val="pt-BR"/>
+        </w:rPr>
       </w:pPr>
     </w:p>
     <w:p>
@@ -8031,6 +8120,7 @@
           <w:rFonts w:ascii="Arial" w:hAnsi="Arial" w:cs="Arial"/>
           <w:highlight w:val="green"/>
         </w:rPr>
+        <w:lastRenderedPageBreak/>
         <w:t>9.3. O não pagamento das penalidades no prazo de 5 (cinco) dias úteis contados da notificação poderá ensejar a adoção das medidas de cobrança cabíveis, inclusive judiciais, com a incidência de encargos legais, custas e honorários advocatícios, sem prejuízo de eventual inscrição em órgãos de proteção ao crédito, se aplicável.</w:t>
       </w:r>
     </w:p>
@@ -8253,7 +8343,35 @@
         <w:rPr>
           <w:rFonts w:ascii="Arial" w:hAnsi="Arial" w:cs="Arial"/>
         </w:rPr>
-        <w:t>", todas e quaisquer informações e/ou dados de natureza confidencial (incluindo, sem limitação, os termos e condições deste instrumento e todos os segredos e/ou informações operacionais, patenteada ou não, de natureza técnica, operacional, econômica, de mercado, comercial, jurídica, contábil, societária, tributária, planos de negócios, invenções, processos e fórmulas, know how, designs, algoritmos, projetos, protocolos de procedimento, esboços, fotografias, plantas, desenhos, conceitos de produtos, especificações, amostras, relatórios, ideias, nomes de clientes, vendedores e/ou distribuidoras, informações de preços, dentre outras, as informações orais e escritas, reveladas, colocadas à disposição, cujo acesso tenha sido permitido, transmitidas e/ou divulgadas a</w:t>
+        <w:t xml:space="preserve">", todas e quaisquer informações e/ou dados de natureza confidencial (incluindo, sem limitação, os termos e condições deste instrumento e todos os segredos e/ou informações operacionais, patenteada ou não, de natureza técnica, operacional, econômica, de mercado, comercial, jurídica, contábil, societária, tributária, planos de negócios, invenções, processos e fórmulas, </w:t>
+      </w:r>
+      <w:proofErr w:type="spellStart"/>
+      <w:r>
+        <w:rPr>
+          <w:rFonts w:ascii="Arial" w:hAnsi="Arial" w:cs="Arial"/>
+        </w:rPr>
+        <w:t>know</w:t>
+      </w:r>
+      <w:proofErr w:type="spellEnd"/>
+      <w:r>
+        <w:rPr>
+          <w:rFonts w:ascii="Arial" w:hAnsi="Arial" w:cs="Arial"/>
+        </w:rPr>
+        <w:t xml:space="preserve"> </w:t>
+      </w:r>
+      <w:proofErr w:type="spellStart"/>
+      <w:r>
+        <w:rPr>
+          <w:rFonts w:ascii="Arial" w:hAnsi="Arial" w:cs="Arial"/>
+        </w:rPr>
+        <w:t>how</w:t>
+      </w:r>
+      <w:proofErr w:type="spellEnd"/>
+      <w:r>
+        <w:rPr>
+          <w:rFonts w:ascii="Arial" w:hAnsi="Arial" w:cs="Arial"/>
+        </w:rPr>
+        <w:t>, designs, algoritmos, projetos, protocolos de procedimento, esboços, fotografias, plantas, desenhos, conceitos de produtos, especificações, amostras, relatórios, ideias, nomes de clientes, vendedores e/ou distribuidoras, informações de preços, dentre outras, as informações orais e escritas, reveladas, colocadas à disposição, cujo acesso tenha sido permitido, transmitidas e/ou divulgadas a</w:t>
       </w:r>
       <w:r>
         <w:rPr>
@@ -8327,6 +8445,7 @@
         </w:rPr>
         <w:t>úblico, ou (ii) se tornaram conhecidas do público, em caráter geral, ap</w:t>
       </w:r>
+      <w:proofErr w:type="spellStart"/>
       <w:r>
         <w:rPr>
           <w:rFonts w:ascii="Arial" w:hAnsi="Arial" w:cs="Arial"/>
@@ -8334,6 +8453,7 @@
         </w:rPr>
         <w:t>ó</w:t>
       </w:r>
+      <w:proofErr w:type="spellEnd"/>
       <w:r>
         <w:rPr>
           <w:rFonts w:ascii="Arial" w:hAnsi="Arial" w:cs="Arial"/>
@@ -8348,6 +8468,7 @@
         </w:rPr>
         <w:t>blico ap</w:t>
       </w:r>
+      <w:proofErr w:type="spellStart"/>
       <w:r>
         <w:rPr>
           <w:rFonts w:ascii="Arial" w:hAnsi="Arial" w:cs="Arial"/>
@@ -8355,6 +8476,7 @@
         </w:rPr>
         <w:t>ó</w:t>
       </w:r>
+      <w:proofErr w:type="spellEnd"/>
       <w:r>
         <w:rPr>
           <w:rFonts w:ascii="Arial" w:hAnsi="Arial" w:cs="Arial"/>
@@ -8517,6 +8639,7 @@
         <w:rPr>
           <w:rFonts w:ascii="Arial" w:hAnsi="Arial" w:cs="Arial"/>
         </w:rPr>
+        <w:lastRenderedPageBreak/>
         <w:t>10</w:t>
       </w:r>
       <w:r>
@@ -11109,34 +11232,6 @@
 </file>
 
 <file path=customXml/item1.xml><?xml version="1.0" encoding="utf-8"?>
-<b:Sources xmlns:b="http://schemas.openxmlformats.org/officeDocument/2006/bibliography" xmlns="http://schemas.openxmlformats.org/officeDocument/2006/bibliography" SelectedStyle="\APA.XSL" StyleName="APA"/>
-</file>
-
-<file path=customXml/item2.xml><?xml version="1.0" encoding="utf-8"?>
-<p:properties xmlns:p="http://schemas.microsoft.com/office/2006/metadata/properties" xmlns:xsi="http://www.w3.org/2001/XMLSchema-instance" xmlns:pc="http://schemas.microsoft.com/office/infopath/2007/PartnerControls">
-  <documentManagement>
-    <lcf76f155ced4ddcb4097134ff3c332f xmlns="33654ad5-d282-4981-a8c8-a8822fbc35b9">
-      <Terms xmlns="http://schemas.microsoft.com/office/infopath/2007/PartnerControls"/>
-    </lcf76f155ced4ddcb4097134ff3c332f>
-    <TaxCatchAll xmlns="b9048903-d8ec-4afd-ab52-583bd4eb6592" xsi:nil="true"/>
-    <ATA xmlns="33654ad5-d282-4981-a8c8-a8822fbc35b9" xsi:nil="true"/>
-    <_Flow_SignoffStatus xmlns="33654ad5-d282-4981-a8c8-a8822fbc35b9" xsi:nil="true"/>
-    <DataeHora xmlns="33654ad5-d282-4981-a8c8-a8822fbc35b9" xsi:nil="true"/>
-    <Data xmlns="33654ad5-d282-4981-a8c8-a8822fbc35b9" xsi:nil="true"/>
-  </documentManagement>
-</p:properties>
-</file>
-
-<file path=customXml/item3.xml><?xml version="1.0" encoding="utf-8"?>
-<?mso-contentType ?>
-<FormTemplates xmlns="http://schemas.microsoft.com/sharepoint/v3/contenttype/forms">
-  <Display>DocumentLibraryForm</Display>
-  <Edit>DocumentLibraryForm</Edit>
-  <New>DocumentLibraryForm</New>
-</FormTemplates>
-</file>
-
-<file path=customXml/item4.xml><?xml version="1.0" encoding="utf-8"?>
 <ct:contentTypeSchema xmlns:ct="http://schemas.microsoft.com/office/2006/metadata/contentType" xmlns:ma="http://schemas.microsoft.com/office/2006/metadata/properties/metaAttributes" ct:_="" ma:_="" ma:contentTypeName="Documento" ma:contentTypeID="0x010100D2300DB358EE5B46946C6B3EC032F97B" ma:contentTypeVersion="22" ma:contentTypeDescription="Crie um novo documento." ma:contentTypeScope="" ma:versionID="aa9ddffd00aed254b6aeb2f31970f58b">
   <xsd:schema xmlns:xsd="http://www.w3.org/2001/XMLSchema" xmlns:xs="http://www.w3.org/2001/XMLSchema" xmlns:p="http://schemas.microsoft.com/office/2006/metadata/properties" xmlns:ns2="33654ad5-d282-4981-a8c8-a8822fbc35b9" xmlns:ns3="b9048903-d8ec-4afd-ab52-583bd4eb6592" targetNamespace="http://schemas.microsoft.com/office/2006/metadata/properties" ma:root="true" ma:fieldsID="56313613a3112835b877611161f1947a" ns2:_="" ns3:_="">
     <xsd:import namespace="33654ad5-d282-4981-a8c8-a8822fbc35b9"/>
@@ -11415,34 +11510,35 @@
 </ct:contentTypeSchema>
 </file>
 
-<file path=customXml/itemProps1.xml><?xml version="1.0" encoding="utf-8"?>
-<ds:datastoreItem xmlns:ds="http://schemas.openxmlformats.org/officeDocument/2006/customXml" ds:itemID="{2D9CA2EF-2A0F-4377-AA02-0725358BDBD9}">
-  <ds:schemaRefs>
-    <ds:schemaRef ds:uri="http://schemas.openxmlformats.org/officeDocument/2006/bibliography"/>
-  </ds:schemaRefs>
-</ds:datastoreItem>
+<file path=customXml/item2.xml><?xml version="1.0" encoding="utf-8"?>
+<?mso-contentType ?>
+<FormTemplates xmlns="http://schemas.microsoft.com/sharepoint/v3/contenttype/forms">
+  <Display>DocumentLibraryForm</Display>
+  <Edit>DocumentLibraryForm</Edit>
+  <New>DocumentLibraryForm</New>
+</FormTemplates>
 </file>
 
-<file path=customXml/itemProps2.xml><?xml version="1.0" encoding="utf-8"?>
-<ds:datastoreItem xmlns:ds="http://schemas.openxmlformats.org/officeDocument/2006/customXml" ds:itemID="{9D374E39-0C21-4940-9679-7C1E21D9F5E5}">
-  <ds:schemaRefs>
-    <ds:schemaRef ds:uri="http://schemas.microsoft.com/office/2006/metadata/properties"/>
-    <ds:schemaRef ds:uri="http://schemas.microsoft.com/office/infopath/2007/PartnerControls"/>
-    <ds:schemaRef ds:uri="33654ad5-d282-4981-a8c8-a8822fbc35b9"/>
-    <ds:schemaRef ds:uri="b9048903-d8ec-4afd-ab52-583bd4eb6592"/>
-  </ds:schemaRefs>
-</ds:datastoreItem>
+<file path=customXml/item3.xml><?xml version="1.0" encoding="utf-8"?>
+<p:properties xmlns:p="http://schemas.microsoft.com/office/2006/metadata/properties" xmlns:xsi="http://www.w3.org/2001/XMLSchema-instance" xmlns:pc="http://schemas.microsoft.com/office/infopath/2007/PartnerControls">
+  <documentManagement>
+    <lcf76f155ced4ddcb4097134ff3c332f xmlns="33654ad5-d282-4981-a8c8-a8822fbc35b9">
+      <Terms xmlns="http://schemas.microsoft.com/office/infopath/2007/PartnerControls"/>
+    </lcf76f155ced4ddcb4097134ff3c332f>
+    <TaxCatchAll xmlns="b9048903-d8ec-4afd-ab52-583bd4eb6592" xsi:nil="true"/>
+    <ATA xmlns="33654ad5-d282-4981-a8c8-a8822fbc35b9" xsi:nil="true"/>
+    <_Flow_SignoffStatus xmlns="33654ad5-d282-4981-a8c8-a8822fbc35b9" xsi:nil="true"/>
+    <DataeHora xmlns="33654ad5-d282-4981-a8c8-a8822fbc35b9" xsi:nil="true"/>
+    <Data xmlns="33654ad5-d282-4981-a8c8-a8822fbc35b9" xsi:nil="true"/>
+  </documentManagement>
+</p:properties>
 </file>
 
-<file path=customXml/itemProps3.xml><?xml version="1.0" encoding="utf-8"?>
-<ds:datastoreItem xmlns:ds="http://schemas.openxmlformats.org/officeDocument/2006/customXml" ds:itemID="{A8FDF9CD-DFE0-42B0-AA86-9CEEF4645DEB}">
-  <ds:schemaRefs>
-    <ds:schemaRef ds:uri="http://schemas.microsoft.com/sharepoint/v3/contenttype/forms"/>
-  </ds:schemaRefs>
-</ds:datastoreItem>
+<file path=customXml/item4.xml><?xml version="1.0" encoding="utf-8"?>
+<b:Sources xmlns:b="http://schemas.openxmlformats.org/officeDocument/2006/bibliography" xmlns="http://schemas.openxmlformats.org/officeDocument/2006/bibliography" SelectedStyle="\APA.XSL" StyleName="APA"/>
 </file>
 
-<file path=customXml/itemProps4.xml><?xml version="1.0" encoding="utf-8"?>
+<file path=customXml/itemProps1.xml><?xml version="1.0" encoding="utf-8"?>
 <ds:datastoreItem xmlns:ds="http://schemas.openxmlformats.org/officeDocument/2006/customXml" ds:itemID="{E6FF012C-7C4F-4460-A219-EB3BCDF974AC}">
   <ds:schemaRefs>
     <ds:schemaRef ds:uri="http://schemas.microsoft.com/office/2006/metadata/contentType"/>
@@ -11459,4 +11555,31 @@
     <ds:schemaRef ds:uri="http://schemas.microsoft.com/internal/obd"/>
   </ds:schemaRefs>
 </ds:datastoreItem>
+</file>
+
+<file path=customXml/itemProps2.xml><?xml version="1.0" encoding="utf-8"?>
+<ds:datastoreItem xmlns:ds="http://schemas.openxmlformats.org/officeDocument/2006/customXml" ds:itemID="{A8FDF9CD-DFE0-42B0-AA86-9CEEF4645DEB}">
+  <ds:schemaRefs>
+    <ds:schemaRef ds:uri="http://schemas.microsoft.com/sharepoint/v3/contenttype/forms"/>
+  </ds:schemaRefs>
+</ds:datastoreItem>
+</file>
+
+<file path=customXml/itemProps3.xml><?xml version="1.0" encoding="utf-8"?>
+<ds:datastoreItem xmlns:ds="http://schemas.openxmlformats.org/officeDocument/2006/customXml" ds:itemID="{9D374E39-0C21-4940-9679-7C1E21D9F5E5}">
+  <ds:schemaRefs>
+    <ds:schemaRef ds:uri="http://schemas.microsoft.com/office/2006/metadata/properties"/>
+    <ds:schemaRef ds:uri="http://schemas.microsoft.com/office/infopath/2007/PartnerControls"/>
+    <ds:schemaRef ds:uri="33654ad5-d282-4981-a8c8-a8822fbc35b9"/>
+    <ds:schemaRef ds:uri="b9048903-d8ec-4afd-ab52-583bd4eb6592"/>
+  </ds:schemaRefs>
+</ds:datastoreItem>
+</file>
+
+<file path=customXml/itemProps4.xml><?xml version="1.0" encoding="utf-8"?>
+<ds:datastoreItem xmlns:ds="http://schemas.openxmlformats.org/officeDocument/2006/customXml" ds:itemID="{2D9CA2EF-2A0F-4377-AA02-0725358BDBD9}">
+  <ds:schemaRefs>
+    <ds:schemaRef ds:uri="http://schemas.openxmlformats.org/officeDocument/2006/bibliography"/>
+  </ds:schemaRefs>
+</ds:datastoreItem>
 </file>
</xml_diff>

<commit_message>
Novo template para o Rio
</commit_message>
<xml_diff>
--- a/template/template_avista_rj.docx
+++ b/template/template_avista_rj.docx
@@ -605,6 +605,1939 @@
         <w:t>, titulada aqui EXPOSITOR.</w:t>
       </w:r>
     </w:p>
+    <w:tbl>
+      <w:tblPr>
+        <w:tblStyle w:val="Tabelacomgrade"/>
+        <w:tblW w:w="0" w:type="auto"/>
+        <w:jc w:val="center"/>
+        <w:tblLook w:val="04A0" w:firstRow="1" w:lastRow="0" w:firstColumn="1" w:lastColumn="0" w:noHBand="0" w:noVBand="1"/>
+      </w:tblPr>
+      <w:tblGrid>
+        <w:gridCol w:w="3652"/>
+        <w:gridCol w:w="5930"/>
+      </w:tblGrid>
+      <w:tr>
+        <w:trPr>
+          <w:jc w:val="center"/>
+        </w:trPr>
+        <w:tc>
+          <w:tcPr>
+            <w:tcW w:w="9039" w:type="dxa"/>
+            <w:gridSpan w:val="2"/>
+            <w:tcBorders>
+              <w:top w:val="single" w:sz="4" w:space="0" w:color="auto"/>
+              <w:left w:val="single" w:sz="4" w:space="0" w:color="auto"/>
+              <w:bottom w:val="single" w:sz="4" w:space="0" w:color="auto"/>
+              <w:right w:val="single" w:sz="4" w:space="0" w:color="auto"/>
+            </w:tcBorders>
+            <w:hideMark/>
+          </w:tcPr>
+          <w:p>
+            <w:pPr>
+              <w:spacing w:after="200" w:line="276" w:lineRule="auto"/>
+              <w:jc w:val="both"/>
+              <w:rPr>
+                <w:rFonts w:ascii="Arial" w:hAnsi="Arial" w:cs="Arial"/>
+                <w:b/>
+                <w:bCs/>
+                <w:sz w:val="22"/>
+                <w:szCs w:val="22"/>
+              </w:rPr>
+            </w:pPr>
+            <w:r>
+              <w:rPr>
+                <w:rFonts w:ascii="Arial" w:hAnsi="Arial" w:cs="Arial"/>
+                <w:b/>
+                <w:bCs/>
+                <w:sz w:val="22"/>
+                <w:szCs w:val="22"/>
+              </w:rPr>
+              <w:t>QUADRO RESUMO (QR)</w:t>
+            </w:r>
+          </w:p>
+        </w:tc>
+      </w:tr>
+      <w:tr>
+        <w:trPr>
+          <w:jc w:val="center"/>
+        </w:trPr>
+        <w:tc>
+          <w:tcPr>
+            <w:tcW w:w="3652" w:type="dxa"/>
+            <w:tcBorders>
+              <w:top w:val="single" w:sz="4" w:space="0" w:color="auto"/>
+              <w:left w:val="single" w:sz="4" w:space="0" w:color="auto"/>
+              <w:bottom w:val="single" w:sz="4" w:space="0" w:color="auto"/>
+              <w:right w:val="single" w:sz="4" w:space="0" w:color="auto"/>
+            </w:tcBorders>
+          </w:tcPr>
+          <w:p>
+            <w:pPr>
+              <w:spacing w:after="200" w:line="276" w:lineRule="auto"/>
+              <w:jc w:val="both"/>
+              <w:rPr>
+                <w:rFonts w:ascii="Arial" w:hAnsi="Arial" w:cs="Arial"/>
+                <w:b/>
+                <w:bCs/>
+                <w:sz w:val="22"/>
+                <w:szCs w:val="22"/>
+              </w:rPr>
+            </w:pPr>
+            <w:r>
+              <w:rPr>
+                <w:rFonts w:ascii="Arial" w:hAnsi="Arial" w:cs="Arial"/>
+                <w:b/>
+                <w:bCs/>
+                <w:sz w:val="22"/>
+                <w:szCs w:val="22"/>
+              </w:rPr>
+              <w:t>1. ORGANIZADOR</w:t>
+            </w:r>
+          </w:p>
+          <w:p>
+            <w:pPr>
+              <w:spacing w:after="200" w:line="276" w:lineRule="auto"/>
+              <w:jc w:val="both"/>
+              <w:rPr>
+                <w:rFonts w:ascii="Arial" w:hAnsi="Arial" w:cs="Arial"/>
+                <w:b/>
+                <w:bCs/>
+                <w:sz w:val="22"/>
+                <w:szCs w:val="22"/>
+              </w:rPr>
+            </w:pPr>
+          </w:p>
+        </w:tc>
+        <w:tc>
+          <w:tcPr>
+            <w:tcW w:w="5387" w:type="dxa"/>
+            <w:tcBorders>
+              <w:top w:val="single" w:sz="4" w:space="0" w:color="auto"/>
+              <w:left w:val="single" w:sz="4" w:space="0" w:color="auto"/>
+              <w:bottom w:val="single" w:sz="4" w:space="0" w:color="auto"/>
+              <w:right w:val="single" w:sz="4" w:space="0" w:color="auto"/>
+            </w:tcBorders>
+            <w:hideMark/>
+          </w:tcPr>
+          <w:p>
+            <w:pPr>
+              <w:spacing w:after="200" w:line="276" w:lineRule="auto"/>
+              <w:jc w:val="both"/>
+              <w:rPr>
+                <w:rFonts w:ascii="Arial" w:hAnsi="Arial" w:cs="Arial"/>
+                <w:b/>
+                <w:bCs/>
+                <w:sz w:val="22"/>
+                <w:szCs w:val="22"/>
+              </w:rPr>
+            </w:pPr>
+            <w:r>
+              <w:rPr>
+                <w:rFonts w:ascii="Arial" w:hAnsi="Arial" w:cs="Arial"/>
+                <w:b/>
+                <w:bCs/>
+                <w:sz w:val="22"/>
+                <w:szCs w:val="22"/>
+              </w:rPr>
+              <w:t>MEU EXAGERADO NEGOCIOS DE VAREJO LTDA</w:t>
+            </w:r>
+          </w:p>
+        </w:tc>
+      </w:tr>
+      <w:tr>
+        <w:trPr>
+          <w:jc w:val="center"/>
+        </w:trPr>
+        <w:tc>
+          <w:tcPr>
+            <w:tcW w:w="3652" w:type="dxa"/>
+            <w:tcBorders>
+              <w:top w:val="single" w:sz="4" w:space="0" w:color="auto"/>
+              <w:left w:val="single" w:sz="4" w:space="0" w:color="auto"/>
+              <w:bottom w:val="single" w:sz="4" w:space="0" w:color="auto"/>
+              <w:right w:val="single" w:sz="4" w:space="0" w:color="auto"/>
+            </w:tcBorders>
+          </w:tcPr>
+          <w:p>
+            <w:pPr>
+              <w:spacing w:after="200" w:line="276" w:lineRule="auto"/>
+              <w:jc w:val="both"/>
+              <w:rPr>
+                <w:rFonts w:ascii="Arial" w:hAnsi="Arial" w:cs="Arial"/>
+                <w:b/>
+                <w:bCs/>
+                <w:sz w:val="22"/>
+                <w:szCs w:val="22"/>
+              </w:rPr>
+            </w:pPr>
+            <w:r>
+              <w:rPr>
+                <w:rFonts w:ascii="Arial" w:hAnsi="Arial" w:cs="Arial"/>
+                <w:b/>
+                <w:bCs/>
+                <w:sz w:val="22"/>
+                <w:szCs w:val="22"/>
+              </w:rPr>
+              <w:t>2. EXPOSITOR</w:t>
+            </w:r>
+          </w:p>
+          <w:p>
+            <w:pPr>
+              <w:spacing w:after="200" w:line="276" w:lineRule="auto"/>
+              <w:jc w:val="both"/>
+              <w:rPr>
+                <w:rFonts w:ascii="Arial" w:hAnsi="Arial" w:cs="Arial"/>
+                <w:b/>
+                <w:bCs/>
+                <w:sz w:val="22"/>
+                <w:szCs w:val="22"/>
+              </w:rPr>
+            </w:pPr>
+          </w:p>
+        </w:tc>
+        <w:tc>
+          <w:tcPr>
+            <w:tcW w:w="5387" w:type="dxa"/>
+            <w:tcBorders>
+              <w:top w:val="single" w:sz="4" w:space="0" w:color="auto"/>
+              <w:left w:val="single" w:sz="4" w:space="0" w:color="auto"/>
+              <w:bottom w:val="single" w:sz="4" w:space="0" w:color="auto"/>
+              <w:right w:val="single" w:sz="4" w:space="0" w:color="auto"/>
+            </w:tcBorders>
+            <w:hideMark/>
+          </w:tcPr>
+          <w:p>
+            <w:pPr>
+              <w:spacing w:after="200" w:line="276" w:lineRule="auto"/>
+              <w:jc w:val="both"/>
+              <w:rPr>
+                <w:rFonts w:ascii="Arial" w:hAnsi="Arial" w:cs="Arial"/>
+                <w:b/>
+                <w:bCs/>
+                <w:sz w:val="22"/>
+                <w:szCs w:val="22"/>
+              </w:rPr>
+            </w:pPr>
+            <w:r>
+              <w:rPr>
+                <w:rFonts w:ascii="Arial" w:hAnsi="Arial" w:cs="Arial"/>
+                <w:b/>
+                <w:bCs/>
+                <w:sz w:val="22"/>
+                <w:szCs w:val="22"/>
+              </w:rPr>
+              <w:t>{{</w:t>
+            </w:r>
+            <w:r>
+              <w:rPr>
+                <w:rFonts w:ascii="Arial" w:hAnsi="Arial" w:cs="Arial"/>
+                <w:b/>
+                <w:bCs/>
+                <w:sz w:val="22"/>
+                <w:szCs w:val="22"/>
+              </w:rPr>
+              <w:t>EXPOSITOR</w:t>
+            </w:r>
+            <w:r>
+              <w:rPr>
+                <w:rFonts w:ascii="Arial" w:hAnsi="Arial" w:cs="Arial"/>
+                <w:b/>
+                <w:bCs/>
+                <w:sz w:val="22"/>
+                <w:szCs w:val="22"/>
+              </w:rPr>
+              <w:t>}}</w:t>
+            </w:r>
+          </w:p>
+        </w:tc>
+      </w:tr>
+      <w:tr>
+        <w:trPr>
+          <w:jc w:val="center"/>
+        </w:trPr>
+        <w:tc>
+          <w:tcPr>
+            <w:tcW w:w="3652" w:type="dxa"/>
+            <w:tcBorders>
+              <w:top w:val="single" w:sz="4" w:space="0" w:color="auto"/>
+              <w:left w:val="single" w:sz="4" w:space="0" w:color="auto"/>
+              <w:bottom w:val="single" w:sz="4" w:space="0" w:color="auto"/>
+              <w:right w:val="single" w:sz="4" w:space="0" w:color="auto"/>
+            </w:tcBorders>
+          </w:tcPr>
+          <w:p>
+            <w:pPr>
+              <w:spacing w:after="200" w:line="276" w:lineRule="auto"/>
+              <w:jc w:val="both"/>
+              <w:rPr>
+                <w:rFonts w:ascii="Arial" w:hAnsi="Arial" w:cs="Arial"/>
+                <w:b/>
+                <w:bCs/>
+                <w:sz w:val="22"/>
+                <w:szCs w:val="22"/>
+              </w:rPr>
+            </w:pPr>
+            <w:r>
+              <w:rPr>
+                <w:rFonts w:ascii="Arial" w:hAnsi="Arial" w:cs="Arial"/>
+                <w:b/>
+                <w:bCs/>
+                <w:sz w:val="22"/>
+                <w:szCs w:val="22"/>
+              </w:rPr>
+              <w:t>3. EVENTO</w:t>
+            </w:r>
+          </w:p>
+          <w:p>
+            <w:pPr>
+              <w:spacing w:after="200" w:line="276" w:lineRule="auto"/>
+              <w:jc w:val="both"/>
+              <w:rPr>
+                <w:rFonts w:ascii="Arial" w:hAnsi="Arial" w:cs="Arial"/>
+                <w:b/>
+                <w:bCs/>
+                <w:sz w:val="22"/>
+                <w:szCs w:val="22"/>
+              </w:rPr>
+            </w:pPr>
+          </w:p>
+        </w:tc>
+        <w:tc>
+          <w:tcPr>
+            <w:tcW w:w="5387" w:type="dxa"/>
+            <w:tcBorders>
+              <w:top w:val="single" w:sz="4" w:space="0" w:color="auto"/>
+              <w:left w:val="single" w:sz="4" w:space="0" w:color="auto"/>
+              <w:bottom w:val="single" w:sz="4" w:space="0" w:color="auto"/>
+              <w:right w:val="single" w:sz="4" w:space="0" w:color="auto"/>
+            </w:tcBorders>
+            <w:hideMark/>
+          </w:tcPr>
+          <w:p>
+            <w:pPr>
+              <w:spacing w:after="200" w:line="276" w:lineRule="auto"/>
+              <w:jc w:val="both"/>
+              <w:rPr>
+                <w:rFonts w:ascii="Arial" w:hAnsi="Arial" w:cs="Arial"/>
+                <w:b/>
+                <w:bCs/>
+                <w:sz w:val="22"/>
+                <w:szCs w:val="22"/>
+              </w:rPr>
+            </w:pPr>
+            <w:r>
+              <w:rPr>
+                <w:rFonts w:ascii="Arial" w:hAnsi="Arial" w:cs="Arial"/>
+                <w:b/>
+                <w:bCs/>
+                <w:sz w:val="22"/>
+                <w:szCs w:val="22"/>
+              </w:rPr>
+              <w:t>EXAGERADO 2026</w:t>
+            </w:r>
+          </w:p>
+        </w:tc>
+      </w:tr>
+      <w:tr>
+        <w:trPr>
+          <w:trHeight w:val="633"/>
+          <w:jc w:val="center"/>
+        </w:trPr>
+        <w:tc>
+          <w:tcPr>
+            <w:tcW w:w="3652" w:type="dxa"/>
+            <w:tcBorders>
+              <w:top w:val="single" w:sz="4" w:space="0" w:color="auto"/>
+              <w:left w:val="single" w:sz="4" w:space="0" w:color="auto"/>
+              <w:bottom w:val="single" w:sz="4" w:space="0" w:color="auto"/>
+              <w:right w:val="single" w:sz="4" w:space="0" w:color="auto"/>
+            </w:tcBorders>
+          </w:tcPr>
+          <w:p>
+            <w:pPr>
+              <w:spacing w:after="200" w:line="276" w:lineRule="auto"/>
+              <w:jc w:val="both"/>
+              <w:rPr>
+                <w:rFonts w:ascii="Arial" w:hAnsi="Arial" w:cs="Arial"/>
+                <w:b/>
+                <w:bCs/>
+                <w:sz w:val="22"/>
+                <w:szCs w:val="22"/>
+              </w:rPr>
+            </w:pPr>
+            <w:r>
+              <w:rPr>
+                <w:rFonts w:ascii="Arial" w:hAnsi="Arial" w:cs="Arial"/>
+                <w:b/>
+                <w:bCs/>
+                <w:sz w:val="22"/>
+                <w:szCs w:val="22"/>
+              </w:rPr>
+              <w:t>4. ÁREA</w:t>
+            </w:r>
+          </w:p>
+          <w:p>
+            <w:pPr>
+              <w:spacing w:after="200" w:line="276" w:lineRule="auto"/>
+              <w:jc w:val="both"/>
+              <w:rPr>
+                <w:rFonts w:ascii="Arial" w:hAnsi="Arial" w:cs="Arial"/>
+                <w:b/>
+                <w:bCs/>
+                <w:sz w:val="22"/>
+                <w:szCs w:val="22"/>
+              </w:rPr>
+            </w:pPr>
+          </w:p>
+        </w:tc>
+        <w:tc>
+          <w:tcPr>
+            <w:tcW w:w="5387" w:type="dxa"/>
+            <w:tcBorders>
+              <w:top w:val="single" w:sz="4" w:space="0" w:color="auto"/>
+              <w:left w:val="single" w:sz="4" w:space="0" w:color="auto"/>
+              <w:bottom w:val="single" w:sz="4" w:space="0" w:color="auto"/>
+              <w:right w:val="single" w:sz="4" w:space="0" w:color="auto"/>
+            </w:tcBorders>
+          </w:tcPr>
+          <w:p>
+            <w:pPr>
+              <w:spacing w:after="200" w:line="276" w:lineRule="auto"/>
+              <w:jc w:val="both"/>
+              <w:rPr>
+                <w:rFonts w:ascii="Arial" w:hAnsi="Arial" w:cs="Arial"/>
+                <w:b/>
+                <w:bCs/>
+                <w:sz w:val="22"/>
+                <w:szCs w:val="22"/>
+              </w:rPr>
+            </w:pPr>
+            <w:r>
+              <w:rPr>
+                <w:rFonts w:ascii="Arial" w:hAnsi="Arial" w:cs="Arial"/>
+                <w:b/>
+                <w:bCs/>
+                <w:sz w:val="22"/>
+                <w:szCs w:val="22"/>
+              </w:rPr>
+              <w:t>{{</w:t>
+            </w:r>
+            <w:r>
+              <w:rPr>
+                <w:rFonts w:ascii="Arial" w:hAnsi="Arial" w:cs="Arial"/>
+                <w:b/>
+              </w:rPr>
+              <w:t>EXPOSITORAREASTAND</w:t>
+            </w:r>
+            <w:r>
+              <w:rPr>
+                <w:rFonts w:ascii="Arial" w:hAnsi="Arial" w:cs="Arial"/>
+                <w:b/>
+                <w:bCs/>
+                <w:sz w:val="22"/>
+                <w:szCs w:val="22"/>
+              </w:rPr>
+              <w:t>}}</w:t>
+            </w:r>
+          </w:p>
+          <w:p>
+            <w:pPr>
+              <w:spacing w:after="200" w:line="276" w:lineRule="auto"/>
+              <w:jc w:val="both"/>
+              <w:rPr>
+                <w:rFonts w:ascii="Arial" w:hAnsi="Arial" w:cs="Arial"/>
+                <w:b/>
+                <w:bCs/>
+                <w:sz w:val="22"/>
+                <w:szCs w:val="22"/>
+              </w:rPr>
+            </w:pPr>
+          </w:p>
+          <w:p>
+            <w:pPr>
+              <w:spacing w:after="200" w:line="276" w:lineRule="auto"/>
+              <w:jc w:val="both"/>
+              <w:rPr>
+                <w:rFonts w:ascii="Arial" w:hAnsi="Arial" w:cs="Arial"/>
+                <w:b/>
+                <w:bCs/>
+                <w:sz w:val="22"/>
+                <w:szCs w:val="22"/>
+              </w:rPr>
+            </w:pPr>
+          </w:p>
+        </w:tc>
+      </w:tr>
+      <w:tr>
+        <w:trPr>
+          <w:trHeight w:val="3479"/>
+          <w:jc w:val="center"/>
+        </w:trPr>
+        <w:tc>
+          <w:tcPr>
+            <w:tcW w:w="3652" w:type="dxa"/>
+            <w:tcBorders>
+              <w:top w:val="single" w:sz="4" w:space="0" w:color="auto"/>
+              <w:left w:val="single" w:sz="4" w:space="0" w:color="auto"/>
+              <w:bottom w:val="single" w:sz="4" w:space="0" w:color="auto"/>
+              <w:right w:val="single" w:sz="4" w:space="0" w:color="auto"/>
+            </w:tcBorders>
+          </w:tcPr>
+          <w:p>
+            <w:pPr>
+              <w:spacing w:after="200" w:line="276" w:lineRule="auto"/>
+              <w:jc w:val="both"/>
+              <w:rPr>
+                <w:rFonts w:ascii="Arial" w:hAnsi="Arial" w:cs="Arial"/>
+                <w:b/>
+                <w:bCs/>
+                <w:sz w:val="22"/>
+                <w:szCs w:val="22"/>
+              </w:rPr>
+            </w:pPr>
+            <w:r>
+              <w:rPr>
+                <w:rFonts w:ascii="Arial" w:hAnsi="Arial" w:cs="Arial"/>
+                <w:b/>
+                <w:bCs/>
+                <w:sz w:val="22"/>
+                <w:szCs w:val="22"/>
+              </w:rPr>
+              <w:lastRenderedPageBreak/>
+              <w:t>5. PERÍODO</w:t>
+            </w:r>
+          </w:p>
+          <w:p>
+            <w:pPr>
+              <w:spacing w:after="200" w:line="276" w:lineRule="auto"/>
+              <w:jc w:val="both"/>
+              <w:rPr>
+                <w:rFonts w:ascii="Arial" w:hAnsi="Arial" w:cs="Arial"/>
+                <w:b/>
+                <w:bCs/>
+                <w:sz w:val="22"/>
+                <w:szCs w:val="22"/>
+              </w:rPr>
+            </w:pPr>
+          </w:p>
+        </w:tc>
+        <w:tc>
+          <w:tcPr>
+            <w:tcW w:w="5387" w:type="dxa"/>
+            <w:tcBorders>
+              <w:top w:val="single" w:sz="4" w:space="0" w:color="auto"/>
+              <w:left w:val="single" w:sz="4" w:space="0" w:color="auto"/>
+              <w:bottom w:val="single" w:sz="4" w:space="0" w:color="auto"/>
+              <w:right w:val="single" w:sz="4" w:space="0" w:color="auto"/>
+            </w:tcBorders>
+          </w:tcPr>
+          <w:p>
+            <w:pPr>
+              <w:spacing w:after="200" w:line="276" w:lineRule="auto"/>
+              <w:jc w:val="both"/>
+              <w:rPr>
+                <w:rFonts w:ascii="Arial" w:hAnsi="Arial" w:cs="Arial"/>
+                <w:b/>
+                <w:bCs/>
+                <w:sz w:val="22"/>
+                <w:szCs w:val="22"/>
+              </w:rPr>
+            </w:pPr>
+          </w:p>
+          <w:tbl>
+            <w:tblPr>
+              <w:tblStyle w:val="Tabelacomgrade"/>
+              <w:tblW w:w="0" w:type="auto"/>
+              <w:tblLook w:val="04A0" w:firstRow="1" w:lastRow="0" w:firstColumn="1" w:lastColumn="0" w:noHBand="0" w:noVBand="1"/>
+            </w:tblPr>
+            <w:tblGrid>
+              <w:gridCol w:w="2576"/>
+              <w:gridCol w:w="791"/>
+              <w:gridCol w:w="791"/>
+              <w:gridCol w:w="767"/>
+              <w:gridCol w:w="779"/>
+            </w:tblGrid>
+            <w:tr>
+              <w:tc>
+                <w:tcPr>
+                  <w:tcW w:w="2576" w:type="dxa"/>
+                  <w:tcBorders>
+                    <w:top w:val="single" w:sz="4" w:space="0" w:color="auto"/>
+                    <w:left w:val="single" w:sz="4" w:space="0" w:color="auto"/>
+                    <w:bottom w:val="single" w:sz="4" w:space="0" w:color="auto"/>
+                    <w:right w:val="single" w:sz="4" w:space="0" w:color="auto"/>
+                  </w:tcBorders>
+                  <w:hideMark/>
+                </w:tcPr>
+                <w:p>
+                  <w:pPr>
+                    <w:spacing w:after="200" w:line="276" w:lineRule="auto"/>
+                    <w:jc w:val="both"/>
+                    <w:rPr>
+                      <w:rFonts w:ascii="Arial" w:hAnsi="Arial" w:cs="Arial"/>
+                      <w:b/>
+                      <w:bCs/>
+                      <w:sz w:val="22"/>
+                      <w:szCs w:val="22"/>
+                    </w:rPr>
+                  </w:pPr>
+                  <w:r>
+                    <w:rPr>
+                      <w:rFonts w:ascii="Arial" w:hAnsi="Arial" w:cs="Arial"/>
+                      <w:b/>
+                      <w:bCs/>
+                      <w:sz w:val="22"/>
+                      <w:szCs w:val="22"/>
+                    </w:rPr>
+                    <w:t>Etapas</w:t>
+                  </w:r>
+                </w:p>
+              </w:tc>
+              <w:tc>
+                <w:tcPr>
+                  <w:tcW w:w="791" w:type="dxa"/>
+                  <w:tcBorders>
+                    <w:top w:val="single" w:sz="4" w:space="0" w:color="auto"/>
+                    <w:left w:val="single" w:sz="4" w:space="0" w:color="auto"/>
+                    <w:bottom w:val="single" w:sz="4" w:space="0" w:color="auto"/>
+                    <w:right w:val="single" w:sz="4" w:space="0" w:color="auto"/>
+                  </w:tcBorders>
+                  <w:hideMark/>
+                </w:tcPr>
+                <w:p>
+                  <w:pPr>
+                    <w:spacing w:after="200" w:line="276" w:lineRule="auto"/>
+                    <w:jc w:val="both"/>
+                    <w:rPr>
+                      <w:rFonts w:ascii="Arial" w:hAnsi="Arial" w:cs="Arial"/>
+                      <w:b/>
+                      <w:bCs/>
+                      <w:sz w:val="22"/>
+                      <w:szCs w:val="22"/>
+                    </w:rPr>
+                  </w:pPr>
+                  <w:proofErr w:type="spellStart"/>
+                  <w:r>
+                    <w:rPr>
+                      <w:rFonts w:ascii="Arial" w:hAnsi="Arial" w:cs="Arial"/>
+                      <w:b/>
+                      <w:bCs/>
+                      <w:sz w:val="22"/>
+                      <w:szCs w:val="22"/>
+                    </w:rPr>
+                    <w:t>Dt</w:t>
+                  </w:r>
+                  <w:proofErr w:type="spellEnd"/>
+                  <w:r>
+                    <w:rPr>
+                      <w:rFonts w:ascii="Arial" w:hAnsi="Arial" w:cs="Arial"/>
+                      <w:b/>
+                      <w:bCs/>
+                      <w:sz w:val="22"/>
+                      <w:szCs w:val="22"/>
+                    </w:rPr>
+                    <w:t xml:space="preserve"> Início</w:t>
+                  </w:r>
+                </w:p>
+              </w:tc>
+              <w:tc>
+                <w:tcPr>
+                  <w:tcW w:w="791" w:type="dxa"/>
+                  <w:tcBorders>
+                    <w:top w:val="single" w:sz="4" w:space="0" w:color="auto"/>
+                    <w:left w:val="single" w:sz="4" w:space="0" w:color="auto"/>
+                    <w:bottom w:val="single" w:sz="4" w:space="0" w:color="auto"/>
+                    <w:right w:val="single" w:sz="4" w:space="0" w:color="auto"/>
+                  </w:tcBorders>
+                  <w:hideMark/>
+                </w:tcPr>
+                <w:p>
+                  <w:pPr>
+                    <w:spacing w:after="200" w:line="276" w:lineRule="auto"/>
+                    <w:jc w:val="both"/>
+                    <w:rPr>
+                      <w:rFonts w:ascii="Arial" w:hAnsi="Arial" w:cs="Arial"/>
+                      <w:b/>
+                      <w:bCs/>
+                      <w:sz w:val="22"/>
+                      <w:szCs w:val="22"/>
+                    </w:rPr>
+                  </w:pPr>
+                  <w:proofErr w:type="spellStart"/>
+                  <w:r>
+                    <w:rPr>
+                      <w:rFonts w:ascii="Arial" w:hAnsi="Arial" w:cs="Arial"/>
+                      <w:b/>
+                      <w:bCs/>
+                      <w:sz w:val="22"/>
+                      <w:szCs w:val="22"/>
+                    </w:rPr>
+                    <w:t>Hr</w:t>
+                  </w:r>
+                  <w:proofErr w:type="spellEnd"/>
+                  <w:r>
+                    <w:rPr>
+                      <w:rFonts w:ascii="Arial" w:hAnsi="Arial" w:cs="Arial"/>
+                      <w:b/>
+                      <w:bCs/>
+                      <w:sz w:val="22"/>
+                      <w:szCs w:val="22"/>
+                    </w:rPr>
+                    <w:t xml:space="preserve"> Início</w:t>
+                  </w:r>
+                </w:p>
+              </w:tc>
+              <w:tc>
+                <w:tcPr>
+                  <w:tcW w:w="767" w:type="dxa"/>
+                  <w:tcBorders>
+                    <w:top w:val="single" w:sz="4" w:space="0" w:color="auto"/>
+                    <w:left w:val="single" w:sz="4" w:space="0" w:color="auto"/>
+                    <w:bottom w:val="single" w:sz="4" w:space="0" w:color="auto"/>
+                    <w:right w:val="single" w:sz="4" w:space="0" w:color="auto"/>
+                  </w:tcBorders>
+                  <w:hideMark/>
+                </w:tcPr>
+                <w:p>
+                  <w:pPr>
+                    <w:spacing w:after="200" w:line="276" w:lineRule="auto"/>
+                    <w:jc w:val="both"/>
+                    <w:rPr>
+                      <w:rFonts w:ascii="Arial" w:hAnsi="Arial" w:cs="Arial"/>
+                      <w:b/>
+                      <w:bCs/>
+                      <w:sz w:val="22"/>
+                      <w:szCs w:val="22"/>
+                    </w:rPr>
+                  </w:pPr>
+                  <w:proofErr w:type="spellStart"/>
+                  <w:r>
+                    <w:rPr>
+                      <w:rFonts w:ascii="Arial" w:hAnsi="Arial" w:cs="Arial"/>
+                      <w:b/>
+                      <w:bCs/>
+                      <w:sz w:val="22"/>
+                      <w:szCs w:val="22"/>
+                    </w:rPr>
+                    <w:t>Dt</w:t>
+                  </w:r>
+                  <w:proofErr w:type="spellEnd"/>
+                  <w:r>
+                    <w:rPr>
+                      <w:rFonts w:ascii="Arial" w:hAnsi="Arial" w:cs="Arial"/>
+                      <w:b/>
+                      <w:bCs/>
+                      <w:sz w:val="22"/>
+                      <w:szCs w:val="22"/>
+                    </w:rPr>
+                    <w:t xml:space="preserve"> Fim</w:t>
+                  </w:r>
+                </w:p>
+              </w:tc>
+              <w:tc>
+                <w:tcPr>
+                  <w:tcW w:w="779" w:type="dxa"/>
+                  <w:tcBorders>
+                    <w:top w:val="single" w:sz="4" w:space="0" w:color="auto"/>
+                    <w:left w:val="single" w:sz="4" w:space="0" w:color="auto"/>
+                    <w:bottom w:val="single" w:sz="4" w:space="0" w:color="auto"/>
+                    <w:right w:val="single" w:sz="4" w:space="0" w:color="auto"/>
+                  </w:tcBorders>
+                  <w:hideMark/>
+                </w:tcPr>
+                <w:p>
+                  <w:pPr>
+                    <w:spacing w:after="200" w:line="276" w:lineRule="auto"/>
+                    <w:jc w:val="both"/>
+                    <w:rPr>
+                      <w:rFonts w:ascii="Arial" w:hAnsi="Arial" w:cs="Arial"/>
+                      <w:b/>
+                      <w:bCs/>
+                      <w:sz w:val="22"/>
+                      <w:szCs w:val="22"/>
+                    </w:rPr>
+                  </w:pPr>
+                  <w:proofErr w:type="spellStart"/>
+                  <w:r>
+                    <w:rPr>
+                      <w:rFonts w:ascii="Arial" w:hAnsi="Arial" w:cs="Arial"/>
+                      <w:b/>
+                      <w:bCs/>
+                      <w:sz w:val="22"/>
+                      <w:szCs w:val="22"/>
+                    </w:rPr>
+                    <w:t>Hr</w:t>
+                  </w:r>
+                  <w:proofErr w:type="spellEnd"/>
+                  <w:r>
+                    <w:rPr>
+                      <w:rFonts w:ascii="Arial" w:hAnsi="Arial" w:cs="Arial"/>
+                      <w:b/>
+                      <w:bCs/>
+                      <w:sz w:val="22"/>
+                      <w:szCs w:val="22"/>
+                    </w:rPr>
+                    <w:t xml:space="preserve"> Fim</w:t>
+                  </w:r>
+                </w:p>
+              </w:tc>
+            </w:tr>
+            <w:tr>
+              <w:tc>
+                <w:tcPr>
+                  <w:tcW w:w="2576" w:type="dxa"/>
+                  <w:tcBorders>
+                    <w:top w:val="single" w:sz="4" w:space="0" w:color="auto"/>
+                    <w:left w:val="single" w:sz="4" w:space="0" w:color="auto"/>
+                    <w:bottom w:val="single" w:sz="4" w:space="0" w:color="auto"/>
+                    <w:right w:val="single" w:sz="4" w:space="0" w:color="auto"/>
+                  </w:tcBorders>
+                  <w:hideMark/>
+                </w:tcPr>
+                <w:p>
+                  <w:pPr>
+                    <w:spacing w:after="200" w:line="276" w:lineRule="auto"/>
+                    <w:jc w:val="both"/>
+                    <w:rPr>
+                      <w:rFonts w:ascii="Arial" w:hAnsi="Arial" w:cs="Arial"/>
+                      <w:b/>
+                      <w:bCs/>
+                      <w:sz w:val="22"/>
+                      <w:szCs w:val="22"/>
+                    </w:rPr>
+                  </w:pPr>
+                  <w:r>
+                    <w:rPr>
+                      <w:rFonts w:ascii="Arial" w:hAnsi="Arial" w:cs="Arial"/>
+                      <w:b/>
+                      <w:bCs/>
+                      <w:sz w:val="22"/>
+                      <w:szCs w:val="22"/>
+                    </w:rPr>
+                    <w:t>Montagem</w:t>
+                  </w:r>
+                </w:p>
+              </w:tc>
+              <w:tc>
+                <w:tcPr>
+                  <w:tcW w:w="791" w:type="dxa"/>
+                  <w:tcBorders>
+                    <w:top w:val="single" w:sz="4" w:space="0" w:color="auto"/>
+                    <w:left w:val="single" w:sz="4" w:space="0" w:color="auto"/>
+                    <w:bottom w:val="single" w:sz="4" w:space="0" w:color="auto"/>
+                    <w:right w:val="single" w:sz="4" w:space="0" w:color="auto"/>
+                  </w:tcBorders>
+                </w:tcPr>
+                <w:p>
+                  <w:pPr>
+                    <w:spacing w:after="200" w:line="276" w:lineRule="auto"/>
+                    <w:jc w:val="both"/>
+                    <w:rPr>
+                      <w:rFonts w:ascii="Arial" w:hAnsi="Arial" w:cs="Arial"/>
+                      <w:b/>
+                      <w:bCs/>
+                      <w:sz w:val="22"/>
+                      <w:szCs w:val="22"/>
+                    </w:rPr>
+                  </w:pPr>
+                  <w:r>
+                    <w:rPr>
+                      <w:rFonts w:ascii="Arial" w:hAnsi="Arial" w:cs="Arial"/>
+                      <w:b/>
+                      <w:bCs/>
+                      <w:sz w:val="22"/>
+                      <w:szCs w:val="22"/>
+                    </w:rPr>
+                    <w:t>03/08</w:t>
+                  </w:r>
+                </w:p>
+              </w:tc>
+              <w:tc>
+                <w:tcPr>
+                  <w:tcW w:w="791" w:type="dxa"/>
+                  <w:tcBorders>
+                    <w:top w:val="single" w:sz="4" w:space="0" w:color="auto"/>
+                    <w:left w:val="single" w:sz="4" w:space="0" w:color="auto"/>
+                    <w:bottom w:val="single" w:sz="4" w:space="0" w:color="auto"/>
+                    <w:right w:val="single" w:sz="4" w:space="0" w:color="auto"/>
+                  </w:tcBorders>
+                </w:tcPr>
+                <w:p>
+                  <w:pPr>
+                    <w:spacing w:after="200" w:line="276" w:lineRule="auto"/>
+                    <w:jc w:val="both"/>
+                    <w:rPr>
+                      <w:rFonts w:ascii="Arial" w:hAnsi="Arial" w:cs="Arial"/>
+                      <w:b/>
+                      <w:bCs/>
+                      <w:sz w:val="22"/>
+                      <w:szCs w:val="22"/>
+                    </w:rPr>
+                  </w:pPr>
+                  <w:r>
+                    <w:rPr>
+                      <w:rFonts w:ascii="Arial" w:hAnsi="Arial" w:cs="Arial"/>
+                      <w:b/>
+                      <w:bCs/>
+                      <w:sz w:val="22"/>
+                      <w:szCs w:val="22"/>
+                    </w:rPr>
+                    <w:t>08:00</w:t>
+                  </w:r>
+                </w:p>
+              </w:tc>
+              <w:tc>
+                <w:tcPr>
+                  <w:tcW w:w="767" w:type="dxa"/>
+                  <w:tcBorders>
+                    <w:top w:val="single" w:sz="4" w:space="0" w:color="auto"/>
+                    <w:left w:val="single" w:sz="4" w:space="0" w:color="auto"/>
+                    <w:bottom w:val="single" w:sz="4" w:space="0" w:color="auto"/>
+                    <w:right w:val="single" w:sz="4" w:space="0" w:color="auto"/>
+                  </w:tcBorders>
+                </w:tcPr>
+                <w:p>
+                  <w:pPr>
+                    <w:spacing w:after="200" w:line="276" w:lineRule="auto"/>
+                    <w:jc w:val="both"/>
+                    <w:rPr>
+                      <w:rFonts w:ascii="Arial" w:hAnsi="Arial" w:cs="Arial"/>
+                      <w:b/>
+                      <w:bCs/>
+                      <w:sz w:val="22"/>
+                      <w:szCs w:val="22"/>
+                    </w:rPr>
+                  </w:pPr>
+                  <w:r>
+                    <w:rPr>
+                      <w:rFonts w:ascii="Arial" w:hAnsi="Arial" w:cs="Arial"/>
+                      <w:b/>
+                      <w:bCs/>
+                      <w:sz w:val="22"/>
+                      <w:szCs w:val="22"/>
+                    </w:rPr>
+                    <w:t>04/08</w:t>
+                  </w:r>
+                </w:p>
+              </w:tc>
+              <w:tc>
+                <w:tcPr>
+                  <w:tcW w:w="779" w:type="dxa"/>
+                  <w:tcBorders>
+                    <w:top w:val="single" w:sz="4" w:space="0" w:color="auto"/>
+                    <w:left w:val="single" w:sz="4" w:space="0" w:color="auto"/>
+                    <w:bottom w:val="single" w:sz="4" w:space="0" w:color="auto"/>
+                    <w:right w:val="single" w:sz="4" w:space="0" w:color="auto"/>
+                  </w:tcBorders>
+                </w:tcPr>
+                <w:p>
+                  <w:pPr>
+                    <w:spacing w:after="200" w:line="276" w:lineRule="auto"/>
+                    <w:jc w:val="both"/>
+                    <w:rPr>
+                      <w:rFonts w:ascii="Arial" w:hAnsi="Arial" w:cs="Arial"/>
+                      <w:b/>
+                      <w:bCs/>
+                      <w:sz w:val="22"/>
+                      <w:szCs w:val="22"/>
+                    </w:rPr>
+                  </w:pPr>
+                  <w:r>
+                    <w:rPr>
+                      <w:rFonts w:ascii="Arial" w:hAnsi="Arial" w:cs="Arial"/>
+                      <w:b/>
+                      <w:bCs/>
+                      <w:sz w:val="22"/>
+                      <w:szCs w:val="22"/>
+                    </w:rPr>
+                    <w:t>20:00</w:t>
+                  </w:r>
+                </w:p>
+              </w:tc>
+            </w:tr>
+            <w:tr>
+              <w:tc>
+                <w:tcPr>
+                  <w:tcW w:w="2576" w:type="dxa"/>
+                  <w:tcBorders>
+                    <w:top w:val="single" w:sz="4" w:space="0" w:color="auto"/>
+                    <w:left w:val="single" w:sz="4" w:space="0" w:color="auto"/>
+                    <w:bottom w:val="single" w:sz="4" w:space="0" w:color="auto"/>
+                    <w:right w:val="single" w:sz="4" w:space="0" w:color="auto"/>
+                  </w:tcBorders>
+                  <w:shd w:val="clear" w:color="auto" w:fill="BFBFBF" w:themeFill="background1" w:themeFillShade="BF"/>
+                  <w:hideMark/>
+                </w:tcPr>
+                <w:p>
+                  <w:pPr>
+                    <w:spacing w:after="200" w:line="276" w:lineRule="auto"/>
+                    <w:jc w:val="both"/>
+                    <w:rPr>
+                      <w:rFonts w:ascii="Arial" w:hAnsi="Arial" w:cs="Arial"/>
+                      <w:b/>
+                      <w:bCs/>
+                      <w:sz w:val="22"/>
+                      <w:szCs w:val="22"/>
+                    </w:rPr>
+                  </w:pPr>
+                  <w:r>
+                    <w:rPr>
+                      <w:rFonts w:ascii="Arial" w:hAnsi="Arial" w:cs="Arial"/>
+                      <w:b/>
+                      <w:bCs/>
+                      <w:sz w:val="22"/>
+                      <w:szCs w:val="22"/>
+                    </w:rPr>
+                    <w:t>Realização</w:t>
+                  </w:r>
+                  <w:r>
+                    <w:rPr>
+                      <w:rFonts w:ascii="Arial" w:hAnsi="Arial" w:cs="Arial"/>
+                      <w:b/>
+                      <w:bCs/>
+                      <w:sz w:val="22"/>
+                      <w:szCs w:val="22"/>
+                    </w:rPr>
+                    <w:t>/Carteirinha</w:t>
+                  </w:r>
+                </w:p>
+              </w:tc>
+              <w:tc>
+                <w:tcPr>
+                  <w:tcW w:w="791" w:type="dxa"/>
+                  <w:tcBorders>
+                    <w:top w:val="single" w:sz="4" w:space="0" w:color="auto"/>
+                    <w:left w:val="single" w:sz="4" w:space="0" w:color="auto"/>
+                    <w:bottom w:val="single" w:sz="4" w:space="0" w:color="auto"/>
+                    <w:right w:val="single" w:sz="4" w:space="0" w:color="auto"/>
+                  </w:tcBorders>
+                  <w:shd w:val="clear" w:color="auto" w:fill="BFBFBF" w:themeFill="background1" w:themeFillShade="BF"/>
+                </w:tcPr>
+                <w:p>
+                  <w:pPr>
+                    <w:spacing w:after="200" w:line="276" w:lineRule="auto"/>
+                    <w:jc w:val="both"/>
+                    <w:rPr>
+                      <w:rFonts w:ascii="Arial" w:hAnsi="Arial" w:cs="Arial"/>
+                      <w:b/>
+                      <w:bCs/>
+                      <w:sz w:val="22"/>
+                      <w:szCs w:val="22"/>
+                    </w:rPr>
+                  </w:pPr>
+                  <w:r>
+                    <w:rPr>
+                      <w:rFonts w:ascii="Arial" w:hAnsi="Arial" w:cs="Arial"/>
+                      <w:b/>
+                      <w:bCs/>
+                      <w:sz w:val="22"/>
+                      <w:szCs w:val="22"/>
+                    </w:rPr>
+                    <w:t>05/08</w:t>
+                  </w:r>
+                </w:p>
+              </w:tc>
+              <w:tc>
+                <w:tcPr>
+                  <w:tcW w:w="791" w:type="dxa"/>
+                  <w:tcBorders>
+                    <w:top w:val="single" w:sz="4" w:space="0" w:color="auto"/>
+                    <w:left w:val="single" w:sz="4" w:space="0" w:color="auto"/>
+                    <w:bottom w:val="single" w:sz="4" w:space="0" w:color="auto"/>
+                    <w:right w:val="single" w:sz="4" w:space="0" w:color="auto"/>
+                  </w:tcBorders>
+                  <w:shd w:val="clear" w:color="auto" w:fill="BFBFBF" w:themeFill="background1" w:themeFillShade="BF"/>
+                </w:tcPr>
+                <w:p>
+                  <w:pPr>
+                    <w:spacing w:after="200" w:line="276" w:lineRule="auto"/>
+                    <w:jc w:val="both"/>
+                    <w:rPr>
+                      <w:rFonts w:ascii="Arial" w:hAnsi="Arial" w:cs="Arial"/>
+                      <w:b/>
+                      <w:bCs/>
+                      <w:sz w:val="22"/>
+                      <w:szCs w:val="22"/>
+                    </w:rPr>
+                  </w:pPr>
+                  <w:r>
+                    <w:rPr>
+                      <w:rFonts w:ascii="Arial" w:hAnsi="Arial" w:cs="Arial"/>
+                      <w:b/>
+                      <w:bCs/>
+                      <w:sz w:val="22"/>
+                      <w:szCs w:val="22"/>
+                    </w:rPr>
+                    <w:t>09:00</w:t>
+                  </w:r>
+                </w:p>
+              </w:tc>
+              <w:tc>
+                <w:tcPr>
+                  <w:tcW w:w="767" w:type="dxa"/>
+                  <w:tcBorders>
+                    <w:top w:val="single" w:sz="4" w:space="0" w:color="auto"/>
+                    <w:left w:val="single" w:sz="4" w:space="0" w:color="auto"/>
+                    <w:bottom w:val="single" w:sz="4" w:space="0" w:color="auto"/>
+                    <w:right w:val="single" w:sz="4" w:space="0" w:color="auto"/>
+                  </w:tcBorders>
+                  <w:shd w:val="clear" w:color="auto" w:fill="BFBFBF" w:themeFill="background1" w:themeFillShade="BF"/>
+                </w:tcPr>
+                <w:p>
+                  <w:pPr>
+                    <w:spacing w:after="200" w:line="276" w:lineRule="auto"/>
+                    <w:jc w:val="both"/>
+                    <w:rPr>
+                      <w:rFonts w:ascii="Arial" w:hAnsi="Arial" w:cs="Arial"/>
+                      <w:b/>
+                      <w:bCs/>
+                      <w:sz w:val="22"/>
+                      <w:szCs w:val="22"/>
+                    </w:rPr>
+                  </w:pPr>
+                  <w:r>
+                    <w:rPr>
+                      <w:rFonts w:ascii="Arial" w:hAnsi="Arial" w:cs="Arial"/>
+                      <w:b/>
+                      <w:bCs/>
+                      <w:sz w:val="22"/>
+                      <w:szCs w:val="22"/>
+                    </w:rPr>
+                    <w:t>05/08</w:t>
+                  </w:r>
+                </w:p>
+              </w:tc>
+              <w:tc>
+                <w:tcPr>
+                  <w:tcW w:w="779" w:type="dxa"/>
+                  <w:tcBorders>
+                    <w:top w:val="single" w:sz="4" w:space="0" w:color="auto"/>
+                    <w:left w:val="single" w:sz="4" w:space="0" w:color="auto"/>
+                    <w:bottom w:val="single" w:sz="4" w:space="0" w:color="auto"/>
+                    <w:right w:val="single" w:sz="4" w:space="0" w:color="auto"/>
+                  </w:tcBorders>
+                  <w:shd w:val="clear" w:color="auto" w:fill="BFBFBF" w:themeFill="background1" w:themeFillShade="BF"/>
+                </w:tcPr>
+                <w:p>
+                  <w:pPr>
+                    <w:spacing w:after="200" w:line="276" w:lineRule="auto"/>
+                    <w:jc w:val="both"/>
+                    <w:rPr>
+                      <w:rFonts w:ascii="Arial" w:hAnsi="Arial" w:cs="Arial"/>
+                      <w:b/>
+                      <w:bCs/>
+                      <w:sz w:val="22"/>
+                      <w:szCs w:val="22"/>
+                    </w:rPr>
+                  </w:pPr>
+                  <w:r>
+                    <w:rPr>
+                      <w:rFonts w:ascii="Arial" w:hAnsi="Arial" w:cs="Arial"/>
+                      <w:b/>
+                      <w:bCs/>
+                      <w:sz w:val="22"/>
+                      <w:szCs w:val="22"/>
+                    </w:rPr>
+                    <w:t>10:00</w:t>
+                  </w:r>
+                </w:p>
+              </w:tc>
+            </w:tr>
+            <w:tr>
+              <w:tc>
+                <w:tcPr>
+                  <w:tcW w:w="2576" w:type="dxa"/>
+                  <w:tcBorders>
+                    <w:top w:val="single" w:sz="4" w:space="0" w:color="auto"/>
+                    <w:left w:val="single" w:sz="4" w:space="0" w:color="auto"/>
+                    <w:bottom w:val="single" w:sz="4" w:space="0" w:color="auto"/>
+                    <w:right w:val="single" w:sz="4" w:space="0" w:color="auto"/>
+                  </w:tcBorders>
+                  <w:shd w:val="clear" w:color="auto" w:fill="BFBFBF" w:themeFill="background1" w:themeFillShade="BF"/>
+                  <w:hideMark/>
+                </w:tcPr>
+                <w:p>
+                  <w:pPr>
+                    <w:spacing w:after="200" w:line="276" w:lineRule="auto"/>
+                    <w:jc w:val="both"/>
+                    <w:rPr>
+                      <w:rFonts w:ascii="Arial" w:hAnsi="Arial" w:cs="Arial"/>
+                      <w:b/>
+                      <w:bCs/>
+                      <w:sz w:val="22"/>
+                      <w:szCs w:val="22"/>
+                    </w:rPr>
+                  </w:pPr>
+                  <w:r>
+                    <w:rPr>
+                      <w:rFonts w:ascii="Arial" w:hAnsi="Arial" w:cs="Arial"/>
+                      <w:b/>
+                      <w:bCs/>
+                      <w:sz w:val="22"/>
+                      <w:szCs w:val="22"/>
+                    </w:rPr>
+                    <w:t>Realização</w:t>
+                  </w:r>
+                </w:p>
+              </w:tc>
+              <w:tc>
+                <w:tcPr>
+                  <w:tcW w:w="791" w:type="dxa"/>
+                  <w:tcBorders>
+                    <w:top w:val="single" w:sz="4" w:space="0" w:color="auto"/>
+                    <w:left w:val="single" w:sz="4" w:space="0" w:color="auto"/>
+                    <w:bottom w:val="single" w:sz="4" w:space="0" w:color="auto"/>
+                    <w:right w:val="single" w:sz="4" w:space="0" w:color="auto"/>
+                  </w:tcBorders>
+                  <w:shd w:val="clear" w:color="auto" w:fill="BFBFBF" w:themeFill="background1" w:themeFillShade="BF"/>
+                </w:tcPr>
+                <w:p>
+                  <w:pPr>
+                    <w:spacing w:after="200" w:line="276" w:lineRule="auto"/>
+                    <w:jc w:val="both"/>
+                    <w:rPr>
+                      <w:rFonts w:ascii="Arial" w:hAnsi="Arial" w:cs="Arial"/>
+                      <w:b/>
+                      <w:bCs/>
+                      <w:sz w:val="22"/>
+                      <w:szCs w:val="22"/>
+                    </w:rPr>
+                  </w:pPr>
+                  <w:r>
+                    <w:rPr>
+                      <w:rFonts w:ascii="Arial" w:hAnsi="Arial" w:cs="Arial"/>
+                      <w:b/>
+                      <w:bCs/>
+                      <w:sz w:val="22"/>
+                      <w:szCs w:val="22"/>
+                    </w:rPr>
+                    <w:t>05/08</w:t>
+                  </w:r>
+                </w:p>
+              </w:tc>
+              <w:tc>
+                <w:tcPr>
+                  <w:tcW w:w="791" w:type="dxa"/>
+                  <w:tcBorders>
+                    <w:top w:val="single" w:sz="4" w:space="0" w:color="auto"/>
+                    <w:left w:val="single" w:sz="4" w:space="0" w:color="auto"/>
+                    <w:bottom w:val="single" w:sz="4" w:space="0" w:color="auto"/>
+                    <w:right w:val="single" w:sz="4" w:space="0" w:color="auto"/>
+                  </w:tcBorders>
+                  <w:shd w:val="clear" w:color="auto" w:fill="BFBFBF" w:themeFill="background1" w:themeFillShade="BF"/>
+                </w:tcPr>
+                <w:p>
+                  <w:pPr>
+                    <w:spacing w:after="200" w:line="276" w:lineRule="auto"/>
+                    <w:jc w:val="both"/>
+                    <w:rPr>
+                      <w:rFonts w:ascii="Arial" w:hAnsi="Arial" w:cs="Arial"/>
+                      <w:b/>
+                      <w:bCs/>
+                      <w:sz w:val="22"/>
+                      <w:szCs w:val="22"/>
+                    </w:rPr>
+                  </w:pPr>
+                  <w:r>
+                    <w:rPr>
+                      <w:rFonts w:ascii="Arial" w:hAnsi="Arial" w:cs="Arial"/>
+                      <w:b/>
+                      <w:bCs/>
+                      <w:sz w:val="22"/>
+                      <w:szCs w:val="22"/>
+                    </w:rPr>
+                    <w:t>10:00</w:t>
+                  </w:r>
+                </w:p>
+              </w:tc>
+              <w:tc>
+                <w:tcPr>
+                  <w:tcW w:w="767" w:type="dxa"/>
+                  <w:tcBorders>
+                    <w:top w:val="single" w:sz="4" w:space="0" w:color="auto"/>
+                    <w:left w:val="single" w:sz="4" w:space="0" w:color="auto"/>
+                    <w:bottom w:val="single" w:sz="4" w:space="0" w:color="auto"/>
+                    <w:right w:val="single" w:sz="4" w:space="0" w:color="auto"/>
+                  </w:tcBorders>
+                  <w:shd w:val="clear" w:color="auto" w:fill="BFBFBF" w:themeFill="background1" w:themeFillShade="BF"/>
+                </w:tcPr>
+                <w:p>
+                  <w:pPr>
+                    <w:spacing w:after="200" w:line="276" w:lineRule="auto"/>
+                    <w:jc w:val="both"/>
+                    <w:rPr>
+                      <w:rFonts w:ascii="Arial" w:hAnsi="Arial" w:cs="Arial"/>
+                      <w:b/>
+                      <w:bCs/>
+                      <w:sz w:val="22"/>
+                      <w:szCs w:val="22"/>
+                    </w:rPr>
+                  </w:pPr>
+                  <w:r>
+                    <w:rPr>
+                      <w:rFonts w:ascii="Arial" w:hAnsi="Arial" w:cs="Arial"/>
+                      <w:b/>
+                      <w:bCs/>
+                      <w:sz w:val="22"/>
+                      <w:szCs w:val="22"/>
+                    </w:rPr>
+                    <w:t>08/08</w:t>
+                  </w:r>
+                </w:p>
+              </w:tc>
+              <w:tc>
+                <w:tcPr>
+                  <w:tcW w:w="779" w:type="dxa"/>
+                  <w:tcBorders>
+                    <w:top w:val="single" w:sz="4" w:space="0" w:color="auto"/>
+                    <w:left w:val="single" w:sz="4" w:space="0" w:color="auto"/>
+                    <w:bottom w:val="single" w:sz="4" w:space="0" w:color="auto"/>
+                    <w:right w:val="single" w:sz="4" w:space="0" w:color="auto"/>
+                  </w:tcBorders>
+                  <w:shd w:val="clear" w:color="auto" w:fill="BFBFBF" w:themeFill="background1" w:themeFillShade="BF"/>
+                </w:tcPr>
+                <w:p>
+                  <w:pPr>
+                    <w:spacing w:after="200" w:line="276" w:lineRule="auto"/>
+                    <w:jc w:val="both"/>
+                    <w:rPr>
+                      <w:rFonts w:ascii="Arial" w:hAnsi="Arial" w:cs="Arial"/>
+                      <w:b/>
+                      <w:bCs/>
+                      <w:sz w:val="22"/>
+                      <w:szCs w:val="22"/>
+                    </w:rPr>
+                  </w:pPr>
+                  <w:r>
+                    <w:rPr>
+                      <w:rFonts w:ascii="Arial" w:hAnsi="Arial" w:cs="Arial"/>
+                      <w:b/>
+                      <w:bCs/>
+                      <w:sz w:val="22"/>
+                      <w:szCs w:val="22"/>
+                    </w:rPr>
+                    <w:t>22:00</w:t>
+                  </w:r>
+                </w:p>
+              </w:tc>
+            </w:tr>
+            <w:tr>
+              <w:tc>
+                <w:tcPr>
+                  <w:tcW w:w="2576" w:type="dxa"/>
+                  <w:tcBorders>
+                    <w:top w:val="single" w:sz="4" w:space="0" w:color="auto"/>
+                    <w:left w:val="single" w:sz="4" w:space="0" w:color="auto"/>
+                    <w:bottom w:val="single" w:sz="4" w:space="0" w:color="auto"/>
+                    <w:right w:val="single" w:sz="4" w:space="0" w:color="auto"/>
+                  </w:tcBorders>
+                  <w:shd w:val="clear" w:color="auto" w:fill="BFBFBF" w:themeFill="background1" w:themeFillShade="BF"/>
+                  <w:hideMark/>
+                </w:tcPr>
+                <w:p>
+                  <w:pPr>
+                    <w:spacing w:after="200" w:line="276" w:lineRule="auto"/>
+                    <w:jc w:val="both"/>
+                    <w:rPr>
+                      <w:rFonts w:ascii="Arial" w:hAnsi="Arial" w:cs="Arial"/>
+                      <w:b/>
+                      <w:bCs/>
+                      <w:sz w:val="22"/>
+                      <w:szCs w:val="22"/>
+                    </w:rPr>
+                  </w:pPr>
+                  <w:r>
+                    <w:rPr>
+                      <w:rFonts w:ascii="Arial" w:hAnsi="Arial" w:cs="Arial"/>
+                      <w:b/>
+                      <w:bCs/>
+                      <w:sz w:val="22"/>
+                      <w:szCs w:val="22"/>
+                    </w:rPr>
+                    <w:t>Realização</w:t>
+                  </w:r>
+                </w:p>
+              </w:tc>
+              <w:tc>
+                <w:tcPr>
+                  <w:tcW w:w="791" w:type="dxa"/>
+                  <w:tcBorders>
+                    <w:top w:val="single" w:sz="4" w:space="0" w:color="auto"/>
+                    <w:left w:val="single" w:sz="4" w:space="0" w:color="auto"/>
+                    <w:bottom w:val="single" w:sz="4" w:space="0" w:color="auto"/>
+                    <w:right w:val="single" w:sz="4" w:space="0" w:color="auto"/>
+                  </w:tcBorders>
+                  <w:shd w:val="clear" w:color="auto" w:fill="BFBFBF" w:themeFill="background1" w:themeFillShade="BF"/>
+                </w:tcPr>
+                <w:p>
+                  <w:pPr>
+                    <w:spacing w:after="200" w:line="276" w:lineRule="auto"/>
+                    <w:jc w:val="both"/>
+                    <w:rPr>
+                      <w:rFonts w:ascii="Arial" w:hAnsi="Arial" w:cs="Arial"/>
+                      <w:b/>
+                      <w:bCs/>
+                      <w:sz w:val="22"/>
+                      <w:szCs w:val="22"/>
+                    </w:rPr>
+                  </w:pPr>
+                  <w:r>
+                    <w:rPr>
+                      <w:rFonts w:ascii="Arial" w:hAnsi="Arial" w:cs="Arial"/>
+                      <w:b/>
+                      <w:bCs/>
+                      <w:sz w:val="22"/>
+                      <w:szCs w:val="22"/>
+                    </w:rPr>
+                    <w:t>09/08</w:t>
+                  </w:r>
+                </w:p>
+              </w:tc>
+              <w:tc>
+                <w:tcPr>
+                  <w:tcW w:w="791" w:type="dxa"/>
+                  <w:tcBorders>
+                    <w:top w:val="single" w:sz="4" w:space="0" w:color="auto"/>
+                    <w:left w:val="single" w:sz="4" w:space="0" w:color="auto"/>
+                    <w:bottom w:val="single" w:sz="4" w:space="0" w:color="auto"/>
+                    <w:right w:val="single" w:sz="4" w:space="0" w:color="auto"/>
+                  </w:tcBorders>
+                  <w:shd w:val="clear" w:color="auto" w:fill="BFBFBF" w:themeFill="background1" w:themeFillShade="BF"/>
+                </w:tcPr>
+                <w:p>
+                  <w:pPr>
+                    <w:spacing w:after="200" w:line="276" w:lineRule="auto"/>
+                    <w:jc w:val="both"/>
+                    <w:rPr>
+                      <w:rFonts w:ascii="Arial" w:hAnsi="Arial" w:cs="Arial"/>
+                      <w:b/>
+                      <w:bCs/>
+                      <w:sz w:val="22"/>
+                      <w:szCs w:val="22"/>
+                    </w:rPr>
+                  </w:pPr>
+                  <w:r>
+                    <w:rPr>
+                      <w:rFonts w:ascii="Arial" w:hAnsi="Arial" w:cs="Arial"/>
+                      <w:b/>
+                      <w:bCs/>
+                      <w:sz w:val="22"/>
+                      <w:szCs w:val="22"/>
+                    </w:rPr>
+                    <w:t>10:00</w:t>
+                  </w:r>
+                </w:p>
+              </w:tc>
+              <w:tc>
+                <w:tcPr>
+                  <w:tcW w:w="767" w:type="dxa"/>
+                  <w:tcBorders>
+                    <w:top w:val="single" w:sz="4" w:space="0" w:color="auto"/>
+                    <w:left w:val="single" w:sz="4" w:space="0" w:color="auto"/>
+                    <w:bottom w:val="single" w:sz="4" w:space="0" w:color="auto"/>
+                    <w:right w:val="single" w:sz="4" w:space="0" w:color="auto"/>
+                  </w:tcBorders>
+                  <w:shd w:val="clear" w:color="auto" w:fill="BFBFBF" w:themeFill="background1" w:themeFillShade="BF"/>
+                </w:tcPr>
+                <w:p>
+                  <w:pPr>
+                    <w:spacing w:after="200" w:line="276" w:lineRule="auto"/>
+                    <w:jc w:val="both"/>
+                    <w:rPr>
+                      <w:rFonts w:ascii="Arial" w:hAnsi="Arial" w:cs="Arial"/>
+                      <w:b/>
+                      <w:bCs/>
+                      <w:sz w:val="22"/>
+                      <w:szCs w:val="22"/>
+                    </w:rPr>
+                  </w:pPr>
+                  <w:r>
+                    <w:rPr>
+                      <w:rFonts w:ascii="Arial" w:hAnsi="Arial" w:cs="Arial"/>
+                      <w:b/>
+                      <w:bCs/>
+                      <w:sz w:val="22"/>
+                      <w:szCs w:val="22"/>
+                    </w:rPr>
+                    <w:t>09/08</w:t>
+                  </w:r>
+                </w:p>
+              </w:tc>
+              <w:tc>
+                <w:tcPr>
+                  <w:tcW w:w="779" w:type="dxa"/>
+                  <w:tcBorders>
+                    <w:top w:val="single" w:sz="4" w:space="0" w:color="auto"/>
+                    <w:left w:val="single" w:sz="4" w:space="0" w:color="auto"/>
+                    <w:bottom w:val="single" w:sz="4" w:space="0" w:color="auto"/>
+                    <w:right w:val="single" w:sz="4" w:space="0" w:color="auto"/>
+                  </w:tcBorders>
+                  <w:shd w:val="clear" w:color="auto" w:fill="BFBFBF" w:themeFill="background1" w:themeFillShade="BF"/>
+                </w:tcPr>
+                <w:p>
+                  <w:pPr>
+                    <w:spacing w:after="200" w:line="276" w:lineRule="auto"/>
+                    <w:jc w:val="both"/>
+                    <w:rPr>
+                      <w:rFonts w:ascii="Arial" w:hAnsi="Arial" w:cs="Arial"/>
+                      <w:b/>
+                      <w:bCs/>
+                      <w:sz w:val="22"/>
+                      <w:szCs w:val="22"/>
+                    </w:rPr>
+                  </w:pPr>
+                  <w:r>
+                    <w:rPr>
+                      <w:rFonts w:ascii="Arial" w:hAnsi="Arial" w:cs="Arial"/>
+                      <w:b/>
+                      <w:bCs/>
+                      <w:sz w:val="22"/>
+                      <w:szCs w:val="22"/>
+                    </w:rPr>
+                    <w:t>20:00</w:t>
+                  </w:r>
+                </w:p>
+              </w:tc>
+            </w:tr>
+            <w:tr>
+              <w:tc>
+                <w:tcPr>
+                  <w:tcW w:w="2576" w:type="dxa"/>
+                  <w:tcBorders>
+                    <w:top w:val="single" w:sz="4" w:space="0" w:color="auto"/>
+                    <w:left w:val="single" w:sz="4" w:space="0" w:color="auto"/>
+                    <w:bottom w:val="single" w:sz="4" w:space="0" w:color="auto"/>
+                    <w:right w:val="single" w:sz="4" w:space="0" w:color="auto"/>
+                  </w:tcBorders>
+                  <w:hideMark/>
+                </w:tcPr>
+                <w:p>
+                  <w:pPr>
+                    <w:spacing w:after="200" w:line="276" w:lineRule="auto"/>
+                    <w:jc w:val="both"/>
+                    <w:rPr>
+                      <w:rFonts w:ascii="Arial" w:hAnsi="Arial" w:cs="Arial"/>
+                      <w:b/>
+                      <w:bCs/>
+                      <w:sz w:val="22"/>
+                      <w:szCs w:val="22"/>
+                    </w:rPr>
+                  </w:pPr>
+                  <w:r>
+                    <w:rPr>
+                      <w:rFonts w:ascii="Arial" w:hAnsi="Arial" w:cs="Arial"/>
+                      <w:b/>
+                      <w:bCs/>
+                      <w:sz w:val="22"/>
+                      <w:szCs w:val="22"/>
+                    </w:rPr>
+                    <w:t>Desmontagem</w:t>
+                  </w:r>
+                </w:p>
+              </w:tc>
+              <w:tc>
+                <w:tcPr>
+                  <w:tcW w:w="791" w:type="dxa"/>
+                  <w:tcBorders>
+                    <w:top w:val="single" w:sz="4" w:space="0" w:color="auto"/>
+                    <w:left w:val="single" w:sz="4" w:space="0" w:color="auto"/>
+                    <w:bottom w:val="single" w:sz="4" w:space="0" w:color="auto"/>
+                    <w:right w:val="single" w:sz="4" w:space="0" w:color="auto"/>
+                  </w:tcBorders>
+                </w:tcPr>
+                <w:p>
+                  <w:pPr>
+                    <w:spacing w:after="200" w:line="276" w:lineRule="auto"/>
+                    <w:jc w:val="both"/>
+                    <w:rPr>
+                      <w:rFonts w:ascii="Arial" w:hAnsi="Arial" w:cs="Arial"/>
+                      <w:b/>
+                      <w:bCs/>
+                      <w:sz w:val="22"/>
+                      <w:szCs w:val="22"/>
+                    </w:rPr>
+                  </w:pPr>
+                  <w:r>
+                    <w:rPr>
+                      <w:rFonts w:ascii="Arial" w:hAnsi="Arial" w:cs="Arial"/>
+                      <w:b/>
+                      <w:bCs/>
+                      <w:sz w:val="22"/>
+                      <w:szCs w:val="22"/>
+                    </w:rPr>
+                    <w:t>09/08</w:t>
+                  </w:r>
+                </w:p>
+              </w:tc>
+              <w:tc>
+                <w:tcPr>
+                  <w:tcW w:w="791" w:type="dxa"/>
+                  <w:tcBorders>
+                    <w:top w:val="single" w:sz="4" w:space="0" w:color="auto"/>
+                    <w:left w:val="single" w:sz="4" w:space="0" w:color="auto"/>
+                    <w:bottom w:val="single" w:sz="4" w:space="0" w:color="auto"/>
+                    <w:right w:val="single" w:sz="4" w:space="0" w:color="auto"/>
+                  </w:tcBorders>
+                </w:tcPr>
+                <w:p>
+                  <w:pPr>
+                    <w:spacing w:after="200" w:line="276" w:lineRule="auto"/>
+                    <w:jc w:val="both"/>
+                    <w:rPr>
+                      <w:rFonts w:ascii="Arial" w:hAnsi="Arial" w:cs="Arial"/>
+                      <w:b/>
+                      <w:bCs/>
+                      <w:sz w:val="22"/>
+                      <w:szCs w:val="22"/>
+                    </w:rPr>
+                  </w:pPr>
+                  <w:r>
+                    <w:rPr>
+                      <w:rFonts w:ascii="Arial" w:hAnsi="Arial" w:cs="Arial"/>
+                      <w:b/>
+                      <w:bCs/>
+                      <w:sz w:val="22"/>
+                      <w:szCs w:val="22"/>
+                    </w:rPr>
+                    <w:t>21:00</w:t>
+                  </w:r>
+                </w:p>
+              </w:tc>
+              <w:tc>
+                <w:tcPr>
+                  <w:tcW w:w="767" w:type="dxa"/>
+                  <w:tcBorders>
+                    <w:top w:val="single" w:sz="4" w:space="0" w:color="auto"/>
+                    <w:left w:val="single" w:sz="4" w:space="0" w:color="auto"/>
+                    <w:bottom w:val="single" w:sz="4" w:space="0" w:color="auto"/>
+                    <w:right w:val="single" w:sz="4" w:space="0" w:color="auto"/>
+                  </w:tcBorders>
+                </w:tcPr>
+                <w:p>
+                  <w:pPr>
+                    <w:spacing w:after="200" w:line="276" w:lineRule="auto"/>
+                    <w:jc w:val="both"/>
+                    <w:rPr>
+                      <w:rFonts w:ascii="Arial" w:hAnsi="Arial" w:cs="Arial"/>
+                      <w:b/>
+                      <w:bCs/>
+                      <w:sz w:val="22"/>
+                      <w:szCs w:val="22"/>
+                    </w:rPr>
+                  </w:pPr>
+                  <w:r>
+                    <w:rPr>
+                      <w:rFonts w:ascii="Arial" w:hAnsi="Arial" w:cs="Arial"/>
+                      <w:b/>
+                      <w:bCs/>
+                      <w:sz w:val="22"/>
+                      <w:szCs w:val="22"/>
+                    </w:rPr>
+                    <w:t>09/08</w:t>
+                  </w:r>
+                </w:p>
+              </w:tc>
+              <w:tc>
+                <w:tcPr>
+                  <w:tcW w:w="779" w:type="dxa"/>
+                  <w:tcBorders>
+                    <w:top w:val="single" w:sz="4" w:space="0" w:color="auto"/>
+                    <w:left w:val="single" w:sz="4" w:space="0" w:color="auto"/>
+                    <w:bottom w:val="single" w:sz="4" w:space="0" w:color="auto"/>
+                    <w:right w:val="single" w:sz="4" w:space="0" w:color="auto"/>
+                  </w:tcBorders>
+                </w:tcPr>
+                <w:p>
+                  <w:pPr>
+                    <w:spacing w:after="200" w:line="276" w:lineRule="auto"/>
+                    <w:jc w:val="both"/>
+                    <w:rPr>
+                      <w:rFonts w:ascii="Arial" w:hAnsi="Arial" w:cs="Arial"/>
+                      <w:b/>
+                      <w:bCs/>
+                      <w:sz w:val="22"/>
+                      <w:szCs w:val="22"/>
+                    </w:rPr>
+                  </w:pPr>
+                  <w:r>
+                    <w:rPr>
+                      <w:rFonts w:ascii="Arial" w:hAnsi="Arial" w:cs="Arial"/>
+                      <w:b/>
+                      <w:bCs/>
+                      <w:sz w:val="22"/>
+                      <w:szCs w:val="22"/>
+                    </w:rPr>
+                    <w:t>00:00</w:t>
+                  </w:r>
+                </w:p>
+              </w:tc>
+            </w:tr>
+          </w:tbl>
+          <w:p>
+            <w:pPr>
+              <w:spacing w:after="200" w:line="276" w:lineRule="auto"/>
+              <w:jc w:val="both"/>
+              <w:rPr>
+                <w:rFonts w:ascii="Arial" w:hAnsi="Arial" w:cs="Arial"/>
+                <w:b/>
+                <w:bCs/>
+                <w:sz w:val="22"/>
+                <w:szCs w:val="22"/>
+              </w:rPr>
+            </w:pPr>
+          </w:p>
+        </w:tc>
+      </w:tr>
+      <w:tr>
+        <w:trPr>
+          <w:trHeight w:val="628"/>
+          <w:jc w:val="center"/>
+        </w:trPr>
+        <w:tc>
+          <w:tcPr>
+            <w:tcW w:w="3652" w:type="dxa"/>
+            <w:tcBorders>
+              <w:top w:val="single" w:sz="4" w:space="0" w:color="auto"/>
+              <w:left w:val="single" w:sz="4" w:space="0" w:color="auto"/>
+              <w:bottom w:val="single" w:sz="4" w:space="0" w:color="auto"/>
+              <w:right w:val="single" w:sz="4" w:space="0" w:color="auto"/>
+            </w:tcBorders>
+          </w:tcPr>
+          <w:p>
+            <w:pPr>
+              <w:spacing w:after="200" w:line="276" w:lineRule="auto"/>
+              <w:jc w:val="both"/>
+              <w:rPr>
+                <w:rFonts w:ascii="Arial" w:hAnsi="Arial" w:cs="Arial"/>
+                <w:b/>
+                <w:bCs/>
+                <w:sz w:val="22"/>
+                <w:szCs w:val="22"/>
+              </w:rPr>
+            </w:pPr>
+            <w:r>
+              <w:rPr>
+                <w:rFonts w:ascii="Arial" w:hAnsi="Arial" w:cs="Arial"/>
+                <w:b/>
+                <w:bCs/>
+                <w:sz w:val="22"/>
+                <w:szCs w:val="22"/>
+              </w:rPr>
+              <w:t>6. VALOR</w:t>
+            </w:r>
+          </w:p>
+          <w:p>
+            <w:pPr>
+              <w:spacing w:after="200" w:line="276" w:lineRule="auto"/>
+              <w:jc w:val="both"/>
+              <w:rPr>
+                <w:rFonts w:ascii="Arial" w:hAnsi="Arial" w:cs="Arial"/>
+                <w:b/>
+                <w:bCs/>
+                <w:sz w:val="22"/>
+                <w:szCs w:val="22"/>
+              </w:rPr>
+            </w:pPr>
+          </w:p>
+        </w:tc>
+        <w:tc>
+          <w:tcPr>
+            <w:tcW w:w="5387" w:type="dxa"/>
+            <w:tcBorders>
+              <w:top w:val="single" w:sz="4" w:space="0" w:color="auto"/>
+              <w:left w:val="single" w:sz="4" w:space="0" w:color="auto"/>
+              <w:bottom w:val="single" w:sz="4" w:space="0" w:color="auto"/>
+              <w:right w:val="single" w:sz="4" w:space="0" w:color="auto"/>
+            </w:tcBorders>
+            <w:hideMark/>
+          </w:tcPr>
+          <w:p>
+            <w:pPr>
+              <w:spacing w:after="200" w:line="276" w:lineRule="auto"/>
+              <w:jc w:val="both"/>
+              <w:rPr>
+                <w:rFonts w:ascii="Arial" w:hAnsi="Arial" w:cs="Arial"/>
+                <w:b/>
+                <w:bCs/>
+                <w:sz w:val="22"/>
+                <w:szCs w:val="22"/>
+              </w:rPr>
+            </w:pPr>
+            <w:r>
+              <w:rPr>
+                <w:rFonts w:ascii="Arial" w:hAnsi="Arial" w:cs="Arial"/>
+                <w:b/>
+                <w:bCs/>
+              </w:rPr>
+              <w:t>{{</w:t>
+            </w:r>
+            <w:r>
+              <w:rPr>
+                <w:rFonts w:ascii="Arial" w:hAnsi="Arial" w:cs="Arial"/>
+                <w:b/>
+                <w:bCs/>
+              </w:rPr>
+              <w:t>VALORTOTALALUGUELSTAND</w:t>
+            </w:r>
+            <w:r>
+              <w:rPr>
+                <w:rFonts w:ascii="Arial" w:hAnsi="Arial" w:cs="Arial"/>
+                <w:b/>
+                <w:bCs/>
+              </w:rPr>
+              <w:t>}}</w:t>
+            </w:r>
+          </w:p>
+        </w:tc>
+      </w:tr>
+      <w:tr>
+        <w:trPr>
+          <w:jc w:val="center"/>
+        </w:trPr>
+        <w:tc>
+          <w:tcPr>
+            <w:tcW w:w="3652" w:type="dxa"/>
+            <w:tcBorders>
+              <w:top w:val="single" w:sz="4" w:space="0" w:color="auto"/>
+              <w:left w:val="single" w:sz="4" w:space="0" w:color="auto"/>
+              <w:bottom w:val="single" w:sz="4" w:space="0" w:color="auto"/>
+              <w:right w:val="single" w:sz="4" w:space="0" w:color="auto"/>
+            </w:tcBorders>
+          </w:tcPr>
+          <w:p>
+            <w:pPr>
+              <w:spacing w:after="200" w:line="276" w:lineRule="auto"/>
+              <w:jc w:val="both"/>
+              <w:rPr>
+                <w:rFonts w:ascii="Arial" w:hAnsi="Arial" w:cs="Arial"/>
+                <w:b/>
+                <w:bCs/>
+                <w:sz w:val="22"/>
+                <w:szCs w:val="22"/>
+              </w:rPr>
+            </w:pPr>
+            <w:r>
+              <w:rPr>
+                <w:rFonts w:ascii="Arial" w:hAnsi="Arial" w:cs="Arial"/>
+                <w:b/>
+                <w:bCs/>
+                <w:sz w:val="22"/>
+                <w:szCs w:val="22"/>
+              </w:rPr>
+              <w:t>7. CONDIÇÕES DE PAGAMENTO</w:t>
+            </w:r>
+          </w:p>
+          <w:p>
+            <w:pPr>
+              <w:spacing w:after="200" w:line="276" w:lineRule="auto"/>
+              <w:jc w:val="both"/>
+              <w:rPr>
+                <w:rFonts w:ascii="Arial" w:hAnsi="Arial" w:cs="Arial"/>
+                <w:b/>
+                <w:bCs/>
+                <w:sz w:val="22"/>
+                <w:szCs w:val="22"/>
+              </w:rPr>
+            </w:pPr>
+          </w:p>
+        </w:tc>
+        <w:tc>
+          <w:tcPr>
+            <w:tcW w:w="5387" w:type="dxa"/>
+            <w:tcBorders>
+              <w:top w:val="single" w:sz="4" w:space="0" w:color="auto"/>
+              <w:left w:val="single" w:sz="4" w:space="0" w:color="auto"/>
+              <w:bottom w:val="single" w:sz="4" w:space="0" w:color="auto"/>
+              <w:right w:val="single" w:sz="4" w:space="0" w:color="auto"/>
+            </w:tcBorders>
+            <w:hideMark/>
+          </w:tcPr>
+          <w:p>
+            <w:pPr>
+              <w:jc w:val="both"/>
+              <w:rPr>
+                <w:rFonts w:ascii="Arial" w:hAnsi="Arial" w:cs="Arial"/>
+                <w:b/>
+                <w:bCs/>
+              </w:rPr>
+            </w:pPr>
+            <w:r>
+              <w:rPr>
+                <w:rFonts w:ascii="Arial" w:hAnsi="Arial" w:cs="Arial"/>
+                <w:b/>
+                <w:bCs/>
+              </w:rPr>
+              <w:t>O aluguel do espaço deste estande é de {{VALORTOTALALUGUELSTAND}}, ({{VALOREXTENSO}}) que será quitado da seguinte forma:</w:t>
+            </w:r>
+          </w:p>
+          <w:p>
+            <w:pPr>
+              <w:jc w:val="both"/>
+              <w:rPr>
+                <w:rFonts w:ascii="Arial" w:hAnsi="Arial" w:cs="Arial"/>
+                <w:b/>
+                <w:bCs/>
+              </w:rPr>
+            </w:pPr>
+          </w:p>
+          <w:p>
+            <w:pPr>
+              <w:pStyle w:val="PargrafodaLista"/>
+              <w:numPr>
+                <w:ilvl w:val="0"/>
+                <w:numId w:val="7"/>
+              </w:numPr>
+              <w:jc w:val="both"/>
+              <w:rPr>
+                <w:rFonts w:ascii="Arial" w:hAnsi="Arial" w:cs="Arial"/>
+                <w:b/>
+                <w:bCs/>
+              </w:rPr>
+            </w:pPr>
+            <w:r>
+              <w:rPr>
+                <w:rFonts w:ascii="Arial" w:hAnsi="Arial" w:cs="Arial"/>
+                <w:b/>
+                <w:bCs/>
+              </w:rPr>
+              <w:t>Pagamento será à vista via pix com 5% de desconto até o dia {{DATAENTRADA}}</w:t>
+            </w:r>
+          </w:p>
+          <w:p>
+            <w:pPr>
+              <w:pStyle w:val="PargrafodaLista"/>
+              <w:jc w:val="both"/>
+              <w:rPr>
+                <w:rFonts w:ascii="Arial" w:hAnsi="Arial" w:cs="Arial"/>
+                <w:b/>
+                <w:bCs/>
+              </w:rPr>
+            </w:pPr>
+          </w:p>
+          <w:p>
+            <w:pPr>
+              <w:pStyle w:val="PargrafodaLista"/>
+              <w:jc w:val="both"/>
+              <w:rPr>
+                <w:rFonts w:ascii="Arial" w:hAnsi="Arial" w:cs="Arial"/>
+                <w:b/>
+                <w:bCs/>
+              </w:rPr>
+            </w:pPr>
+          </w:p>
+        </w:tc>
+      </w:tr>
+    </w:tbl>
+    <w:p>
+      <w:pPr>
+        <w:jc w:val="both"/>
+        <w:rPr>
+          <w:rFonts w:ascii="Arial" w:hAnsi="Arial" w:cs="Arial"/>
+          <w:b/>
+          <w:bCs/>
+        </w:rPr>
+      </w:pPr>
+    </w:p>
     <w:p>
       <w:pPr>
         <w:spacing w:after="0"/>
@@ -1347,31 +3280,37 @@
         <w:rPr>
           <w:rFonts w:ascii="Arial" w:hAnsi="Arial" w:cs="Arial"/>
         </w:rPr>
-        <w:t xml:space="preserve"> para a montagem e decoração dos espaços, sendo que o organizador não se responsabiliza por eventuais atrasos que possam decorrer de caso fortuito ou força maior ou ainda atrasos derivados por condições do local designado para o evento, reservando-se no direito de alterar o período ora estabelecido não podendo tal situação ser suscitada pelo Expositor para eximir-se de ter apresentar o seu estande pronto na data do evento;</w:t>
-      </w:r>
-    </w:p>
-    <w:p>
-      <w:pPr>
-        <w:spacing w:after="0" w:line="240" w:lineRule="auto"/>
-        <w:jc w:val="both"/>
-        <w:rPr>
-          <w:rFonts w:ascii="Arial" w:hAnsi="Arial" w:cs="Arial"/>
-        </w:rPr>
-      </w:pPr>
-    </w:p>
-    <w:p>
-      <w:pPr>
-        <w:spacing w:after="0" w:line="240" w:lineRule="auto"/>
-        <w:jc w:val="both"/>
-        <w:rPr>
-          <w:rFonts w:ascii="Arial" w:hAnsi="Arial" w:cs="Arial"/>
-        </w:rPr>
-      </w:pPr>
+        <w:t xml:space="preserve"> para a montagem e decoração dos espaços, sendo que o organizador não se responsabiliza por eventuais atrasos que possam decorrer de caso fortuito ou força maior ou ainda atrasos derivados por condições do local designado para o </w:t>
+      </w:r>
       <w:r>
         <w:rPr>
           <w:rFonts w:ascii="Arial" w:hAnsi="Arial" w:cs="Arial"/>
         </w:rPr>
         <w:lastRenderedPageBreak/>
+        <w:t>evento, reservando-se no direito de alterar o período ora estabelecido não podendo tal situação ser suscitada pelo Expositor para eximir-se de ter apresentar o seu estande pronto na data do evento;</w:t>
+      </w:r>
+    </w:p>
+    <w:p>
+      <w:pPr>
+        <w:spacing w:after="0" w:line="240" w:lineRule="auto"/>
+        <w:jc w:val="both"/>
+        <w:rPr>
+          <w:rFonts w:ascii="Arial" w:hAnsi="Arial" w:cs="Arial"/>
+        </w:rPr>
+      </w:pPr>
+    </w:p>
+    <w:p>
+      <w:pPr>
+        <w:spacing w:after="0" w:line="240" w:lineRule="auto"/>
+        <w:jc w:val="both"/>
+        <w:rPr>
+          <w:rFonts w:ascii="Arial" w:hAnsi="Arial" w:cs="Arial"/>
+        </w:rPr>
+      </w:pPr>
+      <w:r>
+        <w:rPr>
+          <w:rFonts w:ascii="Arial" w:hAnsi="Arial" w:cs="Arial"/>
+        </w:rPr>
         <w:t xml:space="preserve">2.2. A desmontagem do espaço pelo Expositor, bem como a remoção dos produtos deverá ser realizada </w:t>
       </w:r>
       <w:r>
@@ -1965,6 +3904,7 @@
         <w:rPr>
           <w:rFonts w:ascii="Arial" w:hAnsi="Arial" w:cs="Arial"/>
         </w:rPr>
+        <w:lastRenderedPageBreak/>
         <w:t>2.8</w:t>
       </w:r>
       <w:r>
@@ -2036,30 +3976,545 @@
         <w:rPr>
           <w:rFonts w:ascii="Arial" w:hAnsi="Arial" w:cs="Arial"/>
         </w:rPr>
-        <w:t xml:space="preserve">. O descumprimento deste prazo </w:t>
+        <w:t>. O descumprimento deste prazo acarretará, automaticamente, a aplicação de multa no valor de R$ 4.000,00 (quatro mil reais) pela primeira hora de atraso, acrescida de R$ 1.000,00 (mil reais) por hora adi</w:t>
+      </w:r>
+      <w:r>
+        <w:rPr>
+          <w:rFonts w:ascii="Arial" w:hAnsi="Arial" w:cs="Arial"/>
+        </w:rPr>
+        <w:t>cional, sem prejuízo da responsabilização por eventuais danos operacionais, logísticos ou financeiros causados ao ORGANIZADOR ou a terceiros. As penalidades serão aplicadas de forma unilateral pelo ORGANIZADOR, sendo irreversíveis e inegociáveis.</w:t>
+      </w:r>
+    </w:p>
+    <w:p>
+      <w:pPr>
+        <w:spacing w:after="0" w:line="240" w:lineRule="auto"/>
+        <w:jc w:val="both"/>
+        <w:rPr>
+          <w:rFonts w:ascii="Arial" w:hAnsi="Arial" w:cs="Arial"/>
+        </w:rPr>
+      </w:pPr>
+    </w:p>
+    <w:p>
+      <w:pPr>
+        <w:spacing w:line="240" w:lineRule="auto"/>
+        <w:jc w:val="both"/>
+        <w:rPr>
+          <w:rFonts w:ascii="Arial" w:hAnsi="Arial" w:cs="Arial"/>
+          <w:b/>
+          <w:bCs/>
+        </w:rPr>
+      </w:pPr>
+      <w:r>
+        <w:rPr>
+          <w:rFonts w:ascii="Arial" w:hAnsi="Arial" w:cs="Arial"/>
+        </w:rPr>
+        <w:t>2.9</w:t>
+      </w:r>
+      <w:r>
+        <w:rPr>
+          <w:rFonts w:ascii="Arial" w:hAnsi="Arial" w:cs="Arial"/>
+        </w:rPr>
+        <w:t xml:space="preserve">. É expressamente vedada a desmontagem do estande antes do encerramento oficial do evento ou a permanência no local após o horário limite de </w:t>
+      </w:r>
+      <w:r>
+        <w:rPr>
+          <w:rFonts w:ascii="Arial" w:hAnsi="Arial" w:cs="Arial"/>
+        </w:rPr>
+        <w:t>2</w:t>
+      </w:r>
+      <w:r>
+        <w:rPr>
+          <w:rFonts w:ascii="Arial" w:hAnsi="Arial" w:cs="Arial"/>
+        </w:rPr>
+        <w:t>1</w:t>
+      </w:r>
+      <w:r>
+        <w:rPr>
+          <w:rFonts w:ascii="Arial" w:hAnsi="Arial" w:cs="Arial"/>
+        </w:rPr>
+        <w:t>h00 (</w:t>
+      </w:r>
+      <w:r>
+        <w:rPr>
+          <w:rFonts w:ascii="Arial" w:hAnsi="Arial" w:cs="Arial"/>
+        </w:rPr>
+        <w:t>vinte</w:t>
+      </w:r>
+      <w:r>
+        <w:rPr>
+          <w:rFonts w:ascii="Arial" w:hAnsi="Arial" w:cs="Arial"/>
+        </w:rPr>
+        <w:t xml:space="preserve"> e uma</w:t>
+      </w:r>
+      <w:r>
+        <w:rPr>
+          <w:rFonts w:ascii="Arial" w:hAnsi="Arial" w:cs="Arial"/>
+        </w:rPr>
+        <w:t xml:space="preserve"> horas</w:t>
+      </w:r>
+      <w:r>
+        <w:rPr>
+          <w:rFonts w:ascii="Arial" w:hAnsi="Arial" w:cs="Arial"/>
+        </w:rPr>
+        <w:t xml:space="preserve">) do </w:t>
+      </w:r>
+      <w:r>
+        <w:rPr>
+          <w:rFonts w:ascii="Arial" w:hAnsi="Arial" w:cs="Arial"/>
+        </w:rPr>
+        <w:t xml:space="preserve">dia </w:t>
+      </w:r>
+      <w:r>
+        <w:rPr>
+          <w:rFonts w:ascii="Arial" w:hAnsi="Arial" w:cs="Arial"/>
+          <w:b/>
+        </w:rPr>
+        <w:t>0</w:t>
+      </w:r>
+      <w:r>
+        <w:rPr>
+          <w:rFonts w:ascii="Arial" w:hAnsi="Arial" w:cs="Arial"/>
+          <w:b/>
+        </w:rPr>
+        <w:t>9</w:t>
+      </w:r>
+      <w:r>
+        <w:rPr>
+          <w:rFonts w:ascii="Arial" w:hAnsi="Arial" w:cs="Arial"/>
+          <w:b/>
+        </w:rPr>
+        <w:t xml:space="preserve"> de </w:t>
+      </w:r>
+      <w:proofErr w:type="gramStart"/>
+      <w:r>
+        <w:rPr>
+          <w:rFonts w:ascii="Arial" w:hAnsi="Arial" w:cs="Arial"/>
+          <w:b/>
+        </w:rPr>
+        <w:t>Agosto</w:t>
+      </w:r>
+      <w:proofErr w:type="gramEnd"/>
+      <w:r>
+        <w:rPr>
+          <w:rFonts w:ascii="Arial" w:hAnsi="Arial" w:cs="Arial"/>
+          <w:b/>
+        </w:rPr>
+        <w:t xml:space="preserve"> de 2026. </w:t>
+      </w:r>
+      <w:r>
+        <w:rPr>
+          <w:rFonts w:ascii="Arial" w:hAnsi="Arial" w:cs="Arial"/>
+        </w:rPr>
+        <w:t xml:space="preserve">O descumprimento desta regra sujeitará o EXPOSITOR à aplicação de multa não compensatória equivalente a </w:t>
+      </w:r>
+      <w:r>
+        <w:rPr>
+          <w:rFonts w:ascii="Arial" w:hAnsi="Arial" w:cs="Arial"/>
+        </w:rPr>
+        <w:t xml:space="preserve">30% (trinta por </w:t>
+      </w:r>
+      <w:r>
+        <w:rPr>
+          <w:rFonts w:ascii="Arial" w:hAnsi="Arial" w:cs="Arial"/>
+        </w:rPr>
+        <w:t>cento)</w:t>
+      </w:r>
+      <w:r>
+        <w:rPr>
+          <w:rFonts w:ascii="Arial" w:hAnsi="Arial" w:cs="Arial"/>
+        </w:rPr>
+        <w:t xml:space="preserve"> </w:t>
+      </w:r>
+      <w:r>
+        <w:rPr>
+          <w:rFonts w:ascii="Arial" w:hAnsi="Arial" w:cs="Arial"/>
+        </w:rPr>
+        <w:t>do valor total pago pelo espaço, a ser cobrada por meio de boleto bancário emitido pelo ORGANIZADOR. Além disso, o EXPOSITOR infrator poderá ser impedido de participar de futuras edições do evento, a exclusivo critério do ORGANIZADOR.</w:t>
+      </w:r>
+      <w:r>
+        <w:br/>
+      </w:r>
+      <w:r>
+        <w:br/>
+      </w:r>
+      <w:r>
+        <w:br/>
+      </w:r>
+      <w:r>
+        <w:rPr>
+          <w:rFonts w:ascii="Arial" w:hAnsi="Arial" w:cs="Arial"/>
+          <w:b/>
+          <w:bCs/>
+        </w:rPr>
+        <w:t>DO CASO FORTUITO E FORÇA MAIOR</w:t>
+      </w:r>
+    </w:p>
+    <w:p>
+      <w:pPr>
+        <w:spacing w:line="240" w:lineRule="auto"/>
+        <w:jc w:val="both"/>
+        <w:rPr>
+          <w:rFonts w:ascii="Arial" w:hAnsi="Arial" w:cs="Arial"/>
+        </w:rPr>
+      </w:pPr>
+      <w:r>
+        <w:rPr>
+          <w:rFonts w:ascii="Arial" w:hAnsi="Arial" w:cs="Arial"/>
+        </w:rPr>
+        <w:t xml:space="preserve">1. </w:t>
+      </w:r>
+      <w:r>
+        <w:rPr>
+          <w:rFonts w:ascii="Arial" w:hAnsi="Arial" w:cs="Arial"/>
+        </w:rPr>
+        <w:t>O</w:t>
+      </w:r>
+      <w:r>
+        <w:rPr>
+          <w:rFonts w:ascii="Arial" w:hAnsi="Arial" w:cs="Arial"/>
+        </w:rPr>
+        <w:t xml:space="preserve"> </w:t>
+      </w:r>
+      <w:r>
+        <w:rPr>
+          <w:rFonts w:ascii="Arial" w:hAnsi="Arial" w:cs="Arial"/>
+          <w:b/>
+        </w:rPr>
+        <w:t>EXAGERADO</w:t>
+      </w:r>
+      <w:r>
+        <w:rPr>
+          <w:rFonts w:ascii="Arial" w:hAnsi="Arial" w:cs="Arial"/>
+        </w:rPr>
+        <w:t xml:space="preserve"> </w:t>
+      </w:r>
+      <w:r>
+        <w:rPr>
+          <w:rFonts w:ascii="Arial" w:hAnsi="Arial" w:cs="Arial"/>
+        </w:rPr>
+        <w:t>não será responsabilizada por atrasos, suspensão, alteração de datas, readequações estruturais ou eventual cancelamento do evento motivado por caso fortuito ou força maior, incluindo, mas não se limitando a: decretos públicos, interdições de acesso, desastres naturais, pandemias, epidemias, greves, crises energéticas, instabilidades no fornecimento de serviços essenciais, falhas de segurança, conflitos civis, vandalismo, terrorismo ou quaisquer outras situações alheias à sua atuação.</w:t>
+      </w:r>
+    </w:p>
+    <w:p>
+      <w:pPr>
+        <w:spacing w:line="240" w:lineRule="auto"/>
+        <w:jc w:val="both"/>
+        <w:rPr>
+          <w:rFonts w:ascii="Arial" w:hAnsi="Arial" w:cs="Arial"/>
+        </w:rPr>
+      </w:pPr>
+      <w:r>
+        <w:rPr>
+          <w:rFonts w:ascii="Arial" w:hAnsi="Arial" w:cs="Arial"/>
+        </w:rPr>
+        <w:t xml:space="preserve">2. Nesses casos, será assegurado ao </w:t>
+      </w:r>
+      <w:r>
+        <w:rPr>
+          <w:rFonts w:ascii="Arial" w:hAnsi="Arial" w:cs="Arial"/>
+          <w:b/>
+        </w:rPr>
+        <w:t>EXPOSITOR</w:t>
+      </w:r>
+      <w:r>
+        <w:rPr>
+          <w:rFonts w:ascii="Arial" w:hAnsi="Arial" w:cs="Arial"/>
+        </w:rPr>
+        <w:t>, exclusivamente, o direito de utilizar eventual crédito correspondente ao valor pago, para participação em edição futura do evento ou evento similar organizado pel</w:t>
+      </w:r>
+      <w:r>
+        <w:rPr>
+          <w:rFonts w:ascii="Arial" w:hAnsi="Arial" w:cs="Arial"/>
+        </w:rPr>
+        <w:t>o</w:t>
+      </w:r>
+      <w:r>
+        <w:rPr>
+          <w:rFonts w:ascii="Arial" w:hAnsi="Arial" w:cs="Arial"/>
+        </w:rPr>
+        <w:t xml:space="preserve"> </w:t>
+      </w:r>
+      <w:r>
+        <w:rPr>
+          <w:rFonts w:ascii="Arial" w:hAnsi="Arial" w:cs="Arial"/>
+          <w:b/>
+        </w:rPr>
+        <w:t>EXAGERADO</w:t>
+      </w:r>
+      <w:r>
+        <w:rPr>
+          <w:rFonts w:ascii="Arial" w:hAnsi="Arial" w:cs="Arial"/>
+        </w:rPr>
+        <w:t>, vedada qualquer restituição em dinheiro.</w:t>
+      </w:r>
+    </w:p>
+    <w:p>
+      <w:pPr>
+        <w:spacing w:line="240" w:lineRule="auto"/>
+        <w:jc w:val="both"/>
+        <w:rPr>
+          <w:rFonts w:ascii="Arial" w:hAnsi="Arial" w:cs="Arial"/>
+        </w:rPr>
+      </w:pPr>
+      <w:r>
+        <w:rPr>
+          <w:rFonts w:ascii="Arial" w:hAnsi="Arial" w:cs="Arial"/>
+        </w:rPr>
+        <w:t xml:space="preserve">3. </w:t>
+      </w:r>
+      <w:r>
+        <w:rPr>
+          <w:rFonts w:ascii="Arial" w:hAnsi="Arial" w:cs="Arial"/>
+        </w:rPr>
+        <w:t>O</w:t>
+      </w:r>
+      <w:r>
+        <w:rPr>
+          <w:rFonts w:ascii="Arial" w:hAnsi="Arial" w:cs="Arial"/>
+        </w:rPr>
+        <w:t xml:space="preserve"> </w:t>
+      </w:r>
+      <w:r>
+        <w:rPr>
+          <w:rFonts w:ascii="Arial" w:hAnsi="Arial" w:cs="Arial"/>
+          <w:b/>
+        </w:rPr>
+        <w:t>EXAGERADO</w:t>
+      </w:r>
+      <w:r>
+        <w:rPr>
+          <w:rFonts w:ascii="Arial" w:hAnsi="Arial" w:cs="Arial"/>
+        </w:rPr>
+        <w:t xml:space="preserve"> </w:t>
+      </w:r>
+      <w:r>
+        <w:rPr>
+          <w:rFonts w:ascii="Arial" w:hAnsi="Arial" w:cs="Arial"/>
+        </w:rPr>
+        <w:t xml:space="preserve">poderá, ainda, ajustar as condições logísticas do evento para atender a determinações legais ou operacionais decorrentes da situação de força maior, inclusive com alteração de datas, horários ou formato (presencial, híbrido ou digital), sem que isso gere qualquer obrigação de ressarcimento ao </w:t>
+      </w:r>
+      <w:r>
+        <w:rPr>
+          <w:rFonts w:ascii="Arial" w:hAnsi="Arial" w:cs="Arial"/>
+          <w:b/>
+        </w:rPr>
+        <w:t>EXPOSITOR</w:t>
+      </w:r>
+      <w:r>
+        <w:rPr>
+          <w:rFonts w:ascii="Arial" w:hAnsi="Arial" w:cs="Arial"/>
+        </w:rPr>
+        <w:t>.</w:t>
+      </w:r>
+    </w:p>
+    <w:p>
+      <w:pPr>
+        <w:spacing w:after="0" w:line="240" w:lineRule="auto"/>
+        <w:jc w:val="both"/>
+        <w:rPr>
+          <w:rFonts w:ascii="Arial" w:hAnsi="Arial" w:cs="Arial"/>
+        </w:rPr>
+      </w:pPr>
+    </w:p>
+    <w:p>
+      <w:pPr>
+        <w:spacing w:after="0" w:line="240" w:lineRule="auto"/>
+        <w:jc w:val="both"/>
+        <w:rPr>
+          <w:rFonts w:ascii="Arial" w:hAnsi="Arial" w:cs="Arial"/>
+          <w:b/>
+        </w:rPr>
+      </w:pPr>
+      <w:r>
+        <w:rPr>
+          <w:rFonts w:ascii="Arial" w:hAnsi="Arial" w:cs="Arial"/>
+          <w:b/>
+        </w:rPr>
+        <w:t>CLÁUSULA 3ª – DAS OBRIGAÇÕES CONCERNENTES À ORGANIZAÇÃO DO EVENTO</w:t>
+      </w:r>
+    </w:p>
+    <w:p>
+      <w:pPr>
+        <w:spacing w:after="0" w:line="240" w:lineRule="auto"/>
+        <w:jc w:val="both"/>
+        <w:rPr>
+          <w:rFonts w:ascii="Arial" w:hAnsi="Arial" w:cs="Arial"/>
+          <w:b/>
+        </w:rPr>
+      </w:pPr>
+    </w:p>
+    <w:p>
+      <w:pPr>
+        <w:spacing w:after="0" w:line="240" w:lineRule="auto"/>
+        <w:jc w:val="both"/>
+        <w:rPr>
+          <w:rFonts w:ascii="Arial" w:hAnsi="Arial" w:cs="Arial"/>
+        </w:rPr>
+      </w:pPr>
+      <w:r>
+        <w:rPr>
+          <w:rFonts w:ascii="Arial" w:hAnsi="Arial" w:cs="Arial"/>
+        </w:rPr>
+        <w:t>3.1. Colocar à</w:t>
+      </w:r>
+      <w:r>
+        <w:rPr>
+          <w:rFonts w:ascii="Arial" w:hAnsi="Arial" w:cs="Arial"/>
+        </w:rPr>
+        <w:t xml:space="preserve"> disposição do EXPOSITOR durante o período de realização, a área cedida ao mesmo, e conforme especificada em contrato de participação, observando-se o item 3.5</w:t>
+      </w:r>
+      <w:r>
+        <w:rPr>
+          <w:rFonts w:ascii="Arial" w:hAnsi="Arial" w:cs="Arial"/>
+        </w:rPr>
+        <w:t>.</w:t>
+      </w:r>
+    </w:p>
+    <w:p>
+      <w:pPr>
+        <w:spacing w:after="0" w:line="240" w:lineRule="auto"/>
+        <w:jc w:val="both"/>
+        <w:rPr>
+          <w:rFonts w:ascii="Arial" w:hAnsi="Arial" w:cs="Arial"/>
+        </w:rPr>
+      </w:pPr>
+    </w:p>
+    <w:p>
+      <w:pPr>
+        <w:spacing w:after="0" w:line="240" w:lineRule="auto"/>
+        <w:jc w:val="both"/>
+        <w:rPr>
+          <w:rFonts w:ascii="Arial" w:hAnsi="Arial" w:cs="Arial"/>
+        </w:rPr>
+      </w:pPr>
+      <w:r>
+        <w:rPr>
+          <w:rFonts w:ascii="Arial" w:hAnsi="Arial" w:cs="Arial"/>
+        </w:rPr>
+        <w:t>3.2</w:t>
+      </w:r>
+      <w:r>
+        <w:rPr>
+          <w:rFonts w:ascii="Arial" w:hAnsi="Arial" w:cs="Arial"/>
+        </w:rPr>
+        <w:t>.</w:t>
+      </w:r>
+      <w:r>
+        <w:rPr>
+          <w:rFonts w:ascii="Arial" w:hAnsi="Arial" w:cs="Arial"/>
+        </w:rPr>
+        <w:t xml:space="preserve"> Coordenar e manter a área em condições de funcionamento, observando-se o item 3.5.</w:t>
+      </w:r>
+    </w:p>
+    <w:p>
+      <w:pPr>
+        <w:spacing w:after="0" w:line="240" w:lineRule="auto"/>
+        <w:jc w:val="both"/>
+        <w:rPr>
+          <w:rFonts w:ascii="Arial" w:hAnsi="Arial" w:cs="Arial"/>
+        </w:rPr>
+      </w:pPr>
+    </w:p>
+    <w:p>
+      <w:pPr>
+        <w:spacing w:line="240" w:lineRule="auto"/>
+        <w:jc w:val="both"/>
+        <w:rPr>
+          <w:rFonts w:ascii="Arial" w:hAnsi="Arial" w:cs="Arial"/>
+        </w:rPr>
+      </w:pPr>
+      <w:r>
+        <w:rPr>
+          <w:rFonts w:ascii="Arial" w:hAnsi="Arial" w:cs="Arial"/>
+        </w:rPr>
+        <w:t>3.3</w:t>
+      </w:r>
+      <w:r>
+        <w:rPr>
+          <w:rFonts w:ascii="Arial" w:hAnsi="Arial" w:cs="Arial"/>
+        </w:rPr>
+        <w:t>.</w:t>
+      </w:r>
+      <w:r>
+        <w:rPr>
+          <w:rFonts w:ascii="Arial" w:hAnsi="Arial" w:cs="Arial"/>
+        </w:rPr>
+        <w:t xml:space="preserve"> Promover o EVENTO e gerir a manutenção e harmonia e integridade dos EXPOSITORES e público em geral, nas áreas comuns, não se responsabilizando, todavia, por perdas e danos dos produtos ou materiais dos EXPOSITORES, ou por atos destes empregados, contratados ou subcontratados, ou decorrentes de atos praticados por consumidores, público em geral, no interior de sua área. Esta obrigação não implica, ainda, em responsabilidade por roubos e desaparecimento de mercadorias e pertences nas lojas ou em seus estoques extras, sendo de responsabilidade de todos os EXPOSITORES sempre ter em boa guarda as mercadorias em exposição e a serem comercializadas.</w:t>
+      </w:r>
+    </w:p>
+    <w:p>
+      <w:pPr>
+        <w:jc w:val="both"/>
+        <w:rPr>
+          <w:rFonts w:ascii="Arial" w:hAnsi="Arial" w:cs="Arial"/>
+          <w:b/>
+          <w:color w:val="FF0000"/>
+        </w:rPr>
+      </w:pPr>
+      <w:r>
+        <w:rPr>
+          <w:rFonts w:ascii="Arial" w:hAnsi="Arial" w:cs="Arial"/>
+        </w:rPr>
+        <w:t>3.4</w:t>
+      </w:r>
+      <w:r>
+        <w:rPr>
+          <w:rFonts w:ascii="Arial" w:hAnsi="Arial" w:cs="Arial"/>
+        </w:rPr>
+        <w:t xml:space="preserve">. </w:t>
+      </w:r>
+      <w:r>
+        <w:rPr>
+          <w:rFonts w:ascii="Arial" w:hAnsi="Arial" w:cs="Arial"/>
+        </w:rPr>
+        <w:t>Produzir crachá ou outro material de identificação necessário à realização e segurança do EVENTO.</w:t>
+      </w:r>
+    </w:p>
+    <w:p>
+      <w:pPr>
+        <w:spacing w:line="240" w:lineRule="auto"/>
+        <w:jc w:val="both"/>
+        <w:rPr>
+          <w:rFonts w:ascii="Arial" w:hAnsi="Arial" w:cs="Arial"/>
+        </w:rPr>
+      </w:pPr>
+      <w:r>
+        <w:rPr>
+          <w:rFonts w:ascii="Arial" w:hAnsi="Arial" w:cs="Arial"/>
+        </w:rPr>
+        <w:t>3.5</w:t>
+      </w:r>
+      <w:r>
+        <w:rPr>
+          <w:rFonts w:ascii="Arial" w:hAnsi="Arial" w:cs="Arial"/>
+        </w:rPr>
+        <w:t xml:space="preserve">. </w:t>
+      </w:r>
+      <w:r>
+        <w:rPr>
+          <w:rFonts w:ascii="Arial" w:hAnsi="Arial" w:cs="Arial"/>
+        </w:rPr>
+        <w:t xml:space="preserve">O </w:t>
+      </w:r>
+      <w:r>
+        <w:rPr>
+          <w:rFonts w:ascii="Arial" w:hAnsi="Arial" w:cs="Arial"/>
+        </w:rPr>
+        <w:t>ORGANIZADOR</w:t>
+      </w:r>
+      <w:r>
+        <w:rPr>
+          <w:rFonts w:ascii="Arial" w:hAnsi="Arial" w:cs="Arial"/>
+        </w:rPr>
+        <w:t xml:space="preserve"> não se responsabiliza por fenômenos da natureza, paralisações que possam ocorrer e prejudicar a estrutura física e o funcionamento do evento, do local e de suas vendas, assim como </w:t>
       </w:r>
       <w:r>
         <w:rPr>
           <w:rFonts w:ascii="Arial" w:hAnsi="Arial" w:cs="Arial"/>
         </w:rPr>
         <w:lastRenderedPageBreak/>
-        <w:t>acarretará, automaticamente, a aplicação de multa no valor de R$ 4.000,00 (quatro mil reais) pela primeira hora de atraso, acrescida de R$ 1.000,00 (mil reais) por hora adi</w:t>
-      </w:r>
-      <w:r>
-        <w:rPr>
-          <w:rFonts w:ascii="Arial" w:hAnsi="Arial" w:cs="Arial"/>
-        </w:rPr>
-        <w:t>cional, sem prejuízo da responsabilização por eventuais danos operacionais, logísticos ou financeiros causados ao ORGANIZADOR ou a terceiros. As penalidades serão aplicadas de forma unilateral pelo ORGANIZADOR, sendo irreversíveis e inegociáveis.</w:t>
-      </w:r>
-    </w:p>
-    <w:p>
-      <w:pPr>
-        <w:spacing w:after="0" w:line="240" w:lineRule="auto"/>
-        <w:jc w:val="both"/>
-        <w:rPr>
-          <w:rFonts w:ascii="Arial" w:hAnsi="Arial" w:cs="Arial"/>
-        </w:rPr>
-      </w:pPr>
+        <w:t xml:space="preserve">a legitimidade dos produtos dos lojistas e a permissão das fábricas dos produtos que serão comercializados pelo EXPOSITOR. </w:t>
+      </w:r>
     </w:p>
     <w:p>
       <w:pPr>
@@ -2067,153 +4522,150 @@
         <w:jc w:val="both"/>
         <w:rPr>
           <w:rFonts w:ascii="Arial" w:hAnsi="Arial" w:cs="Arial"/>
-          <w:b/>
-          <w:bCs/>
-        </w:rPr>
-      </w:pPr>
-      <w:r>
-        <w:rPr>
-          <w:rFonts w:ascii="Arial" w:hAnsi="Arial" w:cs="Arial"/>
-        </w:rPr>
-        <w:t>2.9</w:t>
-      </w:r>
-      <w:r>
-        <w:rPr>
-          <w:rFonts w:ascii="Arial" w:hAnsi="Arial" w:cs="Arial"/>
-        </w:rPr>
-        <w:t xml:space="preserve">. É expressamente vedada a desmontagem do estande antes do encerramento oficial do evento ou a permanência no local após o horário limite de </w:t>
-      </w:r>
-      <w:r>
-        <w:rPr>
-          <w:rFonts w:ascii="Arial" w:hAnsi="Arial" w:cs="Arial"/>
-        </w:rPr>
-        <w:t>2</w:t>
-      </w:r>
-      <w:r>
-        <w:rPr>
-          <w:rFonts w:ascii="Arial" w:hAnsi="Arial" w:cs="Arial"/>
-        </w:rPr>
-        <w:t>1</w:t>
-      </w:r>
-      <w:r>
-        <w:rPr>
-          <w:rFonts w:ascii="Arial" w:hAnsi="Arial" w:cs="Arial"/>
-        </w:rPr>
-        <w:t>h00 (</w:t>
-      </w:r>
-      <w:r>
-        <w:rPr>
-          <w:rFonts w:ascii="Arial" w:hAnsi="Arial" w:cs="Arial"/>
-        </w:rPr>
-        <w:t>vinte</w:t>
-      </w:r>
-      <w:r>
-        <w:rPr>
-          <w:rFonts w:ascii="Arial" w:hAnsi="Arial" w:cs="Arial"/>
-        </w:rPr>
-        <w:t xml:space="preserve"> e uma</w:t>
-      </w:r>
-      <w:r>
-        <w:rPr>
-          <w:rFonts w:ascii="Arial" w:hAnsi="Arial" w:cs="Arial"/>
-        </w:rPr>
-        <w:t xml:space="preserve"> horas</w:t>
-      </w:r>
-      <w:r>
-        <w:rPr>
-          <w:rFonts w:ascii="Arial" w:hAnsi="Arial" w:cs="Arial"/>
-        </w:rPr>
-        <w:t xml:space="preserve">) do </w:t>
-      </w:r>
-      <w:r>
-        <w:rPr>
-          <w:rFonts w:ascii="Arial" w:hAnsi="Arial" w:cs="Arial"/>
-        </w:rPr>
-        <w:t xml:space="preserve">dia </w:t>
-      </w:r>
-      <w:r>
-        <w:rPr>
-          <w:rFonts w:ascii="Arial" w:hAnsi="Arial" w:cs="Arial"/>
-          <w:b/>
-        </w:rPr>
-        <w:t>0</w:t>
-      </w:r>
-      <w:r>
-        <w:rPr>
-          <w:rFonts w:ascii="Arial" w:hAnsi="Arial" w:cs="Arial"/>
-          <w:b/>
-        </w:rPr>
-        <w:t>9</w:t>
-      </w:r>
-      <w:r>
-        <w:rPr>
-          <w:rFonts w:ascii="Arial" w:hAnsi="Arial" w:cs="Arial"/>
-          <w:b/>
-        </w:rPr>
-        <w:t xml:space="preserve"> de </w:t>
-      </w:r>
-      <w:proofErr w:type="gramStart"/>
-      <w:r>
-        <w:rPr>
-          <w:rFonts w:ascii="Arial" w:hAnsi="Arial" w:cs="Arial"/>
-          <w:b/>
-        </w:rPr>
-        <w:t>Agosto</w:t>
-      </w:r>
-      <w:proofErr w:type="gramEnd"/>
-      <w:r>
-        <w:rPr>
-          <w:rFonts w:ascii="Arial" w:hAnsi="Arial" w:cs="Arial"/>
-          <w:b/>
-        </w:rPr>
-        <w:t xml:space="preserve"> de 2026. </w:t>
-      </w:r>
-      <w:r>
-        <w:rPr>
-          <w:rFonts w:ascii="Arial" w:hAnsi="Arial" w:cs="Arial"/>
-        </w:rPr>
-        <w:t xml:space="preserve">O descumprimento desta regra sujeitará o EXPOSITOR à aplicação de multa não compensatória equivalente a </w:t>
-      </w:r>
-      <w:r>
-        <w:rPr>
-          <w:rFonts w:ascii="Arial" w:hAnsi="Arial" w:cs="Arial"/>
-        </w:rPr>
-        <w:t xml:space="preserve">30% (trinta por </w:t>
-      </w:r>
-      <w:r>
-        <w:rPr>
-          <w:rFonts w:ascii="Arial" w:hAnsi="Arial" w:cs="Arial"/>
-        </w:rPr>
-        <w:t>cento)</w:t>
-      </w:r>
+        </w:rPr>
+      </w:pPr>
+      <w:r>
+        <w:rPr>
+          <w:rFonts w:ascii="Arial" w:hAnsi="Arial" w:cs="Arial"/>
+        </w:rPr>
+        <w:t>3.6</w:t>
+      </w:r>
+      <w:r>
+        <w:rPr>
+          <w:rFonts w:ascii="Arial" w:hAnsi="Arial" w:cs="Arial"/>
+        </w:rPr>
+        <w:t>.</w:t>
+      </w:r>
+      <w:r>
+        <w:rPr>
+          <w:rFonts w:ascii="Arial" w:hAnsi="Arial" w:cs="Arial"/>
+        </w:rPr>
+        <w:t xml:space="preserve"> O Expositor se responsabiliza por todo e qualquer dano praticado em razão da não legitimidade ou da contestação pela fábrica e ou consumidores dos produtos comercializados no evento.</w:t>
+      </w:r>
+    </w:p>
+    <w:p>
+      <w:pPr>
+        <w:spacing w:after="0" w:line="240" w:lineRule="auto"/>
+        <w:jc w:val="both"/>
+        <w:rPr>
+          <w:rFonts w:ascii="Arial" w:hAnsi="Arial" w:cs="Arial"/>
+        </w:rPr>
+      </w:pPr>
+      <w:r>
+        <w:rPr>
+          <w:rFonts w:ascii="Arial" w:hAnsi="Arial" w:cs="Arial"/>
+        </w:rPr>
+        <w:t>3.7</w:t>
+      </w:r>
+      <w:r>
+        <w:rPr>
+          <w:rFonts w:ascii="Arial" w:hAnsi="Arial" w:cs="Arial"/>
+        </w:rPr>
+        <w:t xml:space="preserve">. </w:t>
+      </w:r>
+      <w:r>
+        <w:rPr>
+          <w:rFonts w:ascii="Arial" w:hAnsi="Arial" w:cs="Arial"/>
+        </w:rPr>
+        <w:t>O Organizador não se responsabiliza por quaisquer danos, de que natureza forem, em razão de caso fortuito, força maior ou ainda por atos derivados de quaisquer poderes da administração pública, inclusive decisões judiciais que reduzam ou inviabilizem o evento ou porventura tragam qualquer prejuízo aos Expositores.</w:t>
+      </w:r>
+    </w:p>
+    <w:p>
+      <w:pPr>
+        <w:spacing w:after="0" w:line="240" w:lineRule="auto"/>
+        <w:jc w:val="both"/>
+        <w:rPr>
+          <w:rFonts w:ascii="Arial" w:hAnsi="Arial" w:cs="Arial"/>
+        </w:rPr>
+      </w:pPr>
       <w:r>
         <w:rPr>
           <w:rFonts w:ascii="Arial" w:hAnsi="Arial" w:cs="Arial"/>
         </w:rPr>
         <w:t xml:space="preserve"> </w:t>
       </w:r>
-      <w:r>
-        <w:rPr>
-          <w:rFonts w:ascii="Arial" w:hAnsi="Arial" w:cs="Arial"/>
-        </w:rPr>
-        <w:t>do valor total pago pelo espaço, a ser cobrada por meio de boleto bancário emitido pelo ORGANIZADOR. Além disso, o EXPOSITOR infrator poderá ser impedido de participar de futuras edições do evento, a exclusivo critério do ORGANIZADOR.</w:t>
-      </w:r>
-      <w:r>
-        <w:br/>
-      </w:r>
-      <w:r>
-        <w:br/>
-      </w:r>
-      <w:r>
-        <w:br/>
-      </w:r>
-      <w:r>
-        <w:rPr>
-          <w:rFonts w:ascii="Arial" w:hAnsi="Arial" w:cs="Arial"/>
-          <w:b/>
-          <w:bCs/>
-        </w:rPr>
-        <w:t>DO CASO FORTUITO E FORÇA MAIOR</w:t>
+    </w:p>
+    <w:p>
+      <w:pPr>
+        <w:spacing w:after="0" w:line="240" w:lineRule="auto"/>
+        <w:jc w:val="both"/>
+        <w:rPr>
+          <w:rFonts w:ascii="Arial" w:hAnsi="Arial" w:cs="Arial"/>
+          <w:b/>
+        </w:rPr>
+      </w:pPr>
+      <w:r>
+        <w:rPr>
+          <w:rFonts w:ascii="Arial" w:hAnsi="Arial" w:cs="Arial"/>
+          <w:b/>
+        </w:rPr>
+        <w:t xml:space="preserve">CLÁUSULA 4º - </w:t>
+      </w:r>
+      <w:r>
+        <w:rPr>
+          <w:rFonts w:ascii="Arial" w:hAnsi="Arial" w:cs="Arial"/>
+          <w:b/>
+        </w:rPr>
+        <w:t xml:space="preserve">DAS OBRIGAÇÕES </w:t>
+      </w:r>
+      <w:r>
+        <w:rPr>
+          <w:rFonts w:ascii="Arial" w:hAnsi="Arial" w:cs="Arial"/>
+          <w:b/>
+        </w:rPr>
+        <w:t>DO EXPOSITOR</w:t>
+      </w:r>
+    </w:p>
+    <w:p>
+      <w:pPr>
+        <w:spacing w:after="0" w:line="240" w:lineRule="auto"/>
+        <w:jc w:val="both"/>
+        <w:rPr>
+          <w:rFonts w:ascii="Arial" w:hAnsi="Arial" w:cs="Arial"/>
+          <w:b/>
+        </w:rPr>
+      </w:pPr>
+    </w:p>
+    <w:p>
+      <w:pPr>
+        <w:spacing w:after="0" w:line="240" w:lineRule="auto"/>
+        <w:jc w:val="both"/>
+        <w:rPr>
+          <w:rFonts w:ascii="Arial" w:hAnsi="Arial" w:cs="Arial"/>
+        </w:rPr>
+      </w:pPr>
+      <w:r>
+        <w:rPr>
+          <w:rFonts w:ascii="Arial" w:hAnsi="Arial" w:cs="Arial"/>
+        </w:rPr>
+        <w:t>4.1</w:t>
+      </w:r>
+      <w:r>
+        <w:rPr>
+          <w:rFonts w:ascii="Arial" w:hAnsi="Arial" w:cs="Arial"/>
+        </w:rPr>
+        <w:t xml:space="preserve">. </w:t>
+      </w:r>
+      <w:r>
+        <w:rPr>
+          <w:rFonts w:ascii="Arial" w:hAnsi="Arial" w:cs="Arial"/>
+        </w:rPr>
+        <w:t>Ser responsável pelo controle e armazenagem de todo o material e produtos utilizados antes e durante o evento. A ORGANIZAÇÃO não se responsabiliza pelo controle de entrada e saída de peças dos expositores.</w:t>
+      </w:r>
+    </w:p>
+    <w:p>
+      <w:pPr>
+        <w:spacing w:after="0" w:line="240" w:lineRule="auto"/>
+        <w:jc w:val="both"/>
+        <w:rPr>
+          <w:rFonts w:ascii="Arial" w:hAnsi="Arial" w:cs="Arial"/>
+        </w:rPr>
+      </w:pPr>
+      <w:r>
+        <w:rPr>
+          <w:rFonts w:ascii="Arial" w:hAnsi="Arial" w:cs="Arial"/>
+        </w:rPr>
+        <w:t xml:space="preserve"> </w:t>
       </w:r>
     </w:p>
     <w:p>
@@ -2228,26 +4680,39 @@
         <w:rPr>
           <w:rFonts w:ascii="Arial" w:hAnsi="Arial" w:cs="Arial"/>
         </w:rPr>
-        <w:t xml:space="preserve">1. </w:t>
-      </w:r>
-      <w:r>
-        <w:rPr>
-          <w:rFonts w:ascii="Arial" w:hAnsi="Arial" w:cs="Arial"/>
-        </w:rPr>
-        <w:t>O</w:t>
-      </w:r>
-      <w:r>
-        <w:rPr>
-          <w:rFonts w:ascii="Arial" w:hAnsi="Arial" w:cs="Arial"/>
+        <w:t>4.2</w:t>
+      </w:r>
+      <w:r>
+        <w:rPr>
+          <w:rFonts w:ascii="Arial" w:hAnsi="Arial" w:cs="Arial"/>
+        </w:rPr>
+        <w:t>.</w:t>
+      </w:r>
+      <w:r>
+        <w:rPr>
+          <w:rFonts w:ascii="Arial" w:hAnsi="Arial" w:cs="Arial"/>
+        </w:rPr>
+        <w:t xml:space="preserve"> Manter em seu espaço, durante o horário de funcionamento do evento, pessoal qualificado e capacitado para atender o público visitante,</w:t>
+      </w:r>
+      <w:r>
+        <w:rPr>
+          <w:rFonts w:ascii="Arial" w:hAnsi="Arial" w:cs="Arial"/>
+          <w:b/>
+          <w:color w:val="FF0000"/>
         </w:rPr>
         <w:t xml:space="preserve"> </w:t>
       </w:r>
       <w:r>
         <w:rPr>
           <w:rFonts w:ascii="Arial" w:hAnsi="Arial" w:cs="Arial"/>
-          <w:b/>
-        </w:rPr>
-        <w:t>EXAGERADO</w:t>
+        </w:rPr>
+        <w:t>só utilizando o espaço externo ou áreas comuns para promoções ou divulgações mediante autorização prévia e expressa do ORGANIZADOR, não praticando abordagem direta nessas áreas e não utilizando recursos sonoros ou visuais em níveis que possam comprometer a harmonia e bom andamento do EVENTO.  O ORGANIZADOR, caso verifique a ocorrência de qualquer das irregularidades aqui relacionadas, poderá adotar as medidas que entender necessárias a cessar a irregularidade, inclusive, notificar e multar</w:t>
+      </w:r>
+      <w:r>
+        <w:rPr>
+          <w:rFonts w:ascii="Arial" w:hAnsi="Arial" w:cs="Arial"/>
+        </w:rPr>
+        <w:t>,</w:t>
       </w:r>
       <w:r>
         <w:rPr>
@@ -2259,41 +4724,160 @@
         <w:rPr>
           <w:rFonts w:ascii="Arial" w:hAnsi="Arial" w:cs="Arial"/>
         </w:rPr>
-        <w:t>não será responsabilizada por atrasos, suspensão, alteração de datas, readequações estruturais ou eventual cancelamento do evento motivado por caso fortuito ou força maior, incluindo, mas não se limitando a: decretos públicos, interdições de acesso, desastres naturais, pandemias, epidemias, greves, crises energéticas, instabilidades no fornecimento de serviços essenciais, falhas de segurança, conflitos civis, vandalismo, terrorismo ou quaisquer outras situações alheias à sua atuação.</w:t>
-      </w:r>
-    </w:p>
-    <w:p>
-      <w:pPr>
-        <w:spacing w:line="240" w:lineRule="auto"/>
-        <w:jc w:val="both"/>
-        <w:rPr>
-          <w:rFonts w:ascii="Arial" w:hAnsi="Arial" w:cs="Arial"/>
-        </w:rPr>
-      </w:pPr>
-      <w:r>
-        <w:rPr>
-          <w:rFonts w:ascii="Arial" w:hAnsi="Arial" w:cs="Arial"/>
-        </w:rPr>
-        <w:t xml:space="preserve">2. Nesses casos, será assegurado ao </w:t>
-      </w:r>
-      <w:r>
-        <w:rPr>
-          <w:rFonts w:ascii="Arial" w:hAnsi="Arial" w:cs="Arial"/>
-          <w:b/>
-        </w:rPr>
-        <w:t>EXPOSITOR</w:t>
-      </w:r>
-      <w:r>
-        <w:rPr>
-          <w:rFonts w:ascii="Arial" w:hAnsi="Arial" w:cs="Arial"/>
-        </w:rPr>
-        <w:t>, exclusivamente, o direito de utilizar eventual crédito correspondente ao valor pago, para participação em edição futura do evento ou evento similar organizado pel</w:t>
-      </w:r>
-      <w:r>
-        <w:rPr>
-          <w:rFonts w:ascii="Arial" w:hAnsi="Arial" w:cs="Arial"/>
-        </w:rPr>
-        <w:t>o</w:t>
+        <w:t>de forma não compensatória</w:t>
+      </w:r>
+      <w:r>
+        <w:rPr>
+          <w:rFonts w:ascii="Arial" w:hAnsi="Arial" w:cs="Arial"/>
+        </w:rPr>
+        <w:t xml:space="preserve"> o EXPOSITOR em valor equivalente a </w:t>
+      </w:r>
+      <w:r>
+        <w:rPr>
+          <w:rFonts w:ascii="Arial" w:hAnsi="Arial" w:cs="Arial"/>
+        </w:rPr>
+        <w:t>{{</w:t>
+      </w:r>
+      <w:r>
+        <w:rPr>
+          <w:rFonts w:ascii="Arial" w:hAnsi="Arial" w:cs="Arial"/>
+        </w:rPr>
+        <w:t>PENALIDADEIRREGULARIDADE</w:t>
+      </w:r>
+      <w:r>
+        <w:rPr>
+          <w:rFonts w:ascii="Arial" w:hAnsi="Arial" w:cs="Arial"/>
+        </w:rPr>
+        <w:t>}}</w:t>
+      </w:r>
+      <w:r>
+        <w:rPr>
+          <w:rFonts w:ascii="Arial" w:hAnsi="Arial" w:cs="Arial"/>
+        </w:rPr>
+        <w:t>.  Eventual reincidência do EXPOSITOR no cometimento da infração ensejará ao ORGANIZADOR a possibilidade de rescisão deste contrato, sem prejuízo da cumulação das multas.</w:t>
+      </w:r>
+    </w:p>
+    <w:p>
+      <w:pPr>
+        <w:spacing w:after="0" w:line="240" w:lineRule="auto"/>
+        <w:jc w:val="both"/>
+        <w:rPr>
+          <w:rFonts w:ascii="Arial" w:hAnsi="Arial" w:cs="Arial"/>
+        </w:rPr>
+      </w:pPr>
+      <w:r>
+        <w:rPr>
+          <w:rFonts w:ascii="Arial" w:hAnsi="Arial" w:cs="Arial"/>
+        </w:rPr>
+        <w:t xml:space="preserve">4.3. </w:t>
+      </w:r>
+      <w:r>
+        <w:rPr>
+          <w:rFonts w:ascii="Arial" w:hAnsi="Arial" w:cs="Arial"/>
+        </w:rPr>
+        <w:t xml:space="preserve">A ORGANIZAÇÃO DO EVENTO isenta-se de quaisquer responsabilidades decorrentes do não cumprimento das exigências necessárias, sejam de natureza fiscal, civil, comercial, criminal, trabalhista, fiscalização da Delegacia Regional do Trabalho, Receita Federal, Receita Estadual, inclusive em relação a mão de obra utilizada no evento, devendo o Expositor abster-se da contratação de menores para trabalharem no EVENTO, sob pena de multa </w:t>
+      </w:r>
+      <w:r>
+        <w:rPr>
+          <w:rFonts w:ascii="Arial" w:hAnsi="Arial" w:cs="Arial"/>
+        </w:rPr>
+        <w:t xml:space="preserve"> não compensatória </w:t>
+      </w:r>
+      <w:r>
+        <w:rPr>
+          <w:rFonts w:ascii="Arial" w:hAnsi="Arial" w:cs="Arial"/>
+        </w:rPr>
+        <w:t xml:space="preserve">em valor equivalente a </w:t>
+      </w:r>
+      <w:r>
+        <w:rPr>
+          <w:rFonts w:ascii="Arial" w:hAnsi="Arial" w:cs="Arial"/>
+        </w:rPr>
+        <w:t>{{</w:t>
+      </w:r>
+      <w:r>
+        <w:rPr>
+          <w:rFonts w:ascii="Arial" w:hAnsi="Arial" w:cs="Arial"/>
+        </w:rPr>
+        <w:t>PENALIDADECONTRATACAOMENOR</w:t>
+      </w:r>
+      <w:r>
+        <w:rPr>
+          <w:rFonts w:ascii="Arial" w:hAnsi="Arial" w:cs="Arial"/>
+        </w:rPr>
+        <w:t>}}</w:t>
+      </w:r>
+      <w:r>
+        <w:rPr>
+          <w:rFonts w:ascii="Arial" w:hAnsi="Arial" w:cs="Arial"/>
+        </w:rPr>
+        <w:t>, sem exclusão de outros prejuízos;</w:t>
+      </w:r>
+    </w:p>
+    <w:p>
+      <w:pPr>
+        <w:spacing w:after="0" w:line="240" w:lineRule="auto"/>
+        <w:jc w:val="both"/>
+        <w:rPr>
+          <w:rFonts w:ascii="Arial" w:hAnsi="Arial" w:cs="Arial"/>
+        </w:rPr>
+      </w:pPr>
+    </w:p>
+    <w:p>
+      <w:pPr>
+        <w:spacing w:after="0" w:line="240" w:lineRule="auto"/>
+        <w:jc w:val="both"/>
+        <w:rPr>
+          <w:rFonts w:ascii="Arial" w:hAnsi="Arial" w:cs="Arial"/>
+        </w:rPr>
+      </w:pPr>
+      <w:r>
+        <w:rPr>
+          <w:rFonts w:ascii="Arial" w:hAnsi="Arial" w:cs="Arial"/>
+        </w:rPr>
+        <w:t xml:space="preserve">4.4. </w:t>
+      </w:r>
+      <w:r>
+        <w:rPr>
+          <w:rFonts w:ascii="Arial" w:hAnsi="Arial" w:cs="Arial"/>
+        </w:rPr>
+        <w:t xml:space="preserve">O Expositor é responsável por quaisquer outras despesas relativas à montagem e desmontagem do seu espaço, ficando o Organizador isento de qualquer responsabilidade por esquecimento de algum item no local do evento após a desmontagem; </w:t>
+      </w:r>
+    </w:p>
+    <w:p>
+      <w:pPr>
+        <w:spacing w:after="0" w:line="240" w:lineRule="auto"/>
+        <w:jc w:val="both"/>
+        <w:rPr>
+          <w:rFonts w:ascii="Arial" w:hAnsi="Arial" w:cs="Arial"/>
+        </w:rPr>
+      </w:pPr>
+    </w:p>
+    <w:p>
+      <w:pPr>
+        <w:spacing w:after="0" w:line="240" w:lineRule="auto"/>
+        <w:jc w:val="both"/>
+        <w:rPr>
+          <w:rFonts w:ascii="Arial" w:hAnsi="Arial" w:cs="Arial"/>
+        </w:rPr>
+      </w:pPr>
+      <w:r>
+        <w:rPr>
+          <w:rFonts w:ascii="Arial" w:hAnsi="Arial" w:cs="Arial"/>
+        </w:rPr>
+        <w:t>4.5.</w:t>
+      </w:r>
+      <w:r>
+        <w:rPr>
+          <w:rFonts w:ascii="Arial" w:hAnsi="Arial" w:cs="Arial"/>
+        </w:rPr>
+        <w:t xml:space="preserve"> Não poderá tomar posse do seu espaço o Expositor que estiver em débito com a organização do evento, sem antes resolver tal pendência;</w:t>
+      </w:r>
+      <w:r>
+        <w:rPr>
+          <w:rFonts w:ascii="Arial" w:hAnsi="Arial" w:cs="Arial"/>
+        </w:rPr>
+        <w:t xml:space="preserve"> O</w:t>
       </w:r>
       <w:r>
         <w:rPr>
@@ -2304,68 +4888,60 @@
       <w:r>
         <w:rPr>
           <w:rFonts w:ascii="Arial" w:hAnsi="Arial" w:cs="Arial"/>
-          <w:b/>
-        </w:rPr>
-        <w:t>EXAGERADO</w:t>
-      </w:r>
-      <w:r>
-        <w:rPr>
-          <w:rFonts w:ascii="Arial" w:hAnsi="Arial" w:cs="Arial"/>
-        </w:rPr>
-        <w:t>, vedada qualquer restituição em dinheiro.</w:t>
-      </w:r>
-    </w:p>
-    <w:p>
-      <w:pPr>
-        <w:spacing w:line="240" w:lineRule="auto"/>
-        <w:jc w:val="both"/>
-        <w:rPr>
-          <w:rFonts w:ascii="Arial" w:hAnsi="Arial" w:cs="Arial"/>
-        </w:rPr>
-      </w:pPr>
-      <w:r>
-        <w:rPr>
-          <w:rFonts w:ascii="Arial" w:hAnsi="Arial" w:cs="Arial"/>
-        </w:rPr>
-        <w:t xml:space="preserve">3. </w:t>
-      </w:r>
-      <w:r>
-        <w:rPr>
-          <w:rFonts w:ascii="Arial" w:hAnsi="Arial" w:cs="Arial"/>
-        </w:rPr>
-        <w:t>O</w:t>
-      </w:r>
-      <w:r>
-        <w:rPr>
-          <w:rFonts w:ascii="Arial" w:hAnsi="Arial" w:cs="Arial"/>
-        </w:rPr>
-        <w:t xml:space="preserve"> </w:t>
-      </w:r>
-      <w:r>
-        <w:rPr>
-          <w:rFonts w:ascii="Arial" w:hAnsi="Arial" w:cs="Arial"/>
-          <w:b/>
-        </w:rPr>
-        <w:t>EXAGERADO</w:t>
-      </w:r>
-      <w:r>
-        <w:rPr>
-          <w:rFonts w:ascii="Arial" w:hAnsi="Arial" w:cs="Arial"/>
-        </w:rPr>
-        <w:t xml:space="preserve"> </w:t>
-      </w:r>
-      <w:r>
-        <w:rPr>
-          <w:rFonts w:ascii="Arial" w:hAnsi="Arial" w:cs="Arial"/>
-        </w:rPr>
-        <w:t xml:space="preserve">poderá, ainda, ajustar as condições logísticas do evento para atender a determinações legais ou operacionais decorrentes da situação de força maior, inclusive com alteração de datas, horários ou formato (presencial, híbrido ou digital), sem que isso gere qualquer obrigação de ressarcimento ao </w:t>
-      </w:r>
-      <w:r>
-        <w:rPr>
-          <w:rFonts w:ascii="Arial" w:hAnsi="Arial" w:cs="Arial"/>
-          <w:b/>
-        </w:rPr>
-        <w:t>EXPOSITOR</w:t>
+        </w:rPr>
+        <w:t>expositor</w:t>
+      </w:r>
+      <w:r>
+        <w:rPr>
+          <w:rFonts w:ascii="Arial" w:hAnsi="Arial" w:cs="Arial"/>
+        </w:rPr>
+        <w:t xml:space="preserve"> deverá proceder a </w:t>
+      </w:r>
+      <w:r>
+        <w:rPr>
+          <w:rFonts w:ascii="Arial" w:hAnsi="Arial" w:cs="Arial"/>
+          <w:b/>
+          <w:bCs/>
+        </w:rPr>
+        <w:t>Anotação de Responsabilidade</w:t>
+      </w:r>
+      <w:r>
+        <w:rPr>
+          <w:rFonts w:ascii="Arial" w:hAnsi="Arial" w:cs="Arial"/>
+          <w:b/>
+          <w:bCs/>
+        </w:rPr>
+        <w:t xml:space="preserve"> (ART)</w:t>
+      </w:r>
+      <w:r>
+        <w:rPr>
+          <w:rFonts w:ascii="Arial" w:hAnsi="Arial" w:cs="Arial"/>
+        </w:rPr>
+        <w:t xml:space="preserve"> e apresentá-la a organização do evento.</w:t>
+      </w:r>
+    </w:p>
+    <w:p>
+      <w:pPr>
+        <w:spacing w:after="0" w:line="240" w:lineRule="auto"/>
+        <w:jc w:val="both"/>
+        <w:rPr>
+          <w:rFonts w:ascii="Arial" w:hAnsi="Arial" w:cs="Arial"/>
+        </w:rPr>
+      </w:pPr>
+    </w:p>
+    <w:p>
+      <w:pPr>
+        <w:spacing w:after="0" w:line="240" w:lineRule="auto"/>
+        <w:jc w:val="both"/>
+        <w:rPr>
+          <w:rFonts w:ascii="Arial" w:hAnsi="Arial" w:cs="Arial"/>
+        </w:rPr>
+      </w:pPr>
+      <w:r>
+        <w:rPr>
+          <w:rFonts w:ascii="Arial" w:hAnsi="Arial" w:cs="Arial"/>
+        </w:rPr>
+        <w:t>4.6</w:t>
       </w:r>
       <w:r>
         <w:rPr>
@@ -2373,62 +4949,73 @@
         </w:rPr>
         <w:t>.</w:t>
       </w:r>
-    </w:p>
-    <w:p>
-      <w:pPr>
-        <w:spacing w:after="0" w:line="240" w:lineRule="auto"/>
-        <w:jc w:val="both"/>
-        <w:rPr>
-          <w:rFonts w:ascii="Arial" w:hAnsi="Arial" w:cs="Arial"/>
-        </w:rPr>
-      </w:pPr>
-    </w:p>
-    <w:p>
-      <w:pPr>
-        <w:spacing w:after="0" w:line="240" w:lineRule="auto"/>
-        <w:jc w:val="both"/>
-        <w:rPr>
-          <w:rFonts w:ascii="Arial" w:hAnsi="Arial" w:cs="Arial"/>
-          <w:b/>
-        </w:rPr>
-      </w:pPr>
-      <w:r>
-        <w:rPr>
-          <w:rFonts w:ascii="Arial" w:hAnsi="Arial" w:cs="Arial"/>
-          <w:b/>
-        </w:rPr>
-        <w:t>CLÁUSULA 3ª – DAS OBRIGAÇÕES CONCERNENTES À ORGANIZAÇÃO DO EVENTO</w:t>
-      </w:r>
-    </w:p>
-    <w:p>
-      <w:pPr>
-        <w:spacing w:after="0" w:line="240" w:lineRule="auto"/>
-        <w:jc w:val="both"/>
-        <w:rPr>
-          <w:rFonts w:ascii="Arial" w:hAnsi="Arial" w:cs="Arial"/>
-          <w:b/>
-        </w:rPr>
-      </w:pPr>
-    </w:p>
-    <w:p>
-      <w:pPr>
-        <w:spacing w:after="0" w:line="240" w:lineRule="auto"/>
-        <w:jc w:val="both"/>
-        <w:rPr>
-          <w:rFonts w:ascii="Arial" w:hAnsi="Arial" w:cs="Arial"/>
-        </w:rPr>
-      </w:pPr>
-      <w:r>
-        <w:rPr>
-          <w:rFonts w:ascii="Arial" w:hAnsi="Arial" w:cs="Arial"/>
-        </w:rPr>
-        <w:t>3.1. Colocar à</w:t>
-      </w:r>
-      <w:r>
-        <w:rPr>
-          <w:rFonts w:ascii="Arial" w:hAnsi="Arial" w:cs="Arial"/>
-        </w:rPr>
-        <w:t xml:space="preserve"> disposição do EXPOSITOR durante o período de realização, a área cedida ao mesmo, e conforme especificada em contrato de participação, observando-se o item 3.5</w:t>
+      <w:r>
+        <w:rPr>
+          <w:rFonts w:ascii="Arial" w:hAnsi="Arial" w:cs="Arial"/>
+        </w:rPr>
+        <w:t xml:space="preserve"> É de inteira responsabilidade do Expositor as vendas realizadas no seu espaço, assim como a operacionalização para o recebimento em dinheiro, cheques, cartão de crédito ou débito, ficando assim o Organizador do evento livre de quaisquer responsabilidades por cheques sem fundos ou problemas com operadoras de cartão, inclusive resultantes de caso fortuito ou força maior. Cabe exclusivamente ao Expositor diligenciar para obtenção das máquinas de cartão que pretende usar no seu estande. </w:t>
+      </w:r>
+    </w:p>
+    <w:p>
+      <w:pPr>
+        <w:spacing w:after="0" w:line="240" w:lineRule="auto"/>
+        <w:jc w:val="both"/>
+        <w:rPr>
+          <w:rFonts w:ascii="Arial" w:hAnsi="Arial" w:cs="Arial"/>
+        </w:rPr>
+      </w:pPr>
+    </w:p>
+    <w:p>
+      <w:pPr>
+        <w:spacing w:after="0" w:line="240" w:lineRule="auto"/>
+        <w:jc w:val="both"/>
+        <w:outlineLvl w:val="0"/>
+        <w:rPr>
+          <w:rFonts w:ascii="Arial" w:hAnsi="Arial" w:cs="Arial"/>
+        </w:rPr>
+      </w:pPr>
+      <w:r>
+        <w:rPr>
+          <w:rFonts w:ascii="Arial" w:hAnsi="Arial" w:cs="Arial"/>
+        </w:rPr>
+        <w:t>4.7</w:t>
+      </w:r>
+      <w:r>
+        <w:rPr>
+          <w:rFonts w:ascii="Arial" w:hAnsi="Arial" w:cs="Arial"/>
+        </w:rPr>
+        <w:t xml:space="preserve">. </w:t>
+      </w:r>
+      <w:r>
+        <w:rPr>
+          <w:rFonts w:ascii="Arial" w:hAnsi="Arial" w:cs="Arial"/>
+        </w:rPr>
+        <w:t xml:space="preserve">O Expositor será responsável pelos prejuízos causados por si próprio, seus prepostos ou funcionários, seus clientes, extravio, roubo ou danificação nas peças expostas, danos pessoais e materiais causados durante a montagem e/ou desmontagem do seu espaço e no decorrer do evento. </w:t>
+      </w:r>
+    </w:p>
+    <w:p>
+      <w:pPr>
+        <w:spacing w:after="0" w:line="240" w:lineRule="auto"/>
+        <w:jc w:val="both"/>
+        <w:outlineLvl w:val="0"/>
+        <w:rPr>
+          <w:rFonts w:ascii="Arial" w:hAnsi="Arial" w:cs="Arial"/>
+        </w:rPr>
+      </w:pPr>
+    </w:p>
+    <w:p>
+      <w:pPr>
+        <w:spacing w:after="0" w:line="240" w:lineRule="auto"/>
+        <w:jc w:val="both"/>
+        <w:rPr>
+          <w:rFonts w:ascii="Arial" w:hAnsi="Arial" w:cs="Arial"/>
+        </w:rPr>
+      </w:pPr>
+      <w:r>
+        <w:rPr>
+          <w:rFonts w:ascii="Arial" w:hAnsi="Arial" w:cs="Arial"/>
+        </w:rPr>
+        <w:t>4.8</w:t>
       </w:r>
       <w:r>
         <w:rPr>
@@ -2436,673 +5023,32 @@
         </w:rPr>
         <w:t>.</w:t>
       </w:r>
-    </w:p>
-    <w:p>
-      <w:pPr>
-        <w:spacing w:after="0" w:line="240" w:lineRule="auto"/>
-        <w:jc w:val="both"/>
-        <w:rPr>
-          <w:rFonts w:ascii="Arial" w:hAnsi="Arial" w:cs="Arial"/>
-        </w:rPr>
-      </w:pPr>
-    </w:p>
-    <w:p>
-      <w:pPr>
-        <w:spacing w:after="0" w:line="240" w:lineRule="auto"/>
-        <w:jc w:val="both"/>
-        <w:rPr>
-          <w:rFonts w:ascii="Arial" w:hAnsi="Arial" w:cs="Arial"/>
-        </w:rPr>
-      </w:pPr>
-      <w:r>
-        <w:rPr>
-          <w:rFonts w:ascii="Arial" w:hAnsi="Arial" w:cs="Arial"/>
-        </w:rPr>
-        <w:t>3.2</w:t>
-      </w:r>
-      <w:r>
-        <w:rPr>
-          <w:rFonts w:ascii="Arial" w:hAnsi="Arial" w:cs="Arial"/>
-        </w:rPr>
-        <w:t>.</w:t>
-      </w:r>
-      <w:r>
-        <w:rPr>
-          <w:rFonts w:ascii="Arial" w:hAnsi="Arial" w:cs="Arial"/>
-        </w:rPr>
-        <w:t xml:space="preserve"> Coordenar e manter a área em condições de funcionamento, observando-se o item 3.5.</w:t>
-      </w:r>
-    </w:p>
-    <w:p>
-      <w:pPr>
-        <w:spacing w:after="0" w:line="240" w:lineRule="auto"/>
-        <w:jc w:val="both"/>
-        <w:rPr>
-          <w:rFonts w:ascii="Arial" w:hAnsi="Arial" w:cs="Arial"/>
-        </w:rPr>
-      </w:pPr>
-    </w:p>
-    <w:p>
-      <w:pPr>
-        <w:spacing w:line="240" w:lineRule="auto"/>
-        <w:jc w:val="both"/>
-        <w:rPr>
-          <w:rFonts w:ascii="Arial" w:hAnsi="Arial" w:cs="Arial"/>
-        </w:rPr>
-      </w:pPr>
-      <w:r>
-        <w:rPr>
-          <w:rFonts w:ascii="Arial" w:hAnsi="Arial" w:cs="Arial"/>
-        </w:rPr>
-        <w:t>3.3</w:t>
-      </w:r>
-      <w:r>
-        <w:rPr>
-          <w:rFonts w:ascii="Arial" w:hAnsi="Arial" w:cs="Arial"/>
-        </w:rPr>
-        <w:t>.</w:t>
-      </w:r>
-      <w:r>
-        <w:rPr>
-          <w:rFonts w:ascii="Arial" w:hAnsi="Arial" w:cs="Arial"/>
-        </w:rPr>
-        <w:t xml:space="preserve"> Promover o EVENTO e gerir a manutenção e harmonia e integridade dos EXPOSITORES e público em geral, nas áreas comuns, não se responsabilizando, todavia, por perdas e danos dos produtos ou materiais dos EXPOSITORES, ou por atos destes empregados, contratados ou subcontratados, ou decorrentes de atos praticados por consumidores, público em geral, no interior de sua área. Esta obrigação não implica, ainda, em responsabilidade por roubos e desaparecimento de mercadorias e pertences nas lojas ou em seus estoques extras, sendo de responsabilidade de todos os EXPOSITORES sempre ter em boa guarda as mercadorias em exposição e a serem comercializadas.</w:t>
-      </w:r>
-    </w:p>
-    <w:p>
-      <w:pPr>
-        <w:jc w:val="both"/>
-        <w:rPr>
-          <w:rFonts w:ascii="Arial" w:hAnsi="Arial" w:cs="Arial"/>
-          <w:b/>
-          <w:color w:val="FF0000"/>
-        </w:rPr>
-      </w:pPr>
-      <w:r>
-        <w:rPr>
-          <w:rFonts w:ascii="Arial" w:hAnsi="Arial" w:cs="Arial"/>
-        </w:rPr>
-        <w:t>3.4</w:t>
-      </w:r>
-      <w:r>
-        <w:rPr>
-          <w:rFonts w:ascii="Arial" w:hAnsi="Arial" w:cs="Arial"/>
-        </w:rPr>
-        <w:t xml:space="preserve">. </w:t>
-      </w:r>
-      <w:r>
-        <w:rPr>
-          <w:rFonts w:ascii="Arial" w:hAnsi="Arial" w:cs="Arial"/>
-        </w:rPr>
-        <w:t>Produzir crachá ou outro material de identificação necessário à realização e segurança do EVENTO.</w:t>
-      </w:r>
-    </w:p>
-    <w:p>
-      <w:pPr>
-        <w:spacing w:line="240" w:lineRule="auto"/>
-        <w:jc w:val="both"/>
-        <w:rPr>
-          <w:rFonts w:ascii="Arial" w:hAnsi="Arial" w:cs="Arial"/>
-        </w:rPr>
-      </w:pPr>
-      <w:r>
-        <w:rPr>
-          <w:rFonts w:ascii="Arial" w:hAnsi="Arial" w:cs="Arial"/>
-        </w:rPr>
-        <w:t>3.5</w:t>
-      </w:r>
-      <w:r>
-        <w:rPr>
-          <w:rFonts w:ascii="Arial" w:hAnsi="Arial" w:cs="Arial"/>
-        </w:rPr>
-        <w:t xml:space="preserve">. </w:t>
-      </w:r>
-      <w:r>
-        <w:rPr>
-          <w:rFonts w:ascii="Arial" w:hAnsi="Arial" w:cs="Arial"/>
-        </w:rPr>
-        <w:t xml:space="preserve">O </w:t>
-      </w:r>
-      <w:r>
-        <w:rPr>
-          <w:rFonts w:ascii="Arial" w:hAnsi="Arial" w:cs="Arial"/>
-        </w:rPr>
-        <w:t>ORGANIZADOR</w:t>
-      </w:r>
-      <w:r>
-        <w:rPr>
-          <w:rFonts w:ascii="Arial" w:hAnsi="Arial" w:cs="Arial"/>
-        </w:rPr>
-        <w:t xml:space="preserve"> não se responsabiliza por fenômenos da natureza, paralisações que possam ocorrer e prejudicar a estrutura física e o funcionamento do evento, do local e de suas vendas, assim como a legitimidade dos produtos dos lojistas e a permissão das fábricas dos produtos que serão comercializados pelo EXPOSITOR. </w:t>
-      </w:r>
-    </w:p>
-    <w:p>
-      <w:pPr>
-        <w:spacing w:line="240" w:lineRule="auto"/>
-        <w:jc w:val="both"/>
-        <w:rPr>
-          <w:rFonts w:ascii="Arial" w:hAnsi="Arial" w:cs="Arial"/>
-        </w:rPr>
-      </w:pPr>
+      <w:r>
+        <w:rPr>
+          <w:rFonts w:ascii="Arial" w:hAnsi="Arial" w:cs="Arial"/>
+        </w:rPr>
+        <w:t xml:space="preserve"> No caso de </w:t>
+      </w:r>
+      <w:r>
+        <w:rPr>
+          <w:rFonts w:ascii="Arial" w:hAnsi="Arial" w:cs="Arial"/>
+          <w:color w:val="000000" w:themeColor="text1"/>
+          <w:u w:val="single"/>
+        </w:rPr>
+        <w:t>conduta inadequada</w:t>
+      </w:r>
+      <w:r>
+        <w:rPr>
+          <w:rFonts w:ascii="Arial" w:hAnsi="Arial" w:cs="Arial"/>
+        </w:rPr>
+        <w:t xml:space="preserve">, tais como agressões verbais ou físicas, ou qualquer comportamento que descredencie o Expositor, seja em relação aos organizadores, aos colegas Expositores ou clientes, a </w:t>
+      </w:r>
       <w:r>
         <w:rPr>
           <w:rFonts w:ascii="Arial" w:hAnsi="Arial" w:cs="Arial"/>
         </w:rPr>
         <w:lastRenderedPageBreak/>
-        <w:t>3.6</w:t>
-      </w:r>
-      <w:r>
-        <w:rPr>
-          <w:rFonts w:ascii="Arial" w:hAnsi="Arial" w:cs="Arial"/>
-        </w:rPr>
-        <w:t>.</w:t>
-      </w:r>
-      <w:r>
-        <w:rPr>
-          <w:rFonts w:ascii="Arial" w:hAnsi="Arial" w:cs="Arial"/>
-        </w:rPr>
-        <w:t xml:space="preserve"> O Expositor se responsabiliza por todo e qualquer dano praticado em razão da não legitimidade ou da contestação pela fábrica e ou consumidores dos produtos comercializados no evento.</w:t>
-      </w:r>
-    </w:p>
-    <w:p>
-      <w:pPr>
-        <w:spacing w:after="0" w:line="240" w:lineRule="auto"/>
-        <w:jc w:val="both"/>
-        <w:rPr>
-          <w:rFonts w:ascii="Arial" w:hAnsi="Arial" w:cs="Arial"/>
-        </w:rPr>
-      </w:pPr>
-      <w:r>
-        <w:rPr>
-          <w:rFonts w:ascii="Arial" w:hAnsi="Arial" w:cs="Arial"/>
-        </w:rPr>
-        <w:t>3.7</w:t>
-      </w:r>
-      <w:r>
-        <w:rPr>
-          <w:rFonts w:ascii="Arial" w:hAnsi="Arial" w:cs="Arial"/>
-        </w:rPr>
-        <w:t xml:space="preserve">. </w:t>
-      </w:r>
-      <w:r>
-        <w:rPr>
-          <w:rFonts w:ascii="Arial" w:hAnsi="Arial" w:cs="Arial"/>
-        </w:rPr>
-        <w:t>O Organizador não se responsabiliza por quaisquer danos, de que natureza forem, em razão de caso fortuito, força maior ou ainda por atos derivados de quaisquer poderes da administração pública, inclusive decisões judiciais que reduzam ou inviabilizem o evento ou porventura tragam qualquer prejuízo aos Expositores.</w:t>
-      </w:r>
-    </w:p>
-    <w:p>
-      <w:pPr>
-        <w:spacing w:after="0" w:line="240" w:lineRule="auto"/>
-        <w:jc w:val="both"/>
-        <w:rPr>
-          <w:rFonts w:ascii="Arial" w:hAnsi="Arial" w:cs="Arial"/>
-        </w:rPr>
-      </w:pPr>
-      <w:r>
-        <w:rPr>
-          <w:rFonts w:ascii="Arial" w:hAnsi="Arial" w:cs="Arial"/>
-        </w:rPr>
-        <w:t xml:space="preserve"> </w:t>
-      </w:r>
-    </w:p>
-    <w:p>
-      <w:pPr>
-        <w:spacing w:after="0" w:line="240" w:lineRule="auto"/>
-        <w:jc w:val="both"/>
-        <w:rPr>
-          <w:rFonts w:ascii="Arial" w:hAnsi="Arial" w:cs="Arial"/>
-          <w:b/>
-        </w:rPr>
-      </w:pPr>
-      <w:r>
-        <w:rPr>
-          <w:rFonts w:ascii="Arial" w:hAnsi="Arial" w:cs="Arial"/>
-          <w:b/>
-        </w:rPr>
-        <w:t xml:space="preserve">CLÁUSULA 4º - </w:t>
-      </w:r>
-      <w:r>
-        <w:rPr>
-          <w:rFonts w:ascii="Arial" w:hAnsi="Arial" w:cs="Arial"/>
-          <w:b/>
-        </w:rPr>
-        <w:t xml:space="preserve">DAS OBRIGAÇÕES </w:t>
-      </w:r>
-      <w:r>
-        <w:rPr>
-          <w:rFonts w:ascii="Arial" w:hAnsi="Arial" w:cs="Arial"/>
-          <w:b/>
-        </w:rPr>
-        <w:t>DO EXPOSITOR</w:t>
-      </w:r>
-    </w:p>
-    <w:p>
-      <w:pPr>
-        <w:spacing w:after="0" w:line="240" w:lineRule="auto"/>
-        <w:jc w:val="both"/>
-        <w:rPr>
-          <w:rFonts w:ascii="Arial" w:hAnsi="Arial" w:cs="Arial"/>
-          <w:b/>
-        </w:rPr>
-      </w:pPr>
-    </w:p>
-    <w:p>
-      <w:pPr>
-        <w:spacing w:after="0" w:line="240" w:lineRule="auto"/>
-        <w:jc w:val="both"/>
-        <w:rPr>
-          <w:rFonts w:ascii="Arial" w:hAnsi="Arial" w:cs="Arial"/>
-        </w:rPr>
-      </w:pPr>
-      <w:r>
-        <w:rPr>
-          <w:rFonts w:ascii="Arial" w:hAnsi="Arial" w:cs="Arial"/>
-        </w:rPr>
-        <w:t>4.1</w:t>
-      </w:r>
-      <w:r>
-        <w:rPr>
-          <w:rFonts w:ascii="Arial" w:hAnsi="Arial" w:cs="Arial"/>
-        </w:rPr>
-        <w:t xml:space="preserve">. </w:t>
-      </w:r>
-      <w:r>
-        <w:rPr>
-          <w:rFonts w:ascii="Arial" w:hAnsi="Arial" w:cs="Arial"/>
-        </w:rPr>
-        <w:t>Ser responsável pelo controle e armazenagem de todo o material e produtos utilizados antes e durante o evento. A ORGANIZAÇÃO não se responsabiliza pelo controle de entrada e saída de peças dos expositores.</w:t>
-      </w:r>
-    </w:p>
-    <w:p>
-      <w:pPr>
-        <w:spacing w:after="0" w:line="240" w:lineRule="auto"/>
-        <w:jc w:val="both"/>
-        <w:rPr>
-          <w:rFonts w:ascii="Arial" w:hAnsi="Arial" w:cs="Arial"/>
-        </w:rPr>
-      </w:pPr>
-      <w:r>
-        <w:rPr>
-          <w:rFonts w:ascii="Arial" w:hAnsi="Arial" w:cs="Arial"/>
-        </w:rPr>
-        <w:t xml:space="preserve"> </w:t>
-      </w:r>
-    </w:p>
-    <w:p>
-      <w:pPr>
-        <w:spacing w:line="240" w:lineRule="auto"/>
-        <w:jc w:val="both"/>
-        <w:rPr>
-          <w:rFonts w:ascii="Arial" w:hAnsi="Arial" w:cs="Arial"/>
-        </w:rPr>
-      </w:pPr>
-      <w:r>
-        <w:rPr>
-          <w:rFonts w:ascii="Arial" w:hAnsi="Arial" w:cs="Arial"/>
-        </w:rPr>
-        <w:t>4.2</w:t>
-      </w:r>
-      <w:r>
-        <w:rPr>
-          <w:rFonts w:ascii="Arial" w:hAnsi="Arial" w:cs="Arial"/>
-        </w:rPr>
-        <w:t>.</w:t>
-      </w:r>
-      <w:r>
-        <w:rPr>
-          <w:rFonts w:ascii="Arial" w:hAnsi="Arial" w:cs="Arial"/>
-        </w:rPr>
-        <w:t xml:space="preserve"> Manter em seu espaço, durante o horário de funcionamento do evento, pessoal qualificado e capacitado para atender o público visitante,</w:t>
-      </w:r>
-      <w:r>
-        <w:rPr>
-          <w:rFonts w:ascii="Arial" w:hAnsi="Arial" w:cs="Arial"/>
-          <w:b/>
-          <w:color w:val="FF0000"/>
-        </w:rPr>
-        <w:t xml:space="preserve"> </w:t>
-      </w:r>
-      <w:r>
-        <w:rPr>
-          <w:rFonts w:ascii="Arial" w:hAnsi="Arial" w:cs="Arial"/>
-        </w:rPr>
-        <w:t>só utilizando o espaço externo ou áreas comuns para promoções ou divulgações mediante autorização prévia e expressa do ORGANIZADOR, não praticando abordagem direta nessas áreas e não utilizando recursos sonoros ou visuais em níveis que possam comprometer a harmonia e bom andamento do EVENTO.  O ORGANIZADOR, caso verifique a ocorrência de qualquer das irregularidades aqui relacionadas, poderá adotar as medidas que entender necessárias a cessar a irregularidade, inclusive, notificar e multar</w:t>
-      </w:r>
-      <w:r>
-        <w:rPr>
-          <w:rFonts w:ascii="Arial" w:hAnsi="Arial" w:cs="Arial"/>
-        </w:rPr>
-        <w:t>,</w:t>
-      </w:r>
-      <w:r>
-        <w:rPr>
-          <w:rFonts w:ascii="Arial" w:hAnsi="Arial" w:cs="Arial"/>
-        </w:rPr>
-        <w:t xml:space="preserve"> </w:t>
-      </w:r>
-      <w:r>
-        <w:rPr>
-          <w:rFonts w:ascii="Arial" w:hAnsi="Arial" w:cs="Arial"/>
-        </w:rPr>
-        <w:t>de forma não compensatória</w:t>
-      </w:r>
-      <w:r>
-        <w:rPr>
-          <w:rFonts w:ascii="Arial" w:hAnsi="Arial" w:cs="Arial"/>
-        </w:rPr>
-        <w:t xml:space="preserve"> o EXPOSITOR em valor equivalente a </w:t>
-      </w:r>
-      <w:r>
-        <w:rPr>
-          <w:rFonts w:ascii="Arial" w:hAnsi="Arial" w:cs="Arial"/>
-        </w:rPr>
-        <w:t>{{</w:t>
-      </w:r>
-      <w:r>
-        <w:rPr>
-          <w:rFonts w:ascii="Arial" w:hAnsi="Arial" w:cs="Arial"/>
-        </w:rPr>
-        <w:t>PENALIDADEIRREGULARIDADE</w:t>
-      </w:r>
-      <w:r>
-        <w:rPr>
-          <w:rFonts w:ascii="Arial" w:hAnsi="Arial" w:cs="Arial"/>
-        </w:rPr>
-        <w:t>}}</w:t>
-      </w:r>
-      <w:r>
-        <w:rPr>
-          <w:rFonts w:ascii="Arial" w:hAnsi="Arial" w:cs="Arial"/>
-        </w:rPr>
-        <w:t>.  Eventual reincidência do EXPOSITOR no cometimento da infração ensejará ao ORGANIZADOR a possibilidade de rescisão deste contrato, sem prejuízo da cumulação das multas.</w:t>
-      </w:r>
-    </w:p>
-    <w:p>
-      <w:pPr>
-        <w:spacing w:after="0" w:line="240" w:lineRule="auto"/>
-        <w:jc w:val="both"/>
-        <w:rPr>
-          <w:rFonts w:ascii="Arial" w:hAnsi="Arial" w:cs="Arial"/>
-        </w:rPr>
-      </w:pPr>
-      <w:r>
-        <w:rPr>
-          <w:rFonts w:ascii="Arial" w:hAnsi="Arial" w:cs="Arial"/>
-        </w:rPr>
-        <w:t xml:space="preserve">4.3. </w:t>
-      </w:r>
-      <w:r>
-        <w:rPr>
-          <w:rFonts w:ascii="Arial" w:hAnsi="Arial" w:cs="Arial"/>
-        </w:rPr>
-        <w:t xml:space="preserve">A ORGANIZAÇÃO DO EVENTO isenta-se de quaisquer responsabilidades decorrentes do não cumprimento das exigências necessárias, sejam de natureza fiscal, civil, comercial, criminal, trabalhista, fiscalização da Delegacia Regional do Trabalho, Receita Federal, Receita Estadual, inclusive em relação a mão de obra utilizada no evento, devendo o Expositor abster-se da contratação de menores para trabalharem no EVENTO, sob pena de multa </w:t>
-      </w:r>
-      <w:r>
-        <w:rPr>
-          <w:rFonts w:ascii="Arial" w:hAnsi="Arial" w:cs="Arial"/>
-        </w:rPr>
-        <w:t xml:space="preserve"> não compensatória </w:t>
-      </w:r>
-      <w:r>
-        <w:rPr>
-          <w:rFonts w:ascii="Arial" w:hAnsi="Arial" w:cs="Arial"/>
-        </w:rPr>
-        <w:t xml:space="preserve">em valor equivalente a </w:t>
-      </w:r>
-      <w:r>
-        <w:rPr>
-          <w:rFonts w:ascii="Arial" w:hAnsi="Arial" w:cs="Arial"/>
-        </w:rPr>
-        <w:t>{{</w:t>
-      </w:r>
-      <w:r>
-        <w:rPr>
-          <w:rFonts w:ascii="Arial" w:hAnsi="Arial" w:cs="Arial"/>
-        </w:rPr>
-        <w:t>PENALIDADECONTRATACAOMENOR</w:t>
-      </w:r>
-      <w:r>
-        <w:rPr>
-          <w:rFonts w:ascii="Arial" w:hAnsi="Arial" w:cs="Arial"/>
-        </w:rPr>
-        <w:t>}}</w:t>
-      </w:r>
-      <w:r>
-        <w:rPr>
-          <w:rFonts w:ascii="Arial" w:hAnsi="Arial" w:cs="Arial"/>
-        </w:rPr>
-        <w:t>, sem exclusão de outros prejuízos;</w:t>
-      </w:r>
-    </w:p>
-    <w:p>
-      <w:pPr>
-        <w:spacing w:after="0" w:line="240" w:lineRule="auto"/>
-        <w:jc w:val="both"/>
-        <w:rPr>
-          <w:rFonts w:ascii="Arial" w:hAnsi="Arial" w:cs="Arial"/>
-        </w:rPr>
-      </w:pPr>
-    </w:p>
-    <w:p>
-      <w:pPr>
-        <w:spacing w:after="0" w:line="240" w:lineRule="auto"/>
-        <w:jc w:val="both"/>
-        <w:rPr>
-          <w:rFonts w:ascii="Arial" w:hAnsi="Arial" w:cs="Arial"/>
-        </w:rPr>
-      </w:pPr>
-      <w:r>
-        <w:rPr>
-          <w:rFonts w:ascii="Arial" w:hAnsi="Arial" w:cs="Arial"/>
-        </w:rPr>
-        <w:t xml:space="preserve">4.4. </w:t>
-      </w:r>
-      <w:r>
-        <w:rPr>
-          <w:rFonts w:ascii="Arial" w:hAnsi="Arial" w:cs="Arial"/>
-        </w:rPr>
-        <w:t xml:space="preserve">O Expositor é responsável por quaisquer outras despesas relativas à montagem e desmontagem do seu espaço, ficando o Organizador isento de qualquer responsabilidade por esquecimento de algum item no local do evento após a desmontagem; </w:t>
-      </w:r>
-    </w:p>
-    <w:p>
-      <w:pPr>
-        <w:spacing w:after="0" w:line="240" w:lineRule="auto"/>
-        <w:jc w:val="both"/>
-        <w:rPr>
-          <w:rFonts w:ascii="Arial" w:hAnsi="Arial" w:cs="Arial"/>
-        </w:rPr>
-      </w:pPr>
-    </w:p>
-    <w:p>
-      <w:pPr>
-        <w:spacing w:after="0" w:line="240" w:lineRule="auto"/>
-        <w:jc w:val="both"/>
-        <w:rPr>
-          <w:rFonts w:ascii="Arial" w:hAnsi="Arial" w:cs="Arial"/>
-        </w:rPr>
-      </w:pPr>
-      <w:r>
-        <w:rPr>
-          <w:rFonts w:ascii="Arial" w:hAnsi="Arial" w:cs="Arial"/>
-        </w:rPr>
-        <w:t>4.5.</w:t>
-      </w:r>
-      <w:r>
-        <w:rPr>
-          <w:rFonts w:ascii="Arial" w:hAnsi="Arial" w:cs="Arial"/>
-        </w:rPr>
-        <w:t xml:space="preserve"> Não poderá tomar posse do seu espaço o Expositor que estiver em débito com a organização do evento, sem antes resolver tal pendência;</w:t>
-      </w:r>
-      <w:r>
-        <w:rPr>
-          <w:rFonts w:ascii="Arial" w:hAnsi="Arial" w:cs="Arial"/>
-        </w:rPr>
-        <w:t xml:space="preserve"> O</w:t>
-      </w:r>
-      <w:r>
-        <w:rPr>
-          <w:rFonts w:ascii="Arial" w:hAnsi="Arial" w:cs="Arial"/>
-        </w:rPr>
-        <w:t xml:space="preserve"> </w:t>
-      </w:r>
-      <w:r>
-        <w:rPr>
-          <w:rFonts w:ascii="Arial" w:hAnsi="Arial" w:cs="Arial"/>
-        </w:rPr>
-        <w:t>expositor</w:t>
-      </w:r>
-      <w:r>
-        <w:rPr>
-          <w:rFonts w:ascii="Arial" w:hAnsi="Arial" w:cs="Arial"/>
-        </w:rPr>
-        <w:t xml:space="preserve"> deverá proceder a </w:t>
-      </w:r>
-      <w:r>
-        <w:rPr>
-          <w:rFonts w:ascii="Arial" w:hAnsi="Arial" w:cs="Arial"/>
-          <w:b/>
-          <w:bCs/>
-        </w:rPr>
-        <w:t>Anotação de Responsabilidade</w:t>
-      </w:r>
-      <w:r>
-        <w:rPr>
-          <w:rFonts w:ascii="Arial" w:hAnsi="Arial" w:cs="Arial"/>
-          <w:b/>
-          <w:bCs/>
-        </w:rPr>
-        <w:t xml:space="preserve"> (ART)</w:t>
-      </w:r>
-      <w:r>
-        <w:rPr>
-          <w:rFonts w:ascii="Arial" w:hAnsi="Arial" w:cs="Arial"/>
-        </w:rPr>
-        <w:t xml:space="preserve"> e apresentá-la a organização do evento.</w:t>
-      </w:r>
-    </w:p>
-    <w:p>
-      <w:pPr>
-        <w:spacing w:after="0" w:line="240" w:lineRule="auto"/>
-        <w:jc w:val="both"/>
-        <w:rPr>
-          <w:rFonts w:ascii="Arial" w:hAnsi="Arial" w:cs="Arial"/>
-        </w:rPr>
-      </w:pPr>
-    </w:p>
-    <w:p>
-      <w:pPr>
-        <w:spacing w:after="0" w:line="240" w:lineRule="auto"/>
-        <w:jc w:val="both"/>
-        <w:rPr>
-          <w:rFonts w:ascii="Arial" w:hAnsi="Arial" w:cs="Arial"/>
-        </w:rPr>
-      </w:pPr>
-      <w:r>
-        <w:rPr>
-          <w:rFonts w:ascii="Arial" w:hAnsi="Arial" w:cs="Arial"/>
-        </w:rPr>
-        <w:t>4.6</w:t>
-      </w:r>
-      <w:r>
-        <w:rPr>
-          <w:rFonts w:ascii="Arial" w:hAnsi="Arial" w:cs="Arial"/>
-        </w:rPr>
-        <w:t>.</w:t>
-      </w:r>
-      <w:r>
-        <w:rPr>
-          <w:rFonts w:ascii="Arial" w:hAnsi="Arial" w:cs="Arial"/>
-        </w:rPr>
-        <w:t xml:space="preserve"> É de inteira responsabilidade do Expositor as vendas realizadas no seu espaço, assim como a operacionalização para o recebimento em dinheiro, cheques, cartão de crédito ou débito, ficando assim o Organizador do evento livre de quaisquer responsabilidades por cheques sem fundos ou problemas com operadoras de cartão, inclusive resultantes de caso fortuito ou força maior. Cabe exclusivamente ao Expositor diligenciar para obtenção das máquinas de cartão que pretende usar no seu estande. </w:t>
-      </w:r>
-    </w:p>
-    <w:p>
-      <w:pPr>
-        <w:spacing w:after="0" w:line="240" w:lineRule="auto"/>
-        <w:jc w:val="both"/>
-        <w:rPr>
-          <w:rFonts w:ascii="Arial" w:hAnsi="Arial" w:cs="Arial"/>
-        </w:rPr>
-      </w:pPr>
-    </w:p>
-    <w:p>
-      <w:pPr>
-        <w:spacing w:after="0" w:line="240" w:lineRule="auto"/>
-        <w:jc w:val="both"/>
-        <w:outlineLvl w:val="0"/>
-        <w:rPr>
-          <w:rFonts w:ascii="Arial" w:hAnsi="Arial" w:cs="Arial"/>
-        </w:rPr>
-      </w:pPr>
-      <w:r>
-        <w:rPr>
-          <w:rFonts w:ascii="Arial" w:hAnsi="Arial" w:cs="Arial"/>
-        </w:rPr>
-        <w:t>4.7</w:t>
-      </w:r>
-      <w:r>
-        <w:rPr>
-          <w:rFonts w:ascii="Arial" w:hAnsi="Arial" w:cs="Arial"/>
-        </w:rPr>
-        <w:t xml:space="preserve">. </w:t>
-      </w:r>
-      <w:r>
-        <w:rPr>
-          <w:rFonts w:ascii="Arial" w:hAnsi="Arial" w:cs="Arial"/>
-        </w:rPr>
-        <w:t xml:space="preserve">O Expositor será responsável pelos prejuízos causados por si próprio, seus prepostos ou funcionários, seus clientes, extravio, roubo ou danificação nas peças expostas, danos pessoais e materiais causados durante a montagem e/ou desmontagem do seu espaço e no decorrer do evento. </w:t>
-      </w:r>
-    </w:p>
-    <w:p>
-      <w:pPr>
-        <w:spacing w:after="0" w:line="240" w:lineRule="auto"/>
-        <w:jc w:val="both"/>
-        <w:outlineLvl w:val="0"/>
-        <w:rPr>
-          <w:rFonts w:ascii="Arial" w:hAnsi="Arial" w:cs="Arial"/>
-        </w:rPr>
-      </w:pPr>
-    </w:p>
-    <w:p>
-      <w:pPr>
-        <w:spacing w:after="0" w:line="240" w:lineRule="auto"/>
-        <w:jc w:val="both"/>
-        <w:rPr>
-          <w:rFonts w:ascii="Arial" w:hAnsi="Arial" w:cs="Arial"/>
-        </w:rPr>
-      </w:pPr>
-      <w:r>
-        <w:rPr>
-          <w:rFonts w:ascii="Arial" w:hAnsi="Arial" w:cs="Arial"/>
-        </w:rPr>
-        <w:t>4.8</w:t>
-      </w:r>
-      <w:r>
-        <w:rPr>
-          <w:rFonts w:ascii="Arial" w:hAnsi="Arial" w:cs="Arial"/>
-        </w:rPr>
-        <w:t>.</w:t>
-      </w:r>
-      <w:r>
-        <w:rPr>
-          <w:rFonts w:ascii="Arial" w:hAnsi="Arial" w:cs="Arial"/>
-        </w:rPr>
-        <w:t xml:space="preserve"> No caso de </w:t>
-      </w:r>
-      <w:r>
-        <w:rPr>
-          <w:rFonts w:ascii="Arial" w:hAnsi="Arial" w:cs="Arial"/>
-          <w:color w:val="000000" w:themeColor="text1"/>
-          <w:u w:val="single"/>
-        </w:rPr>
-        <w:t>conduta inadequada</w:t>
-      </w:r>
-      <w:r>
-        <w:rPr>
-          <w:rFonts w:ascii="Arial" w:hAnsi="Arial" w:cs="Arial"/>
-        </w:rPr>
-        <w:t xml:space="preserve">, tais como agressões verbais ou físicas, ou qualquer comportamento que descredencie o Expositor, seja em relação aos organizadores, aos colegas Expositores ou clientes, a Organização poderá </w:t>
+        <w:t xml:space="preserve">Organização poderá </w:t>
       </w:r>
       <w:r>
         <w:rPr>
@@ -3132,14 +5078,7 @@
         <w:rPr>
           <w:rFonts w:ascii="Arial" w:hAnsi="Arial" w:cs="Arial"/>
         </w:rPr>
-        <w:t xml:space="preserve"> solicitando a sua retirada imediata, sem direito a receber o </w:t>
-      </w:r>
-      <w:r>
-        <w:rPr>
-          <w:rFonts w:ascii="Arial" w:hAnsi="Arial" w:cs="Arial"/>
-        </w:rPr>
-        <w:lastRenderedPageBreak/>
-        <w:t xml:space="preserve">valor pago pelo espaço e ainda sob pena de multa </w:t>
+        <w:t xml:space="preserve"> solicitando a sua retirada imediata, sem direito a receber o valor pago pelo espaço e ainda sob pena de multa </w:t>
       </w:r>
       <w:r>
         <w:rPr>
@@ -9953,6 +11892,18 @@
   </w:num>
   <w:num w:numId="6" w16cid:durableId="318460075">
     <w:abstractNumId w:val="1"/>
+  </w:num>
+  <w:num w:numId="7" w16cid:durableId="1230767501">
+    <w:abstractNumId w:val="4"/>
+    <w:lvlOverride w:ilvl="0"/>
+    <w:lvlOverride w:ilvl="1"/>
+    <w:lvlOverride w:ilvl="2"/>
+    <w:lvlOverride w:ilvl="3"/>
+    <w:lvlOverride w:ilvl="4"/>
+    <w:lvlOverride w:ilvl="5"/>
+    <w:lvlOverride w:ilvl="6"/>
+    <w:lvlOverride w:ilvl="7"/>
+    <w:lvlOverride w:ilvl="8"/>
   </w:num>
 </w:numbering>
 </file>
@@ -10406,7 +12357,6 @@
   <w:style w:type="character" w:default="1" w:styleId="Fontepargpadro">
     <w:name w:val="Default Paragraph Font"/>
     <w:uiPriority w:val="1"/>
-    <w:semiHidden/>
     <w:unhideWhenUsed/>
   </w:style>
   <w:style w:type="table" w:default="1" w:styleId="Tabelanormal">
@@ -11123,10 +13073,6 @@
 </file>
 
 <file path=customXml/item1.xml><?xml version="1.0" encoding="utf-8"?>
-<b:Sources xmlns:b="http://schemas.openxmlformats.org/officeDocument/2006/bibliography" xmlns="http://schemas.openxmlformats.org/officeDocument/2006/bibliography" SelectedStyle="\APA.XSL" StyleName="APA"/>
-</file>
-
-<file path=customXml/item2.xml><?xml version="1.0" encoding="utf-8"?>
 <p:properties xmlns:p="http://schemas.microsoft.com/office/2006/metadata/properties" xmlns:xsi="http://www.w3.org/2001/XMLSchema-instance" xmlns:pc="http://schemas.microsoft.com/office/infopath/2007/PartnerControls">
   <documentManagement>
     <lcf76f155ced4ddcb4097134ff3c332f xmlns="33654ad5-d282-4981-a8c8-a8822fbc35b9">
@@ -11141,16 +13087,11 @@
 </p:properties>
 </file>
 
-<file path=customXml/item3.xml><?xml version="1.0" encoding="utf-8"?>
-<?mso-contentType ?>
-<FormTemplates xmlns="http://schemas.microsoft.com/sharepoint/v3/contenttype/forms">
-  <Display>DocumentLibraryForm</Display>
-  <Edit>DocumentLibraryForm</Edit>
-  <New>DocumentLibraryForm</New>
-</FormTemplates>
+<file path=customXml/item2.xml><?xml version="1.0" encoding="utf-8"?>
+<b:Sources xmlns:b="http://schemas.openxmlformats.org/officeDocument/2006/bibliography" xmlns="http://schemas.openxmlformats.org/officeDocument/2006/bibliography" SelectedStyle="\APA.XSL" StyleName="APA"/>
 </file>
 
-<file path=customXml/item4.xml><?xml version="1.0" encoding="utf-8"?>
+<file path=customXml/item3.xml><?xml version="1.0" encoding="utf-8"?>
 <ct:contentTypeSchema xmlns:ct="http://schemas.microsoft.com/office/2006/metadata/contentType" xmlns:ma="http://schemas.microsoft.com/office/2006/metadata/properties/metaAttributes" ct:_="" ma:_="" ma:contentTypeName="Documento" ma:contentTypeID="0x010100D2300DB358EE5B46946C6B3EC032F97B" ma:contentTypeVersion="22" ma:contentTypeDescription="Crie um novo documento." ma:contentTypeScope="" ma:versionID="aa9ddffd00aed254b6aeb2f31970f58b">
   <xsd:schema xmlns:xsd="http://www.w3.org/2001/XMLSchema" xmlns:xs="http://www.w3.org/2001/XMLSchema" xmlns:p="http://schemas.microsoft.com/office/2006/metadata/properties" xmlns:ns2="33654ad5-d282-4981-a8c8-a8822fbc35b9" xmlns:ns3="b9048903-d8ec-4afd-ab52-583bd4eb6592" targetNamespace="http://schemas.microsoft.com/office/2006/metadata/properties" ma:root="true" ma:fieldsID="56313613a3112835b877611161f1947a" ns2:_="" ns3:_="">
     <xsd:import namespace="33654ad5-d282-4981-a8c8-a8822fbc35b9"/>
@@ -11429,15 +13370,16 @@
 </ct:contentTypeSchema>
 </file>
 
-<file path=customXml/itemProps1.xml><?xml version="1.0" encoding="utf-8"?>
-<ds:datastoreItem xmlns:ds="http://schemas.openxmlformats.org/officeDocument/2006/customXml" ds:itemID="{2D9CA2EF-2A0F-4377-AA02-0725358BDBD9}">
-  <ds:schemaRefs>
-    <ds:schemaRef ds:uri="http://schemas.openxmlformats.org/officeDocument/2006/bibliography"/>
-  </ds:schemaRefs>
-</ds:datastoreItem>
+<file path=customXml/item4.xml><?xml version="1.0" encoding="utf-8"?>
+<?mso-contentType ?>
+<FormTemplates xmlns="http://schemas.microsoft.com/sharepoint/v3/contenttype/forms">
+  <Display>DocumentLibraryForm</Display>
+  <Edit>DocumentLibraryForm</Edit>
+  <New>DocumentLibraryForm</New>
+</FormTemplates>
 </file>
 
-<file path=customXml/itemProps2.xml><?xml version="1.0" encoding="utf-8"?>
+<file path=customXml/itemProps1.xml><?xml version="1.0" encoding="utf-8"?>
 <ds:datastoreItem xmlns:ds="http://schemas.openxmlformats.org/officeDocument/2006/customXml" ds:itemID="{9D374E39-0C21-4940-9679-7C1E21D9F5E5}">
   <ds:schemaRefs>
     <ds:schemaRef ds:uri="http://schemas.microsoft.com/office/2006/metadata/properties"/>
@@ -11448,15 +13390,15 @@
 </ds:datastoreItem>
 </file>
 
-<file path=customXml/itemProps3.xml><?xml version="1.0" encoding="utf-8"?>
-<ds:datastoreItem xmlns:ds="http://schemas.openxmlformats.org/officeDocument/2006/customXml" ds:itemID="{A8FDF9CD-DFE0-42B0-AA86-9CEEF4645DEB}">
+<file path=customXml/itemProps2.xml><?xml version="1.0" encoding="utf-8"?>
+<ds:datastoreItem xmlns:ds="http://schemas.openxmlformats.org/officeDocument/2006/customXml" ds:itemID="{2D9CA2EF-2A0F-4377-AA02-0725358BDBD9}">
   <ds:schemaRefs>
-    <ds:schemaRef ds:uri="http://schemas.microsoft.com/sharepoint/v3/contenttype/forms"/>
+    <ds:schemaRef ds:uri="http://schemas.openxmlformats.org/officeDocument/2006/bibliography"/>
   </ds:schemaRefs>
 </ds:datastoreItem>
 </file>
 
-<file path=customXml/itemProps4.xml><?xml version="1.0" encoding="utf-8"?>
+<file path=customXml/itemProps3.xml><?xml version="1.0" encoding="utf-8"?>
 <ds:datastoreItem xmlns:ds="http://schemas.openxmlformats.org/officeDocument/2006/customXml" ds:itemID="{E6FF012C-7C4F-4460-A219-EB3BCDF974AC}">
   <ds:schemaRefs>
     <ds:schemaRef ds:uri="http://schemas.microsoft.com/office/2006/metadata/contentType"/>
@@ -11473,4 +13415,12 @@
     <ds:schemaRef ds:uri="http://schemas.microsoft.com/internal/obd"/>
   </ds:schemaRefs>
 </ds:datastoreItem>
+</file>
+
+<file path=customXml/itemProps4.xml><?xml version="1.0" encoding="utf-8"?>
+<ds:datastoreItem xmlns:ds="http://schemas.openxmlformats.org/officeDocument/2006/customXml" ds:itemID="{A8FDF9CD-DFE0-42B0-AA86-9CEEF4645DEB}">
+  <ds:schemaRefs>
+    <ds:schemaRef ds:uri="http://schemas.microsoft.com/sharepoint/v3/contenttype/forms"/>
+  </ds:schemaRefs>
+</ds:datastoreItem>
 </file>
</xml_diff>